<commit_message>
Actualizar informes de Keidy y Amaal
</commit_message>
<xml_diff>
--- a/amaal/reportes/Informe_Pasantia_IUTECP_con_Cronogramas.docx
+++ b/amaal/reportes/Informe_Pasantia_IUTECP_con_Cronogramas.docx
@@ -1260,7 +1260,7 @@
       </w:r>
       <w:r>
         <w:rPr/>
-        <w:t>?</w:t>
+        <w:t>1</w:t>
       </w:r>
       <w:r>
         <w:rPr/>
@@ -1316,7 +1316,7 @@
       </w:r>
       <w:r>
         <w:rPr/>
-        <w:t>?</w:t>
+        <w:t>2</w:t>
       </w:r>
       <w:r>
         <w:rPr/>
@@ -1357,7 +1357,7 @@
       </w:r>
       <w:r>
         <w:rPr/>
-        <w:t>?</w:t>
+        <w:t>2</w:t>
       </w:r>
       <w:r>
         <w:rPr/>
@@ -1398,7 +1398,7 @@
       </w:r>
       <w:r>
         <w:rPr/>
-        <w:t>?</w:t>
+        <w:t>2</w:t>
       </w:r>
       <w:r>
         <w:rPr/>
@@ -1439,7 +1439,7 @@
       </w:r>
       <w:r>
         <w:rPr/>
-        <w:t>?</w:t>
+        <w:t>3</w:t>
       </w:r>
       <w:r>
         <w:rPr/>
@@ -1480,7 +1480,7 @@
       </w:r>
       <w:r>
         <w:rPr/>
-        <w:t>?</w:t>
+        <w:t>3</w:t>
       </w:r>
       <w:r>
         <w:rPr/>
@@ -1521,7 +1521,7 @@
       </w:r>
       <w:r>
         <w:rPr/>
-        <w:t>?</w:t>
+        <w:t>3</w:t>
       </w:r>
       <w:r>
         <w:rPr/>
@@ -1562,7 +1562,7 @@
       </w:r>
       <w:r>
         <w:rPr/>
-        <w:t>?</w:t>
+        <w:t>4</w:t>
       </w:r>
       <w:r>
         <w:rPr/>
@@ -1603,7 +1603,7 @@
       </w:r>
       <w:r>
         <w:rPr/>
-        <w:t>?</w:t>
+        <w:t>5</w:t>
       </w:r>
       <w:r>
         <w:rPr/>
@@ -1644,7 +1644,7 @@
       </w:r>
       <w:r>
         <w:rPr/>
-        <w:t>?</w:t>
+        <w:t>6</w:t>
       </w:r>
       <w:r>
         <w:rPr/>
@@ -1685,7 +1685,7 @@
       </w:r>
       <w:r>
         <w:rPr/>
-        <w:t>?</w:t>
+        <w:t>6</w:t>
       </w:r>
       <w:r>
         <w:rPr/>
@@ -1726,7 +1726,7 @@
       </w:r>
       <w:r>
         <w:rPr/>
-        <w:t>?</w:t>
+        <w:t>8</w:t>
       </w:r>
       <w:r>
         <w:rPr/>
@@ -1767,7 +1767,7 @@
       </w:r>
       <w:r>
         <w:rPr/>
-        <w:t>?</w:t>
+        <w:t>9</w:t>
       </w:r>
       <w:r>
         <w:rPr/>
@@ -1808,7 +1808,7 @@
       </w:r>
       <w:r>
         <w:rPr/>
-        <w:t>?</w:t>
+        <w:t>9</w:t>
       </w:r>
       <w:r>
         <w:rPr/>
@@ -1849,7 +1849,7 @@
       </w:r>
       <w:r>
         <w:rPr/>
-        <w:t>?</w:t>
+        <w:t>11</w:t>
       </w:r>
       <w:r>
         <w:rPr/>
@@ -1890,7 +1890,7 @@
       </w:r>
       <w:r>
         <w:rPr/>
-        <w:t>?</w:t>
+        <w:t>12</w:t>
       </w:r>
       <w:r>
         <w:rPr/>
@@ -1931,7 +1931,7 @@
       </w:r>
       <w:r>
         <w:rPr/>
-        <w:t>?</w:t>
+        <w:t>12</w:t>
       </w:r>
       <w:r>
         <w:rPr/>
@@ -1972,7 +1972,7 @@
       </w:r>
       <w:r>
         <w:rPr/>
-        <w:t>?</w:t>
+        <w:t>13</w:t>
       </w:r>
       <w:r>
         <w:rPr/>
@@ -2013,7 +2013,7 @@
       </w:r>
       <w:r>
         <w:rPr/>
-        <w:t>?</w:t>
+        <w:t>15</w:t>
       </w:r>
       <w:r>
         <w:rPr/>
@@ -2037,7 +2037,7 @@
           <w:b w:val="false"/>
           <w:sz w:val="24"/>
         </w:rPr>
-        <w:t>Bases teóricas referenciales</w:t>
+        <w:t>Conceptos disciplinares</w:t>
         <w:tab/>
       </w:r>
       <w:r>
@@ -2054,7 +2054,48 @@
       </w:r>
       <w:r>
         <w:rPr/>
-        <w:t>?</w:t>
+        <w:t>15</w:t>
+      </w:r>
+      <w:r>
+        <w:rPr/>
+        <w:fldChar w:fldCharType="end"/>
+      </w:r>
+    </w:p>
+    <w:p>
+      <w:pPr>
+        <w:pStyle w:val="Normal"/>
+        <w:keepLines/>
+        <w:tabs>
+          <w:tab w:val="clear" w:pos="720"/>
+          <w:tab w:val="right" w:pos="8271" w:leader="dot"/>
+        </w:tabs>
+        <w:spacing w:lineRule="auto" w:line="360" w:before="0" w:after="80"/>
+        <w:ind w:start="283"/>
+        <w:rPr/>
+      </w:pPr>
+      <w:r>
+        <w:rPr>
+          <w:b w:val="false"/>
+          <w:sz w:val="24"/>
+        </w:rPr>
+        <w:t>Bases legales</w:t>
+        <w:tab/>
+      </w:r>
+      <w:r>
+        <w:rPr/>
+        <w:fldChar w:fldCharType="begin"/>
+      </w:r>
+      <w:r>
+        <w:rPr/>
+        <w:instrText xml:space="preserve"> PAGEREF bm_cap3_legales \h </w:instrText>
+      </w:r>
+      <w:r>
+        <w:rPr/>
+        <w:fldChar w:fldCharType="separate"/>
+      </w:r>
+      <w:r>
+        <w:rPr/>
+        <w:t>21</w:t>
       </w:r>
       <w:r>
         <w:rPr/>
@@ -2095,7 +2136,7 @@
       </w:r>
       <w:r>
         <w:rPr/>
-        <w:t>?</w:t>
+        <w:t>23</w:t>
       </w:r>
       <w:r>
         <w:rPr/>
@@ -2136,7 +2177,7 @@
       </w:r>
       <w:r>
         <w:rPr/>
-        <w:t>?</w:t>
+        <w:t>23</w:t>
       </w:r>
       <w:r>
         <w:rPr/>
@@ -2177,7 +2218,7 @@
       </w:r>
       <w:r>
         <w:rPr/>
-        <w:t>?</w:t>
+        <w:t>27</w:t>
       </w:r>
       <w:r>
         <w:rPr/>
@@ -2218,7 +2259,7 @@
       </w:r>
       <w:r>
         <w:rPr/>
-        <w:t>?</w:t>
+        <w:t>27</w:t>
       </w:r>
       <w:r>
         <w:rPr/>
@@ -2259,7 +2300,7 @@
       </w:r>
       <w:r>
         <w:rPr/>
-        <w:t>?</w:t>
+        <w:t>28</w:t>
       </w:r>
       <w:r>
         <w:rPr/>
@@ -2300,7 +2341,7 @@
       </w:r>
       <w:r>
         <w:rPr/>
-        <w:t>?</w:t>
+        <w:t>29</w:t>
       </w:r>
       <w:r>
         <w:rPr/>
@@ -2353,7 +2394,7 @@
       </w:r>
       <w:r>
         <w:rPr/>
-        <w:t>?</w:t>
+        <w:t>30</w:t>
       </w:r>
       <w:r>
         <w:rPr/>
@@ -2446,7 +2487,7 @@
       </w:r>
       <w:r>
         <w:rPr/>
-        <w:t>?</w:t>
+        <w:t>6</w:t>
       </w:r>
       <w:r>
         <w:rPr/>
@@ -2489,7 +2530,7 @@
       </w:r>
       <w:r>
         <w:rPr/>
-        <w:t>?</w:t>
+        <w:t>12</w:t>
       </w:r>
       <w:r>
         <w:rPr/>
@@ -2544,7 +2585,7 @@
       </w:r>
       <w:r>
         <w:rPr/>
-        <w:t>?</w:t>
+        <w:t>13</w:t>
       </w:r>
       <w:r>
         <w:rPr/>
@@ -2637,7 +2678,7 @@
       </w:r>
       <w:r>
         <w:rPr/>
-        <w:t>?</w:t>
+        <w:t>5</w:t>
       </w:r>
       <w:r>
         <w:rPr/>
@@ -2680,7 +2721,7 @@
       </w:r>
       <w:r>
         <w:rPr/>
-        <w:t>?</w:t>
+        <w:t>5</w:t>
       </w:r>
       <w:r>
         <w:rPr/>
@@ -2723,7 +2764,7 @@
       </w:r>
       <w:r>
         <w:rPr/>
-        <w:t>?</w:t>
+        <w:t>7</w:t>
       </w:r>
       <w:r>
         <w:rPr/>
@@ -2766,7 +2807,7 @@
       </w:r>
       <w:r>
         <w:rPr/>
-        <w:t>?</w:t>
+        <w:t>7</w:t>
       </w:r>
       <w:r>
         <w:rPr/>
@@ -2821,7 +2862,7 @@
       </w:r>
       <w:r>
         <w:rPr/>
-        <w:t>?</w:t>
+        <w:t>11</w:t>
       </w:r>
       <w:r>
         <w:rPr/>
@@ -2914,7 +2955,7 @@
       </w:r>
       <w:r>
         <w:rPr/>
-        <w:t>?</w:t>
+        <w:t>31</w:t>
       </w:r>
       <w:r>
         <w:rPr/>
@@ -2957,7 +2998,7 @@
       </w:r>
       <w:r>
         <w:rPr/>
-        <w:t>?</w:t>
+        <w:t>32</w:t>
       </w:r>
       <w:r>
         <w:rPr/>
@@ -3000,7 +3041,7 @@
       </w:r>
       <w:r>
         <w:rPr/>
-        <w:t>?</w:t>
+        <w:t>33</w:t>
       </w:r>
       <w:r>
         <w:rPr/>
@@ -3043,7 +3084,7 @@
       </w:r>
       <w:r>
         <w:rPr/>
-        <w:t>?</w:t>
+        <w:t>34</w:t>
       </w:r>
       <w:r>
         <w:rPr/>
@@ -3086,7 +3127,7 @@
       </w:r>
       <w:r>
         <w:rPr/>
-        <w:t>?</w:t>
+        <w:t>35</w:t>
       </w:r>
       <w:r>
         <w:rPr/>
@@ -3129,7 +3170,7 @@
       </w:r>
       <w:r>
         <w:rPr/>
-        <w:t>?</w:t>
+        <w:t>36</w:t>
       </w:r>
       <w:r>
         <w:rPr/>
@@ -3184,7 +3225,7 @@
       </w:r>
       <w:r>
         <w:rPr/>
-        <w:t>?</w:t>
+        <w:t>37</w:t>
       </w:r>
       <w:r>
         <w:rPr/>
@@ -4237,10 +4278,10 @@
         <w:tblLook w:noHBand="0" w:noVBand="1" w:firstColumn="1" w:lastRow="0" w:lastColumn="0" w:firstRow="1" w:val="04a0"/>
       </w:tblPr>
       <w:tblGrid>
-        <w:gridCol w:w="1983"/>
+        <w:gridCol w:w="1982"/>
         <w:gridCol w:w="2886"/>
         <w:gridCol w:w="1134"/>
-        <w:gridCol w:w="1134"/>
+        <w:gridCol w:w="1135"/>
         <w:gridCol w:w="1135"/>
       </w:tblGrid>
       <w:tr>
@@ -4249,7 +4290,7 @@
         </w:trPr>
         <w:tc>
           <w:tcPr>
-            <w:tcW w:w="1983" w:type="dxa"/>
+            <w:tcW w:w="1982" w:type="dxa"/>
             <w:tcBorders/>
             <w:shd w:fill="D9E2F3" w:val="clear"/>
           </w:tcPr>
@@ -4257,6 +4298,7 @@
             <w:pPr>
               <w:pStyle w:val="Normal"/>
               <w:widowControl/>
+              <w:suppressAutoHyphens w:val="true"/>
               <w:spacing w:lineRule="auto" w:line="240" w:before="40" w:after="40"/>
               <w:jc w:val="center"/>
               <w:rPr>
@@ -4289,6 +4331,7 @@
             <w:pPr>
               <w:pStyle w:val="Normal"/>
               <w:widowControl/>
+              <w:suppressAutoHyphens w:val="true"/>
               <w:spacing w:lineRule="auto" w:line="240" w:before="40" w:after="40"/>
               <w:jc w:val="center"/>
               <w:rPr>
@@ -4321,6 +4364,7 @@
             <w:pPr>
               <w:pStyle w:val="Normal"/>
               <w:widowControl/>
+              <w:suppressAutoHyphens w:val="true"/>
               <w:spacing w:lineRule="auto" w:line="240" w:before="40" w:after="40"/>
               <w:jc w:val="center"/>
               <w:rPr>
@@ -4345,7 +4389,7 @@
         </w:tc>
         <w:tc>
           <w:tcPr>
-            <w:tcW w:w="1134" w:type="dxa"/>
+            <w:tcW w:w="1135" w:type="dxa"/>
             <w:tcBorders/>
             <w:shd w:fill="D9E2F3" w:val="clear"/>
           </w:tcPr>
@@ -4353,6 +4397,7 @@
             <w:pPr>
               <w:pStyle w:val="Normal"/>
               <w:widowControl/>
+              <w:suppressAutoHyphens w:val="true"/>
               <w:spacing w:lineRule="auto" w:line="240" w:before="40" w:after="40"/>
               <w:jc w:val="center"/>
               <w:rPr>
@@ -4385,6 +4430,7 @@
             <w:pPr>
               <w:pStyle w:val="Normal"/>
               <w:widowControl/>
+              <w:suppressAutoHyphens w:val="true"/>
               <w:spacing w:lineRule="auto" w:line="240" w:before="40" w:after="40"/>
               <w:jc w:val="center"/>
               <w:rPr>
@@ -4412,13 +4458,14 @@
         <w:trPr/>
         <w:tc>
           <w:tcPr>
-            <w:tcW w:w="1983" w:type="dxa"/>
+            <w:tcW w:w="1982" w:type="dxa"/>
             <w:tcBorders/>
           </w:tcPr>
           <w:p>
             <w:pPr>
               <w:pStyle w:val="Normal"/>
               <w:widowControl/>
+              <w:suppressAutoHyphens w:val="true"/>
               <w:spacing w:lineRule="auto" w:line="240" w:before="40" w:after="40"/>
               <w:jc w:val="start"/>
               <w:rPr>
@@ -4449,6 +4496,7 @@
             <w:pPr>
               <w:pStyle w:val="Normal"/>
               <w:widowControl/>
+              <w:suppressAutoHyphens w:val="true"/>
               <w:spacing w:lineRule="auto" w:line="240" w:before="40" w:after="40"/>
               <w:jc w:val="start"/>
               <w:rPr>
@@ -4479,6 +4527,7 @@
             <w:pPr>
               <w:pStyle w:val="Normal"/>
               <w:widowControl/>
+              <w:suppressAutoHyphens w:val="true"/>
               <w:spacing w:lineRule="auto" w:line="240" w:before="40" w:after="40"/>
               <w:jc w:val="center"/>
               <w:rPr>
@@ -4502,13 +4551,14 @@
         </w:tc>
         <w:tc>
           <w:tcPr>
-            <w:tcW w:w="1134" w:type="dxa"/>
+            <w:tcW w:w="1135" w:type="dxa"/>
             <w:tcBorders/>
           </w:tcPr>
           <w:p>
             <w:pPr>
               <w:pStyle w:val="Normal"/>
               <w:widowControl/>
+              <w:suppressAutoHyphens w:val="true"/>
               <w:spacing w:lineRule="auto" w:line="240" w:before="40" w:after="40"/>
               <w:jc w:val="center"/>
               <w:rPr>
@@ -4539,6 +4589,7 @@
             <w:pPr>
               <w:pStyle w:val="Normal"/>
               <w:widowControl/>
+              <w:suppressAutoHyphens w:val="true"/>
               <w:spacing w:lineRule="auto" w:line="240" w:before="40" w:after="40"/>
               <w:jc w:val="center"/>
               <w:rPr>
@@ -4565,13 +4616,14 @@
         <w:trPr/>
         <w:tc>
           <w:tcPr>
-            <w:tcW w:w="1983" w:type="dxa"/>
+            <w:tcW w:w="1982" w:type="dxa"/>
             <w:tcBorders/>
           </w:tcPr>
           <w:p>
             <w:pPr>
               <w:pStyle w:val="Normal"/>
               <w:widowControl/>
+              <w:suppressAutoHyphens w:val="true"/>
               <w:spacing w:lineRule="auto" w:line="240" w:before="40" w:after="40"/>
               <w:jc w:val="start"/>
               <w:rPr>
@@ -4602,6 +4654,7 @@
             <w:pPr>
               <w:pStyle w:val="Normal"/>
               <w:widowControl/>
+              <w:suppressAutoHyphens w:val="true"/>
               <w:spacing w:lineRule="auto" w:line="240" w:before="40" w:after="40"/>
               <w:jc w:val="start"/>
               <w:rPr>
@@ -4630,6 +4683,7 @@
             <w:pPr>
               <w:pStyle w:val="Normal"/>
               <w:widowControl/>
+              <w:suppressAutoHyphens w:val="true"/>
               <w:spacing w:lineRule="auto" w:line="240" w:before="40" w:after="40"/>
               <w:jc w:val="center"/>
               <w:rPr>
@@ -4653,13 +4707,14 @@
         </w:tc>
         <w:tc>
           <w:tcPr>
-            <w:tcW w:w="1134" w:type="dxa"/>
+            <w:tcW w:w="1135" w:type="dxa"/>
             <w:tcBorders/>
           </w:tcPr>
           <w:p>
             <w:pPr>
               <w:pStyle w:val="Normal"/>
               <w:widowControl/>
+              <w:suppressAutoHyphens w:val="true"/>
               <w:spacing w:lineRule="auto" w:line="240" w:before="40" w:after="40"/>
               <w:jc w:val="center"/>
               <w:rPr>
@@ -4690,6 +4745,7 @@
             <w:pPr>
               <w:pStyle w:val="Normal"/>
               <w:widowControl/>
+              <w:suppressAutoHyphens w:val="true"/>
               <w:spacing w:lineRule="auto" w:line="240" w:before="40" w:after="40"/>
               <w:jc w:val="center"/>
               <w:rPr>
@@ -5263,6 +5319,12 @@
         </w:rPr>
         <w:t>Para organizar las causas de la situación se empleó un diagrama de Ishikawa, complementado con observación directa, revisión de registros y entrevistas estructuradas al personal. La técnica permitió relacionar factores de procedimiento, comunicación, registro y seguimiento con las demoras e inconsistencias identificadas. La representación gráfica de esta técnica se presenta a continuación.</w:t>
       </w:r>
+      <w:r>
+        <w:rPr>
+          <w:sz w:val="24"/>
+        </w:rPr>
+        <w:t xml:space="preserve"> A partir de la situación descrita, se formula la siguiente interrogante: ¿Cómo puede evaluarse el control administrativo aplicado a la gestión de solicitudes de servicios de telecomunicaciones en IDETEL para identificar sus principales debilidades y formular mejoras procedimentales que fortalezcan la trazabilidad y el seguimiento de los casos?</w:t>
+      </w:r>
     </w:p>
     <w:p>
       <w:pPr>
@@ -5372,39 +5434,6 @@
         <w:jc w:val="start"/>
         <w:rPr/>
       </w:pPr>
-      <w:r>
-        <w:rPr>
-          <w:b/>
-          <w:sz w:val="24"/>
-        </w:rPr>
-        <w:t>Interrogante orientadora</w:t>
-      </w:r>
-    </w:p>
-    <w:p>
-      <w:pPr>
-        <w:pStyle w:val="Normal"/>
-        <w:spacing w:lineRule="auto" w:line="360" w:before="0" w:after="0"/>
-        <w:ind w:firstLine="709"/>
-        <w:jc w:val="both"/>
-        <w:rPr/>
-      </w:pPr>
-      <w:r>
-        <w:rPr>
-          <w:i w:val="false"/>
-          <w:sz w:val="24"/>
-        </w:rPr>
-        <w:t>¿Cómo puede evaluarse el control administrativo aplicado a la gestión de solicitudes de servicios de telecomunicaciones en IDETEL para identificar sus principales debilidades y formular mejoras procedimentales que fortalezcan la trazabilidad y el seguimiento de los casos?</w:t>
-      </w:r>
-    </w:p>
-    <w:p>
-      <w:pPr>
-        <w:pStyle w:val="IUTECPTtulo2"/>
-        <w:keepNext w:val="true"/>
-        <w:keepLines/>
-        <w:spacing w:lineRule="auto" w:line="360" w:before="480" w:after="480"/>
-        <w:jc w:val="start"/>
-        <w:rPr/>
-      </w:pPr>
       <w:bookmarkStart w:id="30" w:name="bm_cap2_objg"/>
       <w:r>
         <w:rPr>
@@ -5593,6 +5622,7 @@
             <w:pPr>
               <w:pStyle w:val="Normal"/>
               <w:widowControl/>
+              <w:suppressAutoHyphens w:val="true"/>
               <w:spacing w:lineRule="auto" w:line="240" w:before="20" w:after="20"/>
               <w:jc w:val="center"/>
               <w:rPr>
@@ -5626,6 +5656,7 @@
             <w:pPr>
               <w:pStyle w:val="Normal"/>
               <w:widowControl/>
+              <w:suppressAutoHyphens w:val="true"/>
               <w:spacing w:lineRule="auto" w:line="240" w:before="20" w:after="20"/>
               <w:jc w:val="center"/>
               <w:rPr>
@@ -5659,6 +5690,7 @@
             <w:pPr>
               <w:pStyle w:val="Normal"/>
               <w:widowControl/>
+              <w:suppressAutoHyphens w:val="true"/>
               <w:spacing w:lineRule="auto" w:line="240" w:before="20" w:after="20"/>
               <w:jc w:val="center"/>
               <w:rPr>
@@ -5692,6 +5724,7 @@
             <w:pPr>
               <w:pStyle w:val="Normal"/>
               <w:widowControl/>
+              <w:suppressAutoHyphens w:val="true"/>
               <w:spacing w:lineRule="auto" w:line="240" w:before="20" w:after="20"/>
               <w:jc w:val="center"/>
               <w:rPr>
@@ -5725,6 +5758,7 @@
             <w:pPr>
               <w:pStyle w:val="Normal"/>
               <w:widowControl/>
+              <w:suppressAutoHyphens w:val="true"/>
               <w:spacing w:lineRule="auto" w:line="240" w:before="20" w:after="20"/>
               <w:jc w:val="center"/>
               <w:rPr>
@@ -5763,6 +5797,7 @@
             <w:pPr>
               <w:pStyle w:val="Normal"/>
               <w:widowControl/>
+              <w:suppressAutoHyphens w:val="true"/>
               <w:spacing w:lineRule="auto" w:line="240" w:before="20" w:after="20"/>
               <w:jc w:val="start"/>
               <w:rPr>
@@ -5796,6 +5831,7 @@
             <w:pPr>
               <w:pStyle w:val="Normal"/>
               <w:widowControl/>
+              <w:suppressAutoHyphens w:val="true"/>
               <w:spacing w:lineRule="auto" w:line="240" w:before="20" w:after="20"/>
               <w:jc w:val="start"/>
               <w:rPr>
@@ -5829,6 +5865,7 @@
             <w:pPr>
               <w:pStyle w:val="Normal"/>
               <w:widowControl/>
+              <w:suppressAutoHyphens w:val="true"/>
               <w:spacing w:lineRule="auto" w:line="240" w:before="20" w:after="20"/>
               <w:jc w:val="start"/>
               <w:rPr>
@@ -5862,6 +5899,7 @@
             <w:pPr>
               <w:pStyle w:val="Normal"/>
               <w:widowControl/>
+              <w:suppressAutoHyphens w:val="true"/>
               <w:spacing w:lineRule="auto" w:line="240" w:before="20" w:after="20"/>
               <w:jc w:val="start"/>
               <w:rPr>
@@ -5895,6 +5933,7 @@
             <w:pPr>
               <w:pStyle w:val="Normal"/>
               <w:widowControl/>
+              <w:suppressAutoHyphens w:val="true"/>
               <w:spacing w:lineRule="auto" w:line="240" w:before="20" w:after="20"/>
               <w:jc w:val="start"/>
               <w:rPr>
@@ -5933,6 +5972,7 @@
             <w:pPr>
               <w:pStyle w:val="Normal"/>
               <w:widowControl/>
+              <w:suppressAutoHyphens w:val="true"/>
               <w:spacing w:lineRule="auto" w:line="240" w:before="20" w:after="20"/>
               <w:jc w:val="start"/>
               <w:rPr>
@@ -5966,6 +6006,7 @@
             <w:pPr>
               <w:pStyle w:val="Normal"/>
               <w:widowControl/>
+              <w:suppressAutoHyphens w:val="true"/>
               <w:spacing w:lineRule="auto" w:line="240" w:before="20" w:after="20"/>
               <w:jc w:val="start"/>
               <w:rPr>
@@ -5999,6 +6040,7 @@
             <w:pPr>
               <w:pStyle w:val="Normal"/>
               <w:widowControl/>
+              <w:suppressAutoHyphens w:val="true"/>
               <w:spacing w:lineRule="auto" w:line="240" w:before="20" w:after="20"/>
               <w:jc w:val="start"/>
               <w:rPr>
@@ -6032,6 +6074,7 @@
             <w:pPr>
               <w:pStyle w:val="Normal"/>
               <w:widowControl/>
+              <w:suppressAutoHyphens w:val="true"/>
               <w:spacing w:lineRule="auto" w:line="240" w:before="20" w:after="20"/>
               <w:jc w:val="start"/>
               <w:rPr>
@@ -6065,6 +6108,7 @@
             <w:pPr>
               <w:pStyle w:val="Normal"/>
               <w:widowControl/>
+              <w:suppressAutoHyphens w:val="true"/>
               <w:spacing w:lineRule="auto" w:line="240" w:before="20" w:after="20"/>
               <w:jc w:val="start"/>
               <w:rPr>
@@ -6103,6 +6147,7 @@
             <w:pPr>
               <w:pStyle w:val="Normal"/>
               <w:widowControl/>
+              <w:suppressAutoHyphens w:val="true"/>
               <w:spacing w:lineRule="auto" w:line="240" w:before="20" w:after="20"/>
               <w:jc w:val="start"/>
               <w:rPr>
@@ -6136,6 +6181,7 @@
             <w:pPr>
               <w:pStyle w:val="Normal"/>
               <w:widowControl/>
+              <w:suppressAutoHyphens w:val="true"/>
               <w:spacing w:lineRule="auto" w:line="240" w:before="20" w:after="20"/>
               <w:jc w:val="start"/>
               <w:rPr>
@@ -6169,6 +6215,7 @@
             <w:pPr>
               <w:pStyle w:val="Normal"/>
               <w:widowControl/>
+              <w:suppressAutoHyphens w:val="true"/>
               <w:spacing w:lineRule="auto" w:line="240" w:before="20" w:after="20"/>
               <w:jc w:val="start"/>
               <w:rPr>
@@ -6202,6 +6249,7 @@
             <w:pPr>
               <w:pStyle w:val="Normal"/>
               <w:widowControl/>
+              <w:suppressAutoHyphens w:val="true"/>
               <w:spacing w:lineRule="auto" w:line="240" w:before="20" w:after="20"/>
               <w:jc w:val="start"/>
               <w:rPr>
@@ -6235,6 +6283,7 @@
             <w:pPr>
               <w:pStyle w:val="Normal"/>
               <w:widowControl/>
+              <w:suppressAutoHyphens w:val="true"/>
               <w:spacing w:lineRule="auto" w:line="240" w:before="20" w:after="20"/>
               <w:jc w:val="start"/>
               <w:rPr>
@@ -6368,15 +6417,15 @@
         <w:tblLook w:noHBand="0" w:noVBand="1" w:firstColumn="1" w:lastRow="0" w:lastColumn="0" w:firstRow="1" w:val="04a0"/>
       </w:tblPr>
       <w:tblGrid>
-        <w:gridCol w:w="2682"/>
+        <w:gridCol w:w="2681"/>
+        <w:gridCol w:w="558"/>
+        <w:gridCol w:w="556"/>
+        <w:gridCol w:w="554"/>
+        <w:gridCol w:w="557"/>
         <w:gridCol w:w="557"/>
         <w:gridCol w:w="556"/>
-        <w:gridCol w:w="555"/>
-        <w:gridCol w:w="556"/>
-        <w:gridCol w:w="557"/>
-        <w:gridCol w:w="556"/>
-        <w:gridCol w:w="555"/>
-        <w:gridCol w:w="557"/>
+        <w:gridCol w:w="554"/>
+        <w:gridCol w:w="558"/>
         <w:gridCol w:w="567"/>
         <w:gridCol w:w="567"/>
       </w:tblGrid>
@@ -6387,7 +6436,7 @@
         </w:trPr>
         <w:tc>
           <w:tcPr>
-            <w:tcW w:w="2682" w:type="dxa"/>
+            <w:tcW w:w="2681" w:type="dxa"/>
             <w:tcBorders/>
             <w:shd w:color="auto" w:fill="4472C4" w:val="clear"/>
           </w:tcPr>
@@ -6395,6 +6444,7 @@
             <w:pPr>
               <w:pStyle w:val="Normal"/>
               <w:widowControl/>
+              <w:suppressAutoHyphens w:val="true"/>
               <w:spacing w:lineRule="auto" w:line="240" w:before="0" w:after="0"/>
               <w:jc w:val="center"/>
               <w:rPr>
@@ -6420,7 +6470,7 @@
         </w:tc>
         <w:tc>
           <w:tcPr>
-            <w:tcW w:w="2224" w:type="dxa"/>
+            <w:tcW w:w="2225" w:type="dxa"/>
             <w:gridSpan w:val="4"/>
             <w:tcBorders/>
             <w:shd w:color="auto" w:fill="4472C4" w:val="clear"/>
@@ -6429,6 +6479,7 @@
             <w:pPr>
               <w:pStyle w:val="Normal"/>
               <w:widowControl/>
+              <w:suppressAutoHyphens w:val="true"/>
               <w:spacing w:lineRule="auto" w:line="240" w:before="0" w:after="0"/>
               <w:jc w:val="center"/>
               <w:rPr>
@@ -6463,6 +6514,7 @@
             <w:pPr>
               <w:pStyle w:val="Normal"/>
               <w:widowControl/>
+              <w:suppressAutoHyphens w:val="true"/>
               <w:spacing w:lineRule="auto" w:line="240" w:before="0" w:after="0"/>
               <w:jc w:val="center"/>
               <w:rPr>
@@ -6497,6 +6549,7 @@
             <w:pPr>
               <w:pStyle w:val="Normal"/>
               <w:widowControl/>
+              <w:suppressAutoHyphens w:val="true"/>
               <w:spacing w:lineRule="auto" w:line="240" w:before="0" w:after="0"/>
               <w:jc w:val="center"/>
               <w:rPr>
@@ -6528,7 +6581,7 @@
         </w:trPr>
         <w:tc>
           <w:tcPr>
-            <w:tcW w:w="2682" w:type="dxa"/>
+            <w:tcW w:w="2681" w:type="dxa"/>
             <w:tcBorders/>
             <w:shd w:color="auto" w:fill="4472C4" w:val="clear"/>
           </w:tcPr>
@@ -6536,6 +6589,7 @@
             <w:pPr>
               <w:pStyle w:val="Normal"/>
               <w:widowControl/>
+              <w:suppressAutoHyphens w:val="true"/>
               <w:spacing w:lineRule="auto" w:line="240" w:before="0" w:after="0"/>
               <w:jc w:val="center"/>
               <w:rPr>
@@ -6561,7 +6615,7 @@
         </w:tc>
         <w:tc>
           <w:tcPr>
-            <w:tcW w:w="557" w:type="dxa"/>
+            <w:tcW w:w="558" w:type="dxa"/>
             <w:tcBorders/>
             <w:shd w:color="auto" w:fill="4472C4" w:val="clear"/>
           </w:tcPr>
@@ -6569,6 +6623,7 @@
             <w:pPr>
               <w:pStyle w:val="Normal"/>
               <w:widowControl/>
+              <w:suppressAutoHyphens w:val="true"/>
               <w:spacing w:lineRule="auto" w:line="240" w:before="0" w:after="0"/>
               <w:jc w:val="center"/>
               <w:rPr>
@@ -6602,6 +6657,7 @@
             <w:pPr>
               <w:pStyle w:val="Normal"/>
               <w:widowControl/>
+              <w:suppressAutoHyphens w:val="true"/>
               <w:spacing w:lineRule="auto" w:line="240" w:before="0" w:after="0"/>
               <w:jc w:val="center"/>
               <w:rPr>
@@ -6627,7 +6683,7 @@
         </w:tc>
         <w:tc>
           <w:tcPr>
-            <w:tcW w:w="555" w:type="dxa"/>
+            <w:tcW w:w="554" w:type="dxa"/>
             <w:tcBorders/>
             <w:shd w:color="auto" w:fill="4472C4" w:val="clear"/>
           </w:tcPr>
@@ -6635,6 +6691,7 @@
             <w:pPr>
               <w:pStyle w:val="Normal"/>
               <w:widowControl/>
+              <w:suppressAutoHyphens w:val="true"/>
               <w:spacing w:lineRule="auto" w:line="240" w:before="0" w:after="0"/>
               <w:jc w:val="center"/>
               <w:rPr>
@@ -6660,7 +6717,7 @@
         </w:tc>
         <w:tc>
           <w:tcPr>
-            <w:tcW w:w="556" w:type="dxa"/>
+            <w:tcW w:w="557" w:type="dxa"/>
             <w:tcBorders/>
             <w:shd w:color="auto" w:fill="4472C4" w:val="clear"/>
           </w:tcPr>
@@ -6668,6 +6725,7 @@
             <w:pPr>
               <w:pStyle w:val="Normal"/>
               <w:widowControl/>
+              <w:suppressAutoHyphens w:val="true"/>
               <w:spacing w:lineRule="auto" w:line="240" w:before="0" w:after="0"/>
               <w:jc w:val="center"/>
               <w:rPr>
@@ -6701,6 +6759,7 @@
             <w:pPr>
               <w:pStyle w:val="Normal"/>
               <w:widowControl/>
+              <w:suppressAutoHyphens w:val="true"/>
               <w:spacing w:lineRule="auto" w:line="240" w:before="0" w:after="0"/>
               <w:jc w:val="center"/>
               <w:rPr>
@@ -6734,6 +6793,7 @@
             <w:pPr>
               <w:pStyle w:val="Normal"/>
               <w:widowControl/>
+              <w:suppressAutoHyphens w:val="true"/>
               <w:spacing w:lineRule="auto" w:line="240" w:before="0" w:after="0"/>
               <w:jc w:val="center"/>
               <w:rPr>
@@ -6759,7 +6819,7 @@
         </w:tc>
         <w:tc>
           <w:tcPr>
-            <w:tcW w:w="555" w:type="dxa"/>
+            <w:tcW w:w="554" w:type="dxa"/>
             <w:tcBorders/>
             <w:shd w:color="auto" w:fill="4472C4" w:val="clear"/>
           </w:tcPr>
@@ -6767,6 +6827,7 @@
             <w:pPr>
               <w:pStyle w:val="Normal"/>
               <w:widowControl/>
+              <w:suppressAutoHyphens w:val="true"/>
               <w:spacing w:lineRule="auto" w:line="240" w:before="0" w:after="0"/>
               <w:jc w:val="center"/>
               <w:rPr>
@@ -6792,7 +6853,7 @@
         </w:tc>
         <w:tc>
           <w:tcPr>
-            <w:tcW w:w="557" w:type="dxa"/>
+            <w:tcW w:w="558" w:type="dxa"/>
             <w:tcBorders/>
             <w:shd w:color="auto" w:fill="4472C4" w:val="clear"/>
           </w:tcPr>
@@ -6800,6 +6861,7 @@
             <w:pPr>
               <w:pStyle w:val="Normal"/>
               <w:widowControl/>
+              <w:suppressAutoHyphens w:val="true"/>
               <w:spacing w:lineRule="auto" w:line="240" w:before="0" w:after="0"/>
               <w:jc w:val="center"/>
               <w:rPr>
@@ -6833,6 +6895,7 @@
             <w:pPr>
               <w:pStyle w:val="Normal"/>
               <w:widowControl/>
+              <w:suppressAutoHyphens w:val="true"/>
               <w:spacing w:lineRule="auto" w:line="240" w:before="0" w:after="0"/>
               <w:jc w:val="center"/>
               <w:rPr>
@@ -6866,6 +6929,7 @@
             <w:pPr>
               <w:pStyle w:val="Normal"/>
               <w:widowControl/>
+              <w:suppressAutoHyphens w:val="true"/>
               <w:spacing w:lineRule="auto" w:line="240" w:before="0" w:after="0"/>
               <w:jc w:val="center"/>
               <w:rPr>
@@ -6896,7 +6960,7 @@
         </w:trPr>
         <w:tc>
           <w:tcPr>
-            <w:tcW w:w="2682" w:type="dxa"/>
+            <w:tcW w:w="2681" w:type="dxa"/>
             <w:tcBorders/>
             <w:shd w:color="auto" w:fill="D9E1F2" w:val="clear"/>
           </w:tcPr>
@@ -6904,6 +6968,7 @@
             <w:pPr>
               <w:pStyle w:val="Normal"/>
               <w:widowControl/>
+              <w:suppressAutoHyphens w:val="true"/>
               <w:spacing w:lineRule="auto" w:line="240" w:before="0" w:after="0"/>
               <w:jc w:val="start"/>
               <w:rPr>
@@ -6929,7 +6994,7 @@
         </w:tc>
         <w:tc>
           <w:tcPr>
-            <w:tcW w:w="557" w:type="dxa"/>
+            <w:tcW w:w="558" w:type="dxa"/>
             <w:tcBorders/>
             <w:shd w:color="auto" w:fill="70AD47" w:val="clear"/>
           </w:tcPr>
@@ -6937,6 +7002,7 @@
             <w:pPr>
               <w:pStyle w:val="Normal"/>
               <w:widowControl/>
+              <w:suppressAutoHyphens w:val="true"/>
               <w:spacing w:lineRule="auto" w:line="240" w:before="0" w:after="0"/>
               <w:jc w:val="center"/>
               <w:rPr>
@@ -6970,6 +7036,7 @@
             <w:pPr>
               <w:pStyle w:val="Normal"/>
               <w:widowControl/>
+              <w:suppressAutoHyphens w:val="true"/>
               <w:spacing w:lineRule="auto" w:line="240" w:before="0" w:after="0"/>
               <w:jc w:val="center"/>
               <w:rPr>
@@ -6991,7 +7058,7 @@
         </w:tc>
         <w:tc>
           <w:tcPr>
-            <w:tcW w:w="555" w:type="dxa"/>
+            <w:tcW w:w="554" w:type="dxa"/>
             <w:tcBorders/>
             <w:shd w:color="auto" w:fill="D9E1F2" w:val="clear"/>
           </w:tcPr>
@@ -6999,6 +7066,7 @@
             <w:pPr>
               <w:pStyle w:val="Normal"/>
               <w:widowControl/>
+              <w:suppressAutoHyphens w:val="true"/>
               <w:spacing w:lineRule="auto" w:line="240" w:before="0" w:after="0"/>
               <w:jc w:val="center"/>
               <w:rPr>
@@ -7020,7 +7088,7 @@
         </w:tc>
         <w:tc>
           <w:tcPr>
-            <w:tcW w:w="556" w:type="dxa"/>
+            <w:tcW w:w="557" w:type="dxa"/>
             <w:tcBorders/>
             <w:shd w:color="auto" w:fill="D9E1F2" w:val="clear"/>
           </w:tcPr>
@@ -7028,6 +7096,7 @@
             <w:pPr>
               <w:pStyle w:val="Normal"/>
               <w:widowControl/>
+              <w:suppressAutoHyphens w:val="true"/>
               <w:spacing w:lineRule="auto" w:line="240" w:before="0" w:after="0"/>
               <w:jc w:val="center"/>
               <w:rPr>
@@ -7057,6 +7126,7 @@
             <w:pPr>
               <w:pStyle w:val="Normal"/>
               <w:widowControl/>
+              <w:suppressAutoHyphens w:val="true"/>
               <w:spacing w:lineRule="auto" w:line="240" w:before="0" w:after="0"/>
               <w:jc w:val="center"/>
               <w:rPr>
@@ -7086,6 +7156,7 @@
             <w:pPr>
               <w:pStyle w:val="Normal"/>
               <w:widowControl/>
+              <w:suppressAutoHyphens w:val="true"/>
               <w:spacing w:lineRule="auto" w:line="240" w:before="0" w:after="0"/>
               <w:jc w:val="center"/>
               <w:rPr>
@@ -7107,7 +7178,7 @@
         </w:tc>
         <w:tc>
           <w:tcPr>
-            <w:tcW w:w="555" w:type="dxa"/>
+            <w:tcW w:w="554" w:type="dxa"/>
             <w:tcBorders/>
             <w:shd w:color="auto" w:fill="D9E1F2" w:val="clear"/>
           </w:tcPr>
@@ -7115,6 +7186,7 @@
             <w:pPr>
               <w:pStyle w:val="Normal"/>
               <w:widowControl/>
+              <w:suppressAutoHyphens w:val="true"/>
               <w:spacing w:lineRule="auto" w:line="240" w:before="0" w:after="0"/>
               <w:jc w:val="center"/>
               <w:rPr>
@@ -7136,7 +7208,7 @@
         </w:tc>
         <w:tc>
           <w:tcPr>
-            <w:tcW w:w="557" w:type="dxa"/>
+            <w:tcW w:w="558" w:type="dxa"/>
             <w:tcBorders/>
             <w:shd w:color="auto" w:fill="D9E1F2" w:val="clear"/>
           </w:tcPr>
@@ -7144,6 +7216,7 @@
             <w:pPr>
               <w:pStyle w:val="Normal"/>
               <w:widowControl/>
+              <w:suppressAutoHyphens w:val="true"/>
               <w:spacing w:lineRule="auto" w:line="240" w:before="0" w:after="0"/>
               <w:jc w:val="center"/>
               <w:rPr>
@@ -7173,6 +7246,7 @@
             <w:pPr>
               <w:pStyle w:val="Normal"/>
               <w:widowControl/>
+              <w:suppressAutoHyphens w:val="true"/>
               <w:spacing w:lineRule="auto" w:line="240" w:before="0" w:after="0"/>
               <w:jc w:val="center"/>
               <w:rPr>
@@ -7202,6 +7276,7 @@
             <w:pPr>
               <w:pStyle w:val="Normal"/>
               <w:widowControl/>
+              <w:suppressAutoHyphens w:val="true"/>
               <w:spacing w:lineRule="auto" w:line="240" w:before="0" w:after="0"/>
               <w:jc w:val="center"/>
               <w:rPr>
@@ -7228,7 +7303,7 @@
         </w:trPr>
         <w:tc>
           <w:tcPr>
-            <w:tcW w:w="2682" w:type="dxa"/>
+            <w:tcW w:w="2681" w:type="dxa"/>
             <w:tcBorders/>
             <w:shd w:color="auto" w:fill="FFFFFF" w:val="clear"/>
           </w:tcPr>
@@ -7236,6 +7311,7 @@
             <w:pPr>
               <w:pStyle w:val="Normal"/>
               <w:widowControl/>
+              <w:suppressAutoHyphens w:val="true"/>
               <w:spacing w:lineRule="auto" w:line="240" w:before="0" w:after="0"/>
               <w:jc w:val="start"/>
               <w:rPr>
@@ -7261,7 +7337,7 @@
         </w:tc>
         <w:tc>
           <w:tcPr>
-            <w:tcW w:w="557" w:type="dxa"/>
+            <w:tcW w:w="558" w:type="dxa"/>
             <w:tcBorders/>
             <w:shd w:color="auto" w:fill="70AD47" w:val="clear"/>
           </w:tcPr>
@@ -7269,6 +7345,7 @@
             <w:pPr>
               <w:pStyle w:val="Normal"/>
               <w:widowControl/>
+              <w:suppressAutoHyphens w:val="true"/>
               <w:spacing w:lineRule="auto" w:line="240" w:before="0" w:after="0"/>
               <w:jc w:val="center"/>
               <w:rPr>
@@ -7302,6 +7379,7 @@
             <w:pPr>
               <w:pStyle w:val="Normal"/>
               <w:widowControl/>
+              <w:suppressAutoHyphens w:val="true"/>
               <w:spacing w:lineRule="auto" w:line="240" w:before="0" w:after="0"/>
               <w:jc w:val="center"/>
               <w:rPr>
@@ -7327,7 +7405,7 @@
         </w:tc>
         <w:tc>
           <w:tcPr>
-            <w:tcW w:w="555" w:type="dxa"/>
+            <w:tcW w:w="554" w:type="dxa"/>
             <w:tcBorders/>
             <w:shd w:color="auto" w:fill="70AD47" w:val="clear"/>
           </w:tcPr>
@@ -7335,6 +7413,7 @@
             <w:pPr>
               <w:pStyle w:val="Normal"/>
               <w:widowControl/>
+              <w:suppressAutoHyphens w:val="true"/>
               <w:spacing w:lineRule="auto" w:line="240" w:before="0" w:after="0"/>
               <w:jc w:val="center"/>
               <w:rPr>
@@ -7360,7 +7439,7 @@
         </w:tc>
         <w:tc>
           <w:tcPr>
-            <w:tcW w:w="556" w:type="dxa"/>
+            <w:tcW w:w="557" w:type="dxa"/>
             <w:tcBorders/>
             <w:shd w:color="auto" w:fill="FFFFFF" w:val="clear"/>
           </w:tcPr>
@@ -7368,6 +7447,7 @@
             <w:pPr>
               <w:pStyle w:val="Normal"/>
               <w:widowControl/>
+              <w:suppressAutoHyphens w:val="true"/>
               <w:spacing w:lineRule="auto" w:line="240" w:before="0" w:after="0"/>
               <w:jc w:val="center"/>
               <w:rPr>
@@ -7397,6 +7477,7 @@
             <w:pPr>
               <w:pStyle w:val="Normal"/>
               <w:widowControl/>
+              <w:suppressAutoHyphens w:val="true"/>
               <w:spacing w:lineRule="auto" w:line="240" w:before="0" w:after="0"/>
               <w:jc w:val="center"/>
               <w:rPr>
@@ -7426,6 +7507,7 @@
             <w:pPr>
               <w:pStyle w:val="Normal"/>
               <w:widowControl/>
+              <w:suppressAutoHyphens w:val="true"/>
               <w:spacing w:lineRule="auto" w:line="240" w:before="0" w:after="0"/>
               <w:jc w:val="center"/>
               <w:rPr>
@@ -7447,7 +7529,7 @@
         </w:tc>
         <w:tc>
           <w:tcPr>
-            <w:tcW w:w="555" w:type="dxa"/>
+            <w:tcW w:w="554" w:type="dxa"/>
             <w:tcBorders/>
             <w:shd w:color="auto" w:fill="FFFFFF" w:val="clear"/>
           </w:tcPr>
@@ -7455,6 +7537,7 @@
             <w:pPr>
               <w:pStyle w:val="Normal"/>
               <w:widowControl/>
+              <w:suppressAutoHyphens w:val="true"/>
               <w:spacing w:lineRule="auto" w:line="240" w:before="0" w:after="0"/>
               <w:jc w:val="center"/>
               <w:rPr>
@@ -7476,7 +7559,7 @@
         </w:tc>
         <w:tc>
           <w:tcPr>
-            <w:tcW w:w="557" w:type="dxa"/>
+            <w:tcW w:w="558" w:type="dxa"/>
             <w:tcBorders/>
             <w:shd w:color="auto" w:fill="FFFFFF" w:val="clear"/>
           </w:tcPr>
@@ -7484,6 +7567,7 @@
             <w:pPr>
               <w:pStyle w:val="Normal"/>
               <w:widowControl/>
+              <w:suppressAutoHyphens w:val="true"/>
               <w:spacing w:lineRule="auto" w:line="240" w:before="0" w:after="0"/>
               <w:jc w:val="center"/>
               <w:rPr>
@@ -7513,6 +7597,7 @@
             <w:pPr>
               <w:pStyle w:val="Normal"/>
               <w:widowControl/>
+              <w:suppressAutoHyphens w:val="true"/>
               <w:spacing w:lineRule="auto" w:line="240" w:before="0" w:after="0"/>
               <w:jc w:val="center"/>
               <w:rPr>
@@ -7542,6 +7627,7 @@
             <w:pPr>
               <w:pStyle w:val="Normal"/>
               <w:widowControl/>
+              <w:suppressAutoHyphens w:val="true"/>
               <w:spacing w:lineRule="auto" w:line="240" w:before="0" w:after="0"/>
               <w:jc w:val="center"/>
               <w:rPr>
@@ -7568,7 +7654,7 @@
         </w:trPr>
         <w:tc>
           <w:tcPr>
-            <w:tcW w:w="2682" w:type="dxa"/>
+            <w:tcW w:w="2681" w:type="dxa"/>
             <w:tcBorders/>
             <w:shd w:color="auto" w:fill="D9E1F2" w:val="clear"/>
           </w:tcPr>
@@ -7576,6 +7662,7 @@
             <w:pPr>
               <w:pStyle w:val="Normal"/>
               <w:widowControl/>
+              <w:suppressAutoHyphens w:val="true"/>
               <w:spacing w:lineRule="auto" w:line="240" w:before="0" w:after="0"/>
               <w:jc w:val="start"/>
               <w:rPr>
@@ -7601,7 +7688,7 @@
         </w:tc>
         <w:tc>
           <w:tcPr>
-            <w:tcW w:w="557" w:type="dxa"/>
+            <w:tcW w:w="558" w:type="dxa"/>
             <w:tcBorders/>
             <w:shd w:color="auto" w:fill="70AD47" w:val="clear"/>
           </w:tcPr>
@@ -7609,6 +7696,7 @@
             <w:pPr>
               <w:pStyle w:val="Normal"/>
               <w:widowControl/>
+              <w:suppressAutoHyphens w:val="true"/>
               <w:spacing w:lineRule="auto" w:line="240" w:before="0" w:after="0"/>
               <w:jc w:val="center"/>
               <w:rPr>
@@ -7642,6 +7730,7 @@
             <w:pPr>
               <w:pStyle w:val="Normal"/>
               <w:widowControl/>
+              <w:suppressAutoHyphens w:val="true"/>
               <w:spacing w:lineRule="auto" w:line="240" w:before="0" w:after="0"/>
               <w:jc w:val="center"/>
               <w:rPr>
@@ -7667,7 +7756,7 @@
         </w:tc>
         <w:tc>
           <w:tcPr>
-            <w:tcW w:w="555" w:type="dxa"/>
+            <w:tcW w:w="554" w:type="dxa"/>
             <w:tcBorders/>
             <w:shd w:color="auto" w:fill="70AD47" w:val="clear"/>
           </w:tcPr>
@@ -7675,6 +7764,7 @@
             <w:pPr>
               <w:pStyle w:val="Normal"/>
               <w:widowControl/>
+              <w:suppressAutoHyphens w:val="true"/>
               <w:spacing w:lineRule="auto" w:line="240" w:before="0" w:after="0"/>
               <w:jc w:val="center"/>
               <w:rPr>
@@ -7700,7 +7790,7 @@
         </w:tc>
         <w:tc>
           <w:tcPr>
-            <w:tcW w:w="556" w:type="dxa"/>
+            <w:tcW w:w="557" w:type="dxa"/>
             <w:tcBorders/>
             <w:shd w:color="auto" w:fill="D9E1F2" w:val="clear"/>
           </w:tcPr>
@@ -7708,6 +7798,7 @@
             <w:pPr>
               <w:pStyle w:val="Normal"/>
               <w:widowControl/>
+              <w:suppressAutoHyphens w:val="true"/>
               <w:spacing w:lineRule="auto" w:line="240" w:before="0" w:after="0"/>
               <w:jc w:val="center"/>
               <w:rPr>
@@ -7737,6 +7828,7 @@
             <w:pPr>
               <w:pStyle w:val="Normal"/>
               <w:widowControl/>
+              <w:suppressAutoHyphens w:val="true"/>
               <w:spacing w:lineRule="auto" w:line="240" w:before="0" w:after="0"/>
               <w:jc w:val="center"/>
               <w:rPr>
@@ -7766,6 +7858,7 @@
             <w:pPr>
               <w:pStyle w:val="Normal"/>
               <w:widowControl/>
+              <w:suppressAutoHyphens w:val="true"/>
               <w:spacing w:lineRule="auto" w:line="240" w:before="0" w:after="0"/>
               <w:jc w:val="center"/>
               <w:rPr>
@@ -7787,7 +7880,7 @@
         </w:tc>
         <w:tc>
           <w:tcPr>
-            <w:tcW w:w="555" w:type="dxa"/>
+            <w:tcW w:w="554" w:type="dxa"/>
             <w:tcBorders/>
             <w:shd w:color="auto" w:fill="D9E1F2" w:val="clear"/>
           </w:tcPr>
@@ -7795,6 +7888,7 @@
             <w:pPr>
               <w:pStyle w:val="Normal"/>
               <w:widowControl/>
+              <w:suppressAutoHyphens w:val="true"/>
               <w:spacing w:lineRule="auto" w:line="240" w:before="0" w:after="0"/>
               <w:jc w:val="center"/>
               <w:rPr>
@@ -7816,7 +7910,7 @@
         </w:tc>
         <w:tc>
           <w:tcPr>
-            <w:tcW w:w="557" w:type="dxa"/>
+            <w:tcW w:w="558" w:type="dxa"/>
             <w:tcBorders/>
             <w:shd w:color="auto" w:fill="D9E1F2" w:val="clear"/>
           </w:tcPr>
@@ -7824,6 +7918,7 @@
             <w:pPr>
               <w:pStyle w:val="Normal"/>
               <w:widowControl/>
+              <w:suppressAutoHyphens w:val="true"/>
               <w:spacing w:lineRule="auto" w:line="240" w:before="0" w:after="0"/>
               <w:jc w:val="center"/>
               <w:rPr>
@@ -7853,6 +7948,7 @@
             <w:pPr>
               <w:pStyle w:val="Normal"/>
               <w:widowControl/>
+              <w:suppressAutoHyphens w:val="true"/>
               <w:spacing w:lineRule="auto" w:line="240" w:before="0" w:after="0"/>
               <w:jc w:val="center"/>
               <w:rPr>
@@ -7882,6 +7978,7 @@
             <w:pPr>
               <w:pStyle w:val="Normal"/>
               <w:widowControl/>
+              <w:suppressAutoHyphens w:val="true"/>
               <w:spacing w:lineRule="auto" w:line="240" w:before="0" w:after="0"/>
               <w:jc w:val="center"/>
               <w:rPr>
@@ -7908,7 +8005,7 @@
         </w:trPr>
         <w:tc>
           <w:tcPr>
-            <w:tcW w:w="2682" w:type="dxa"/>
+            <w:tcW w:w="2681" w:type="dxa"/>
             <w:tcBorders/>
             <w:shd w:color="auto" w:fill="FFFFFF" w:val="clear"/>
           </w:tcPr>
@@ -7916,6 +8013,7 @@
             <w:pPr>
               <w:pStyle w:val="Normal"/>
               <w:widowControl/>
+              <w:suppressAutoHyphens w:val="true"/>
               <w:spacing w:lineRule="auto" w:line="240" w:before="0" w:after="0"/>
               <w:jc w:val="start"/>
               <w:rPr>
@@ -7941,7 +8039,7 @@
         </w:tc>
         <w:tc>
           <w:tcPr>
-            <w:tcW w:w="557" w:type="dxa"/>
+            <w:tcW w:w="558" w:type="dxa"/>
             <w:tcBorders/>
             <w:shd w:color="auto" w:fill="FFFFFF" w:val="clear"/>
           </w:tcPr>
@@ -7949,6 +8047,7 @@
             <w:pPr>
               <w:pStyle w:val="Normal"/>
               <w:widowControl/>
+              <w:suppressAutoHyphens w:val="true"/>
               <w:spacing w:lineRule="auto" w:line="240" w:before="0" w:after="0"/>
               <w:jc w:val="center"/>
               <w:rPr>
@@ -7978,6 +8077,7 @@
             <w:pPr>
               <w:pStyle w:val="Normal"/>
               <w:widowControl/>
+              <w:suppressAutoHyphens w:val="true"/>
               <w:spacing w:lineRule="auto" w:line="240" w:before="0" w:after="0"/>
               <w:jc w:val="center"/>
               <w:rPr>
@@ -7999,7 +8099,7 @@
         </w:tc>
         <w:tc>
           <w:tcPr>
-            <w:tcW w:w="555" w:type="dxa"/>
+            <w:tcW w:w="554" w:type="dxa"/>
             <w:tcBorders/>
             <w:shd w:color="auto" w:fill="70AD47" w:val="clear"/>
           </w:tcPr>
@@ -8007,6 +8107,7 @@
             <w:pPr>
               <w:pStyle w:val="Normal"/>
               <w:widowControl/>
+              <w:suppressAutoHyphens w:val="true"/>
               <w:spacing w:lineRule="auto" w:line="240" w:before="0" w:after="0"/>
               <w:jc w:val="center"/>
               <w:rPr>
@@ -8032,7 +8133,7 @@
         </w:tc>
         <w:tc>
           <w:tcPr>
-            <w:tcW w:w="556" w:type="dxa"/>
+            <w:tcW w:w="557" w:type="dxa"/>
             <w:tcBorders/>
             <w:shd w:color="auto" w:fill="70AD47" w:val="clear"/>
           </w:tcPr>
@@ -8040,6 +8141,7 @@
             <w:pPr>
               <w:pStyle w:val="Normal"/>
               <w:widowControl/>
+              <w:suppressAutoHyphens w:val="true"/>
               <w:spacing w:lineRule="auto" w:line="240" w:before="0" w:after="0"/>
               <w:jc w:val="center"/>
               <w:rPr>
@@ -8073,6 +8175,7 @@
             <w:pPr>
               <w:pStyle w:val="Normal"/>
               <w:widowControl/>
+              <w:suppressAutoHyphens w:val="true"/>
               <w:spacing w:lineRule="auto" w:line="240" w:before="0" w:after="0"/>
               <w:jc w:val="center"/>
               <w:rPr>
@@ -8102,6 +8205,7 @@
             <w:pPr>
               <w:pStyle w:val="Normal"/>
               <w:widowControl/>
+              <w:suppressAutoHyphens w:val="true"/>
               <w:spacing w:lineRule="auto" w:line="240" w:before="0" w:after="0"/>
               <w:jc w:val="center"/>
               <w:rPr>
@@ -8123,7 +8227,7 @@
         </w:tc>
         <w:tc>
           <w:tcPr>
-            <w:tcW w:w="555" w:type="dxa"/>
+            <w:tcW w:w="554" w:type="dxa"/>
             <w:tcBorders/>
             <w:shd w:color="auto" w:fill="FFFFFF" w:val="clear"/>
           </w:tcPr>
@@ -8131,6 +8235,7 @@
             <w:pPr>
               <w:pStyle w:val="Normal"/>
               <w:widowControl/>
+              <w:suppressAutoHyphens w:val="true"/>
               <w:spacing w:lineRule="auto" w:line="240" w:before="0" w:after="0"/>
               <w:jc w:val="center"/>
               <w:rPr>
@@ -8152,7 +8257,7 @@
         </w:tc>
         <w:tc>
           <w:tcPr>
-            <w:tcW w:w="557" w:type="dxa"/>
+            <w:tcW w:w="558" w:type="dxa"/>
             <w:tcBorders/>
             <w:shd w:color="auto" w:fill="FFFFFF" w:val="clear"/>
           </w:tcPr>
@@ -8160,6 +8265,7 @@
             <w:pPr>
               <w:pStyle w:val="Normal"/>
               <w:widowControl/>
+              <w:suppressAutoHyphens w:val="true"/>
               <w:spacing w:lineRule="auto" w:line="240" w:before="0" w:after="0"/>
               <w:jc w:val="center"/>
               <w:rPr>
@@ -8189,6 +8295,7 @@
             <w:pPr>
               <w:pStyle w:val="Normal"/>
               <w:widowControl/>
+              <w:suppressAutoHyphens w:val="true"/>
               <w:spacing w:lineRule="auto" w:line="240" w:before="0" w:after="0"/>
               <w:jc w:val="center"/>
               <w:rPr>
@@ -8218,6 +8325,7 @@
             <w:pPr>
               <w:pStyle w:val="Normal"/>
               <w:widowControl/>
+              <w:suppressAutoHyphens w:val="true"/>
               <w:spacing w:lineRule="auto" w:line="240" w:before="0" w:after="0"/>
               <w:jc w:val="center"/>
               <w:rPr>
@@ -8244,7 +8352,7 @@
         </w:trPr>
         <w:tc>
           <w:tcPr>
-            <w:tcW w:w="2682" w:type="dxa"/>
+            <w:tcW w:w="2681" w:type="dxa"/>
             <w:tcBorders/>
             <w:shd w:color="auto" w:fill="D9E1F2" w:val="clear"/>
           </w:tcPr>
@@ -8252,6 +8360,7 @@
             <w:pPr>
               <w:pStyle w:val="Normal"/>
               <w:widowControl/>
+              <w:suppressAutoHyphens w:val="true"/>
               <w:spacing w:lineRule="auto" w:line="240" w:before="0" w:after="0"/>
               <w:jc w:val="start"/>
               <w:rPr>
@@ -8277,7 +8386,7 @@
         </w:tc>
         <w:tc>
           <w:tcPr>
-            <w:tcW w:w="557" w:type="dxa"/>
+            <w:tcW w:w="558" w:type="dxa"/>
             <w:tcBorders/>
             <w:shd w:color="auto" w:fill="D9E1F2" w:val="clear"/>
           </w:tcPr>
@@ -8285,6 +8394,7 @@
             <w:pPr>
               <w:pStyle w:val="Normal"/>
               <w:widowControl/>
+              <w:suppressAutoHyphens w:val="true"/>
               <w:spacing w:lineRule="auto" w:line="240" w:before="0" w:after="0"/>
               <w:jc w:val="center"/>
               <w:rPr>
@@ -8314,6 +8424,7 @@
             <w:pPr>
               <w:pStyle w:val="Normal"/>
               <w:widowControl/>
+              <w:suppressAutoHyphens w:val="true"/>
               <w:spacing w:lineRule="auto" w:line="240" w:before="0" w:after="0"/>
               <w:jc w:val="center"/>
               <w:rPr>
@@ -8335,7 +8446,7 @@
         </w:tc>
         <w:tc>
           <w:tcPr>
-            <w:tcW w:w="555" w:type="dxa"/>
+            <w:tcW w:w="554" w:type="dxa"/>
             <w:tcBorders/>
             <w:shd w:color="auto" w:fill="D9E1F2" w:val="clear"/>
           </w:tcPr>
@@ -8343,6 +8454,7 @@
             <w:pPr>
               <w:pStyle w:val="Normal"/>
               <w:widowControl/>
+              <w:suppressAutoHyphens w:val="true"/>
               <w:spacing w:lineRule="auto" w:line="240" w:before="0" w:after="0"/>
               <w:jc w:val="center"/>
               <w:rPr>
@@ -8364,7 +8476,7 @@
         </w:tc>
         <w:tc>
           <w:tcPr>
-            <w:tcW w:w="556" w:type="dxa"/>
+            <w:tcW w:w="557" w:type="dxa"/>
             <w:tcBorders/>
             <w:shd w:color="auto" w:fill="70AD47" w:val="clear"/>
           </w:tcPr>
@@ -8372,6 +8484,7 @@
             <w:pPr>
               <w:pStyle w:val="Normal"/>
               <w:widowControl/>
+              <w:suppressAutoHyphens w:val="true"/>
               <w:spacing w:lineRule="auto" w:line="240" w:before="0" w:after="0"/>
               <w:jc w:val="center"/>
               <w:rPr>
@@ -8405,6 +8518,7 @@
             <w:pPr>
               <w:pStyle w:val="Normal"/>
               <w:widowControl/>
+              <w:suppressAutoHyphens w:val="true"/>
               <w:spacing w:lineRule="auto" w:line="240" w:before="0" w:after="0"/>
               <w:jc w:val="center"/>
               <w:rPr>
@@ -8438,6 +8552,7 @@
             <w:pPr>
               <w:pStyle w:val="Normal"/>
               <w:widowControl/>
+              <w:suppressAutoHyphens w:val="true"/>
               <w:spacing w:lineRule="auto" w:line="240" w:before="0" w:after="0"/>
               <w:jc w:val="center"/>
               <w:rPr>
@@ -8459,7 +8574,7 @@
         </w:tc>
         <w:tc>
           <w:tcPr>
-            <w:tcW w:w="555" w:type="dxa"/>
+            <w:tcW w:w="554" w:type="dxa"/>
             <w:tcBorders/>
             <w:shd w:color="auto" w:fill="D9E1F2" w:val="clear"/>
           </w:tcPr>
@@ -8467,6 +8582,7 @@
             <w:pPr>
               <w:pStyle w:val="Normal"/>
               <w:widowControl/>
+              <w:suppressAutoHyphens w:val="true"/>
               <w:spacing w:lineRule="auto" w:line="240" w:before="0" w:after="0"/>
               <w:jc w:val="center"/>
               <w:rPr>
@@ -8488,7 +8604,7 @@
         </w:tc>
         <w:tc>
           <w:tcPr>
-            <w:tcW w:w="557" w:type="dxa"/>
+            <w:tcW w:w="558" w:type="dxa"/>
             <w:tcBorders/>
             <w:shd w:color="auto" w:fill="D9E1F2" w:val="clear"/>
           </w:tcPr>
@@ -8496,6 +8612,7 @@
             <w:pPr>
               <w:pStyle w:val="Normal"/>
               <w:widowControl/>
+              <w:suppressAutoHyphens w:val="true"/>
               <w:spacing w:lineRule="auto" w:line="240" w:before="0" w:after="0"/>
               <w:jc w:val="center"/>
               <w:rPr>
@@ -8525,6 +8642,7 @@
             <w:pPr>
               <w:pStyle w:val="Normal"/>
               <w:widowControl/>
+              <w:suppressAutoHyphens w:val="true"/>
               <w:spacing w:lineRule="auto" w:line="240" w:before="0" w:after="0"/>
               <w:jc w:val="center"/>
               <w:rPr>
@@ -8554,6 +8672,7 @@
             <w:pPr>
               <w:pStyle w:val="Normal"/>
               <w:widowControl/>
+              <w:suppressAutoHyphens w:val="true"/>
               <w:spacing w:lineRule="auto" w:line="240" w:before="0" w:after="0"/>
               <w:jc w:val="center"/>
               <w:rPr>
@@ -8580,7 +8699,7 @@
         </w:trPr>
         <w:tc>
           <w:tcPr>
-            <w:tcW w:w="2682" w:type="dxa"/>
+            <w:tcW w:w="2681" w:type="dxa"/>
             <w:tcBorders/>
             <w:shd w:color="auto" w:fill="FFFFFF" w:val="clear"/>
           </w:tcPr>
@@ -8588,6 +8707,7 @@
             <w:pPr>
               <w:pStyle w:val="Normal"/>
               <w:widowControl/>
+              <w:suppressAutoHyphens w:val="true"/>
               <w:spacing w:lineRule="auto" w:line="240" w:before="0" w:after="0"/>
               <w:jc w:val="start"/>
               <w:rPr>
@@ -8613,7 +8733,7 @@
         </w:tc>
         <w:tc>
           <w:tcPr>
-            <w:tcW w:w="557" w:type="dxa"/>
+            <w:tcW w:w="558" w:type="dxa"/>
             <w:tcBorders/>
             <w:shd w:color="auto" w:fill="FFFFFF" w:val="clear"/>
           </w:tcPr>
@@ -8621,6 +8741,7 @@
             <w:pPr>
               <w:pStyle w:val="Normal"/>
               <w:widowControl/>
+              <w:suppressAutoHyphens w:val="true"/>
               <w:spacing w:lineRule="auto" w:line="240" w:before="0" w:after="0"/>
               <w:jc w:val="center"/>
               <w:rPr>
@@ -8650,6 +8771,7 @@
             <w:pPr>
               <w:pStyle w:val="Normal"/>
               <w:widowControl/>
+              <w:suppressAutoHyphens w:val="true"/>
               <w:spacing w:lineRule="auto" w:line="240" w:before="0" w:after="0"/>
               <w:jc w:val="center"/>
               <w:rPr>
@@ -8671,7 +8793,7 @@
         </w:tc>
         <w:tc>
           <w:tcPr>
-            <w:tcW w:w="555" w:type="dxa"/>
+            <w:tcW w:w="554" w:type="dxa"/>
             <w:tcBorders/>
             <w:shd w:color="auto" w:fill="FFFFFF" w:val="clear"/>
           </w:tcPr>
@@ -8679,6 +8801,7 @@
             <w:pPr>
               <w:pStyle w:val="Normal"/>
               <w:widowControl/>
+              <w:suppressAutoHyphens w:val="true"/>
               <w:spacing w:lineRule="auto" w:line="240" w:before="0" w:after="0"/>
               <w:jc w:val="center"/>
               <w:rPr>
@@ -8700,7 +8823,7 @@
         </w:tc>
         <w:tc>
           <w:tcPr>
-            <w:tcW w:w="556" w:type="dxa"/>
+            <w:tcW w:w="557" w:type="dxa"/>
             <w:tcBorders/>
             <w:shd w:color="auto" w:fill="FFFFFF" w:val="clear"/>
           </w:tcPr>
@@ -8708,6 +8831,7 @@
             <w:pPr>
               <w:pStyle w:val="Normal"/>
               <w:widowControl/>
+              <w:suppressAutoHyphens w:val="true"/>
               <w:spacing w:lineRule="auto" w:line="240" w:before="0" w:after="0"/>
               <w:jc w:val="center"/>
               <w:rPr>
@@ -8737,6 +8861,7 @@
             <w:pPr>
               <w:pStyle w:val="Normal"/>
               <w:widowControl/>
+              <w:suppressAutoHyphens w:val="true"/>
               <w:spacing w:lineRule="auto" w:line="240" w:before="0" w:after="0"/>
               <w:jc w:val="center"/>
               <w:rPr>
@@ -8770,6 +8895,7 @@
             <w:pPr>
               <w:pStyle w:val="Normal"/>
               <w:widowControl/>
+              <w:suppressAutoHyphens w:val="true"/>
               <w:spacing w:lineRule="auto" w:line="240" w:before="0" w:after="0"/>
               <w:jc w:val="center"/>
               <w:rPr>
@@ -8795,7 +8921,7 @@
         </w:tc>
         <w:tc>
           <w:tcPr>
-            <w:tcW w:w="555" w:type="dxa"/>
+            <w:tcW w:w="554" w:type="dxa"/>
             <w:tcBorders/>
             <w:shd w:color="auto" w:fill="FFFFFF" w:val="clear"/>
           </w:tcPr>
@@ -8803,6 +8929,7 @@
             <w:pPr>
               <w:pStyle w:val="Normal"/>
               <w:widowControl/>
+              <w:suppressAutoHyphens w:val="true"/>
               <w:spacing w:lineRule="auto" w:line="240" w:before="0" w:after="0"/>
               <w:jc w:val="center"/>
               <w:rPr>
@@ -8824,7 +8951,7 @@
         </w:tc>
         <w:tc>
           <w:tcPr>
-            <w:tcW w:w="557" w:type="dxa"/>
+            <w:tcW w:w="558" w:type="dxa"/>
             <w:tcBorders/>
             <w:shd w:color="auto" w:fill="FFFFFF" w:val="clear"/>
           </w:tcPr>
@@ -8832,6 +8959,7 @@
             <w:pPr>
               <w:pStyle w:val="Normal"/>
               <w:widowControl/>
+              <w:suppressAutoHyphens w:val="true"/>
               <w:spacing w:lineRule="auto" w:line="240" w:before="0" w:after="0"/>
               <w:jc w:val="center"/>
               <w:rPr>
@@ -8861,6 +8989,7 @@
             <w:pPr>
               <w:pStyle w:val="Normal"/>
               <w:widowControl/>
+              <w:suppressAutoHyphens w:val="true"/>
               <w:spacing w:lineRule="auto" w:line="240" w:before="0" w:after="0"/>
               <w:jc w:val="center"/>
               <w:rPr>
@@ -8890,6 +9019,7 @@
             <w:pPr>
               <w:pStyle w:val="Normal"/>
               <w:widowControl/>
+              <w:suppressAutoHyphens w:val="true"/>
               <w:spacing w:lineRule="auto" w:line="240" w:before="0" w:after="0"/>
               <w:jc w:val="center"/>
               <w:rPr>
@@ -8916,7 +9046,7 @@
         </w:trPr>
         <w:tc>
           <w:tcPr>
-            <w:tcW w:w="2682" w:type="dxa"/>
+            <w:tcW w:w="2681" w:type="dxa"/>
             <w:tcBorders/>
             <w:shd w:color="auto" w:fill="D9E1F2" w:val="clear"/>
           </w:tcPr>
@@ -8924,6 +9054,7 @@
             <w:pPr>
               <w:pStyle w:val="Normal"/>
               <w:widowControl/>
+              <w:suppressAutoHyphens w:val="true"/>
               <w:spacing w:lineRule="auto" w:line="240" w:before="0" w:after="0"/>
               <w:jc w:val="start"/>
               <w:rPr>
@@ -8949,7 +9080,7 @@
         </w:tc>
         <w:tc>
           <w:tcPr>
-            <w:tcW w:w="557" w:type="dxa"/>
+            <w:tcW w:w="558" w:type="dxa"/>
             <w:tcBorders/>
             <w:shd w:color="auto" w:fill="D9E1F2" w:val="clear"/>
           </w:tcPr>
@@ -8957,6 +9088,7 @@
             <w:pPr>
               <w:pStyle w:val="Normal"/>
               <w:widowControl/>
+              <w:suppressAutoHyphens w:val="true"/>
               <w:spacing w:lineRule="auto" w:line="240" w:before="0" w:after="0"/>
               <w:jc w:val="center"/>
               <w:rPr>
@@ -8986,6 +9118,7 @@
             <w:pPr>
               <w:pStyle w:val="Normal"/>
               <w:widowControl/>
+              <w:suppressAutoHyphens w:val="true"/>
               <w:spacing w:lineRule="auto" w:line="240" w:before="0" w:after="0"/>
               <w:jc w:val="center"/>
               <w:rPr>
@@ -9007,7 +9140,7 @@
         </w:tc>
         <w:tc>
           <w:tcPr>
-            <w:tcW w:w="555" w:type="dxa"/>
+            <w:tcW w:w="554" w:type="dxa"/>
             <w:tcBorders/>
             <w:shd w:color="auto" w:fill="D9E1F2" w:val="clear"/>
           </w:tcPr>
@@ -9015,6 +9148,7 @@
             <w:pPr>
               <w:pStyle w:val="Normal"/>
               <w:widowControl/>
+              <w:suppressAutoHyphens w:val="true"/>
               <w:spacing w:lineRule="auto" w:line="240" w:before="0" w:after="0"/>
               <w:jc w:val="center"/>
               <w:rPr>
@@ -9036,7 +9170,7 @@
         </w:tc>
         <w:tc>
           <w:tcPr>
-            <w:tcW w:w="556" w:type="dxa"/>
+            <w:tcW w:w="557" w:type="dxa"/>
             <w:tcBorders/>
             <w:shd w:color="auto" w:fill="D9E1F2" w:val="clear"/>
           </w:tcPr>
@@ -9044,6 +9178,7 @@
             <w:pPr>
               <w:pStyle w:val="Normal"/>
               <w:widowControl/>
+              <w:suppressAutoHyphens w:val="true"/>
               <w:spacing w:lineRule="auto" w:line="240" w:before="0" w:after="0"/>
               <w:jc w:val="center"/>
               <w:rPr>
@@ -9073,6 +9208,7 @@
             <w:pPr>
               <w:pStyle w:val="Normal"/>
               <w:widowControl/>
+              <w:suppressAutoHyphens w:val="true"/>
               <w:spacing w:lineRule="auto" w:line="240" w:before="0" w:after="0"/>
               <w:jc w:val="center"/>
               <w:rPr>
@@ -9102,6 +9238,7 @@
             <w:pPr>
               <w:pStyle w:val="Normal"/>
               <w:widowControl/>
+              <w:suppressAutoHyphens w:val="true"/>
               <w:spacing w:lineRule="auto" w:line="240" w:before="0" w:after="0"/>
               <w:jc w:val="center"/>
               <w:rPr>
@@ -9127,7 +9264,7 @@
         </w:tc>
         <w:tc>
           <w:tcPr>
-            <w:tcW w:w="555" w:type="dxa"/>
+            <w:tcW w:w="554" w:type="dxa"/>
             <w:tcBorders/>
             <w:shd w:color="auto" w:fill="D9E1F2" w:val="clear"/>
           </w:tcPr>
@@ -9135,6 +9272,7 @@
             <w:pPr>
               <w:pStyle w:val="Normal"/>
               <w:widowControl/>
+              <w:suppressAutoHyphens w:val="true"/>
               <w:spacing w:lineRule="auto" w:line="240" w:before="0" w:after="0"/>
               <w:jc w:val="center"/>
               <w:rPr>
@@ -9156,7 +9294,7 @@
         </w:tc>
         <w:tc>
           <w:tcPr>
-            <w:tcW w:w="557" w:type="dxa"/>
+            <w:tcW w:w="558" w:type="dxa"/>
             <w:tcBorders/>
             <w:shd w:color="auto" w:fill="D9E1F2" w:val="clear"/>
           </w:tcPr>
@@ -9164,6 +9302,7 @@
             <w:pPr>
               <w:pStyle w:val="Normal"/>
               <w:widowControl/>
+              <w:suppressAutoHyphens w:val="true"/>
               <w:spacing w:lineRule="auto" w:line="240" w:before="0" w:after="0"/>
               <w:jc w:val="center"/>
               <w:rPr>
@@ -9193,6 +9332,7 @@
             <w:pPr>
               <w:pStyle w:val="Normal"/>
               <w:widowControl/>
+              <w:suppressAutoHyphens w:val="true"/>
               <w:spacing w:lineRule="auto" w:line="240" w:before="0" w:after="0"/>
               <w:jc w:val="center"/>
               <w:rPr>
@@ -9222,6 +9362,7 @@
             <w:pPr>
               <w:pStyle w:val="Normal"/>
               <w:widowControl/>
+              <w:suppressAutoHyphens w:val="true"/>
               <w:spacing w:lineRule="auto" w:line="240" w:before="0" w:after="0"/>
               <w:jc w:val="center"/>
               <w:rPr>
@@ -9248,7 +9389,7 @@
         </w:trPr>
         <w:tc>
           <w:tcPr>
-            <w:tcW w:w="2682" w:type="dxa"/>
+            <w:tcW w:w="2681" w:type="dxa"/>
             <w:tcBorders/>
             <w:shd w:color="auto" w:fill="FFFFFF" w:val="clear"/>
           </w:tcPr>
@@ -9256,6 +9397,7 @@
             <w:pPr>
               <w:pStyle w:val="Normal"/>
               <w:widowControl/>
+              <w:suppressAutoHyphens w:val="true"/>
               <w:spacing w:lineRule="auto" w:line="240" w:before="0" w:after="0"/>
               <w:jc w:val="start"/>
               <w:rPr>
@@ -9281,7 +9423,7 @@
         </w:tc>
         <w:tc>
           <w:tcPr>
-            <w:tcW w:w="557" w:type="dxa"/>
+            <w:tcW w:w="558" w:type="dxa"/>
             <w:tcBorders/>
             <w:shd w:color="auto" w:fill="FFFFFF" w:val="clear"/>
           </w:tcPr>
@@ -9289,6 +9431,7 @@
             <w:pPr>
               <w:pStyle w:val="Normal"/>
               <w:widowControl/>
+              <w:suppressAutoHyphens w:val="true"/>
               <w:spacing w:lineRule="auto" w:line="240" w:before="0" w:after="0"/>
               <w:jc w:val="center"/>
               <w:rPr>
@@ -9318,6 +9461,7 @@
             <w:pPr>
               <w:pStyle w:val="Normal"/>
               <w:widowControl/>
+              <w:suppressAutoHyphens w:val="true"/>
               <w:spacing w:lineRule="auto" w:line="240" w:before="0" w:after="0"/>
               <w:jc w:val="center"/>
               <w:rPr>
@@ -9339,7 +9483,7 @@
         </w:tc>
         <w:tc>
           <w:tcPr>
-            <w:tcW w:w="555" w:type="dxa"/>
+            <w:tcW w:w="554" w:type="dxa"/>
             <w:tcBorders/>
             <w:shd w:color="auto" w:fill="FFFFFF" w:val="clear"/>
           </w:tcPr>
@@ -9347,6 +9491,7 @@
             <w:pPr>
               <w:pStyle w:val="Normal"/>
               <w:widowControl/>
+              <w:suppressAutoHyphens w:val="true"/>
               <w:spacing w:lineRule="auto" w:line="240" w:before="0" w:after="0"/>
               <w:jc w:val="center"/>
               <w:rPr>
@@ -9368,7 +9513,7 @@
         </w:tc>
         <w:tc>
           <w:tcPr>
-            <w:tcW w:w="556" w:type="dxa"/>
+            <w:tcW w:w="557" w:type="dxa"/>
             <w:tcBorders/>
             <w:shd w:color="auto" w:fill="FFFFFF" w:val="clear"/>
           </w:tcPr>
@@ -9376,6 +9521,7 @@
             <w:pPr>
               <w:pStyle w:val="Normal"/>
               <w:widowControl/>
+              <w:suppressAutoHyphens w:val="true"/>
               <w:spacing w:lineRule="auto" w:line="240" w:before="0" w:after="0"/>
               <w:jc w:val="center"/>
               <w:rPr>
@@ -9405,6 +9551,7 @@
             <w:pPr>
               <w:pStyle w:val="Normal"/>
               <w:widowControl/>
+              <w:suppressAutoHyphens w:val="true"/>
               <w:spacing w:lineRule="auto" w:line="240" w:before="0" w:after="0"/>
               <w:jc w:val="center"/>
               <w:rPr>
@@ -9434,6 +9581,7 @@
             <w:pPr>
               <w:pStyle w:val="Normal"/>
               <w:widowControl/>
+              <w:suppressAutoHyphens w:val="true"/>
               <w:spacing w:lineRule="auto" w:line="240" w:before="0" w:after="0"/>
               <w:jc w:val="center"/>
               <w:rPr>
@@ -9455,7 +9603,7 @@
         </w:tc>
         <w:tc>
           <w:tcPr>
-            <w:tcW w:w="555" w:type="dxa"/>
+            <w:tcW w:w="554" w:type="dxa"/>
             <w:tcBorders/>
             <w:shd w:color="auto" w:fill="70AD47" w:val="clear"/>
           </w:tcPr>
@@ -9463,6 +9611,7 @@
             <w:pPr>
               <w:pStyle w:val="Normal"/>
               <w:widowControl/>
+              <w:suppressAutoHyphens w:val="true"/>
               <w:spacing w:lineRule="auto" w:line="240" w:before="0" w:after="0"/>
               <w:jc w:val="center"/>
               <w:rPr>
@@ -9488,7 +9637,7 @@
         </w:tc>
         <w:tc>
           <w:tcPr>
-            <w:tcW w:w="557" w:type="dxa"/>
+            <w:tcW w:w="558" w:type="dxa"/>
             <w:tcBorders/>
             <w:shd w:color="auto" w:fill="70AD47" w:val="clear"/>
           </w:tcPr>
@@ -9496,6 +9645,7 @@
             <w:pPr>
               <w:pStyle w:val="Normal"/>
               <w:widowControl/>
+              <w:suppressAutoHyphens w:val="true"/>
               <w:spacing w:lineRule="auto" w:line="240" w:before="0" w:after="0"/>
               <w:jc w:val="center"/>
               <w:rPr>
@@ -9529,6 +9679,7 @@
             <w:pPr>
               <w:pStyle w:val="Normal"/>
               <w:widowControl/>
+              <w:suppressAutoHyphens w:val="true"/>
               <w:spacing w:lineRule="auto" w:line="240" w:before="0" w:after="0"/>
               <w:jc w:val="center"/>
               <w:rPr>
@@ -9558,6 +9709,7 @@
             <w:pPr>
               <w:pStyle w:val="Normal"/>
               <w:widowControl/>
+              <w:suppressAutoHyphens w:val="true"/>
               <w:spacing w:lineRule="auto" w:line="240" w:before="0" w:after="0"/>
               <w:jc w:val="center"/>
               <w:rPr>
@@ -9584,7 +9736,7 @@
         </w:trPr>
         <w:tc>
           <w:tcPr>
-            <w:tcW w:w="2682" w:type="dxa"/>
+            <w:tcW w:w="2681" w:type="dxa"/>
             <w:tcBorders/>
             <w:shd w:color="auto" w:fill="D9E1F2" w:val="clear"/>
           </w:tcPr>
@@ -9592,6 +9744,7 @@
             <w:pPr>
               <w:pStyle w:val="Normal"/>
               <w:widowControl/>
+              <w:suppressAutoHyphens w:val="true"/>
               <w:spacing w:lineRule="auto" w:line="240" w:before="0" w:after="0"/>
               <w:jc w:val="start"/>
               <w:rPr>
@@ -9617,7 +9770,7 @@
         </w:tc>
         <w:tc>
           <w:tcPr>
-            <w:tcW w:w="557" w:type="dxa"/>
+            <w:tcW w:w="558" w:type="dxa"/>
             <w:tcBorders/>
             <w:shd w:color="auto" w:fill="D9E1F2" w:val="clear"/>
           </w:tcPr>
@@ -9625,6 +9778,7 @@
             <w:pPr>
               <w:pStyle w:val="Normal"/>
               <w:widowControl/>
+              <w:suppressAutoHyphens w:val="true"/>
               <w:spacing w:lineRule="auto" w:line="240" w:before="0" w:after="0"/>
               <w:jc w:val="center"/>
               <w:rPr>
@@ -9654,6 +9808,7 @@
             <w:pPr>
               <w:pStyle w:val="Normal"/>
               <w:widowControl/>
+              <w:suppressAutoHyphens w:val="true"/>
               <w:spacing w:lineRule="auto" w:line="240" w:before="0" w:after="0"/>
               <w:jc w:val="center"/>
               <w:rPr>
@@ -9675,7 +9830,7 @@
         </w:tc>
         <w:tc>
           <w:tcPr>
-            <w:tcW w:w="555" w:type="dxa"/>
+            <w:tcW w:w="554" w:type="dxa"/>
             <w:tcBorders/>
             <w:shd w:color="auto" w:fill="D9E1F2" w:val="clear"/>
           </w:tcPr>
@@ -9683,6 +9838,7 @@
             <w:pPr>
               <w:pStyle w:val="Normal"/>
               <w:widowControl/>
+              <w:suppressAutoHyphens w:val="true"/>
               <w:spacing w:lineRule="auto" w:line="240" w:before="0" w:after="0"/>
               <w:jc w:val="center"/>
               <w:rPr>
@@ -9704,7 +9860,7 @@
         </w:tc>
         <w:tc>
           <w:tcPr>
-            <w:tcW w:w="556" w:type="dxa"/>
+            <w:tcW w:w="557" w:type="dxa"/>
             <w:tcBorders/>
             <w:shd w:color="auto" w:fill="D9E1F2" w:val="clear"/>
           </w:tcPr>
@@ -9712,6 +9868,7 @@
             <w:pPr>
               <w:pStyle w:val="Normal"/>
               <w:widowControl/>
+              <w:suppressAutoHyphens w:val="true"/>
               <w:spacing w:lineRule="auto" w:line="240" w:before="0" w:after="0"/>
               <w:jc w:val="center"/>
               <w:rPr>
@@ -9741,6 +9898,7 @@
             <w:pPr>
               <w:pStyle w:val="Normal"/>
               <w:widowControl/>
+              <w:suppressAutoHyphens w:val="true"/>
               <w:spacing w:lineRule="auto" w:line="240" w:before="0" w:after="0"/>
               <w:jc w:val="center"/>
               <w:rPr>
@@ -9770,6 +9928,7 @@
             <w:pPr>
               <w:pStyle w:val="Normal"/>
               <w:widowControl/>
+              <w:suppressAutoHyphens w:val="true"/>
               <w:spacing w:lineRule="auto" w:line="240" w:before="0" w:after="0"/>
               <w:jc w:val="center"/>
               <w:rPr>
@@ -9791,7 +9950,7 @@
         </w:tc>
         <w:tc>
           <w:tcPr>
-            <w:tcW w:w="555" w:type="dxa"/>
+            <w:tcW w:w="554" w:type="dxa"/>
             <w:tcBorders/>
             <w:shd w:color="auto" w:fill="D9E1F2" w:val="clear"/>
           </w:tcPr>
@@ -9799,6 +9958,7 @@
             <w:pPr>
               <w:pStyle w:val="Normal"/>
               <w:widowControl/>
+              <w:suppressAutoHyphens w:val="true"/>
               <w:spacing w:lineRule="auto" w:line="240" w:before="0" w:after="0"/>
               <w:jc w:val="center"/>
               <w:rPr>
@@ -9820,7 +9980,7 @@
         </w:tc>
         <w:tc>
           <w:tcPr>
-            <w:tcW w:w="557" w:type="dxa"/>
+            <w:tcW w:w="558" w:type="dxa"/>
             <w:tcBorders/>
             <w:shd w:color="auto" w:fill="D9E1F2" w:val="clear"/>
           </w:tcPr>
@@ -9828,6 +9988,7 @@
             <w:pPr>
               <w:pStyle w:val="Normal"/>
               <w:widowControl/>
+              <w:suppressAutoHyphens w:val="true"/>
               <w:spacing w:lineRule="auto" w:line="240" w:before="0" w:after="0"/>
               <w:jc w:val="center"/>
               <w:rPr>
@@ -9857,6 +10018,7 @@
             <w:pPr>
               <w:pStyle w:val="Normal"/>
               <w:widowControl/>
+              <w:suppressAutoHyphens w:val="true"/>
               <w:spacing w:lineRule="auto" w:line="240" w:before="0" w:after="0"/>
               <w:jc w:val="center"/>
               <w:rPr>
@@ -9890,6 +10052,7 @@
             <w:pPr>
               <w:pStyle w:val="Normal"/>
               <w:widowControl/>
+              <w:suppressAutoHyphens w:val="true"/>
               <w:spacing w:lineRule="auto" w:line="240" w:before="0" w:after="0"/>
               <w:jc w:val="center"/>
               <w:rPr>
@@ -9916,7 +10079,7 @@
         </w:trPr>
         <w:tc>
           <w:tcPr>
-            <w:tcW w:w="2682" w:type="dxa"/>
+            <w:tcW w:w="2681" w:type="dxa"/>
             <w:tcBorders/>
             <w:shd w:color="auto" w:fill="FFFFFF" w:val="clear"/>
           </w:tcPr>
@@ -9924,6 +10087,7 @@
             <w:pPr>
               <w:pStyle w:val="Normal"/>
               <w:widowControl/>
+              <w:suppressAutoHyphens w:val="true"/>
               <w:spacing w:lineRule="auto" w:line="240" w:before="0" w:after="0"/>
               <w:jc w:val="start"/>
               <w:rPr>
@@ -9949,7 +10113,7 @@
         </w:tc>
         <w:tc>
           <w:tcPr>
-            <w:tcW w:w="557" w:type="dxa"/>
+            <w:tcW w:w="558" w:type="dxa"/>
             <w:tcBorders/>
             <w:shd w:color="auto" w:fill="FFFFFF" w:val="clear"/>
           </w:tcPr>
@@ -9957,6 +10121,7 @@
             <w:pPr>
               <w:pStyle w:val="Normal"/>
               <w:widowControl/>
+              <w:suppressAutoHyphens w:val="true"/>
               <w:spacing w:lineRule="auto" w:line="240" w:before="0" w:after="0"/>
               <w:jc w:val="center"/>
               <w:rPr>
@@ -9986,6 +10151,7 @@
             <w:pPr>
               <w:pStyle w:val="Normal"/>
               <w:widowControl/>
+              <w:suppressAutoHyphens w:val="true"/>
               <w:spacing w:lineRule="auto" w:line="240" w:before="0" w:after="0"/>
               <w:jc w:val="center"/>
               <w:rPr>
@@ -10007,7 +10173,7 @@
         </w:tc>
         <w:tc>
           <w:tcPr>
-            <w:tcW w:w="555" w:type="dxa"/>
+            <w:tcW w:w="554" w:type="dxa"/>
             <w:tcBorders/>
             <w:shd w:color="auto" w:fill="FFFFFF" w:val="clear"/>
           </w:tcPr>
@@ -10015,6 +10181,7 @@
             <w:pPr>
               <w:pStyle w:val="Normal"/>
               <w:widowControl/>
+              <w:suppressAutoHyphens w:val="true"/>
               <w:spacing w:lineRule="auto" w:line="240" w:before="0" w:after="0"/>
               <w:jc w:val="center"/>
               <w:rPr>
@@ -10036,7 +10203,7 @@
         </w:tc>
         <w:tc>
           <w:tcPr>
-            <w:tcW w:w="556" w:type="dxa"/>
+            <w:tcW w:w="557" w:type="dxa"/>
             <w:tcBorders/>
             <w:shd w:color="auto" w:fill="FFFFFF" w:val="clear"/>
           </w:tcPr>
@@ -10044,6 +10211,7 @@
             <w:pPr>
               <w:pStyle w:val="Normal"/>
               <w:widowControl/>
+              <w:suppressAutoHyphens w:val="true"/>
               <w:spacing w:lineRule="auto" w:line="240" w:before="0" w:after="0"/>
               <w:jc w:val="center"/>
               <w:rPr>
@@ -10073,6 +10241,7 @@
             <w:pPr>
               <w:pStyle w:val="Normal"/>
               <w:widowControl/>
+              <w:suppressAutoHyphens w:val="true"/>
               <w:spacing w:lineRule="auto" w:line="240" w:before="0" w:after="0"/>
               <w:jc w:val="center"/>
               <w:rPr>
@@ -10102,6 +10271,7 @@
             <w:pPr>
               <w:pStyle w:val="Normal"/>
               <w:widowControl/>
+              <w:suppressAutoHyphens w:val="true"/>
               <w:spacing w:lineRule="auto" w:line="240" w:before="0" w:after="0"/>
               <w:jc w:val="center"/>
               <w:rPr>
@@ -10123,7 +10293,7 @@
         </w:tc>
         <w:tc>
           <w:tcPr>
-            <w:tcW w:w="555" w:type="dxa"/>
+            <w:tcW w:w="554" w:type="dxa"/>
             <w:tcBorders/>
             <w:shd w:color="auto" w:fill="FFFFFF" w:val="clear"/>
           </w:tcPr>
@@ -10131,6 +10301,7 @@
             <w:pPr>
               <w:pStyle w:val="Normal"/>
               <w:widowControl/>
+              <w:suppressAutoHyphens w:val="true"/>
               <w:spacing w:lineRule="auto" w:line="240" w:before="0" w:after="0"/>
               <w:jc w:val="center"/>
               <w:rPr>
@@ -10152,7 +10323,7 @@
         </w:tc>
         <w:tc>
           <w:tcPr>
-            <w:tcW w:w="557" w:type="dxa"/>
+            <w:tcW w:w="558" w:type="dxa"/>
             <w:tcBorders/>
             <w:shd w:color="auto" w:fill="FFFFFF" w:val="clear"/>
           </w:tcPr>
@@ -10160,6 +10331,7 @@
             <w:pPr>
               <w:pStyle w:val="Normal"/>
               <w:widowControl/>
+              <w:suppressAutoHyphens w:val="true"/>
               <w:spacing w:lineRule="auto" w:line="240" w:before="0" w:after="0"/>
               <w:jc w:val="center"/>
               <w:rPr>
@@ -10189,6 +10361,7 @@
             <w:pPr>
               <w:pStyle w:val="Normal"/>
               <w:widowControl/>
+              <w:suppressAutoHyphens w:val="true"/>
               <w:spacing w:lineRule="auto" w:line="240" w:before="0" w:after="0"/>
               <w:jc w:val="center"/>
               <w:rPr>
@@ -10218,6 +10391,7 @@
             <w:pPr>
               <w:pStyle w:val="Normal"/>
               <w:widowControl/>
+              <w:suppressAutoHyphens w:val="true"/>
               <w:spacing w:lineRule="auto" w:line="240" w:before="0" w:after="0"/>
               <w:jc w:val="center"/>
               <w:rPr>
@@ -10248,7 +10422,7 @@
         </w:trPr>
         <w:tc>
           <w:tcPr>
-            <w:tcW w:w="2682" w:type="dxa"/>
+            <w:tcW w:w="2681" w:type="dxa"/>
             <w:tcBorders/>
             <w:shd w:color="auto" w:fill="D9E1F2" w:val="clear"/>
           </w:tcPr>
@@ -10256,6 +10430,7 @@
             <w:pPr>
               <w:pStyle w:val="Normal"/>
               <w:widowControl/>
+              <w:suppressAutoHyphens w:val="true"/>
               <w:spacing w:lineRule="auto" w:line="240" w:before="0" w:after="0"/>
               <w:jc w:val="start"/>
               <w:rPr>
@@ -10281,7 +10456,7 @@
         </w:tc>
         <w:tc>
           <w:tcPr>
-            <w:tcW w:w="557" w:type="dxa"/>
+            <w:tcW w:w="558" w:type="dxa"/>
             <w:tcBorders/>
             <w:shd w:color="auto" w:fill="D9E1F2" w:val="clear"/>
           </w:tcPr>
@@ -10289,6 +10464,7 @@
             <w:pPr>
               <w:pStyle w:val="Normal"/>
               <w:widowControl/>
+              <w:suppressAutoHyphens w:val="true"/>
               <w:spacing w:lineRule="auto" w:line="240" w:before="0" w:after="0"/>
               <w:jc w:val="center"/>
               <w:rPr>
@@ -10318,6 +10494,7 @@
             <w:pPr>
               <w:pStyle w:val="Normal"/>
               <w:widowControl/>
+              <w:suppressAutoHyphens w:val="true"/>
               <w:spacing w:lineRule="auto" w:line="240" w:before="0" w:after="0"/>
               <w:jc w:val="center"/>
               <w:rPr>
@@ -10339,7 +10516,7 @@
         </w:tc>
         <w:tc>
           <w:tcPr>
-            <w:tcW w:w="555" w:type="dxa"/>
+            <w:tcW w:w="554" w:type="dxa"/>
             <w:tcBorders/>
             <w:shd w:color="auto" w:fill="D9E1F2" w:val="clear"/>
           </w:tcPr>
@@ -10347,6 +10524,7 @@
             <w:pPr>
               <w:pStyle w:val="Normal"/>
               <w:widowControl/>
+              <w:suppressAutoHyphens w:val="true"/>
               <w:spacing w:lineRule="auto" w:line="240" w:before="0" w:after="0"/>
               <w:jc w:val="center"/>
               <w:rPr>
@@ -10368,7 +10546,7 @@
         </w:tc>
         <w:tc>
           <w:tcPr>
-            <w:tcW w:w="556" w:type="dxa"/>
+            <w:tcW w:w="557" w:type="dxa"/>
             <w:tcBorders/>
             <w:shd w:color="auto" w:fill="70AD47" w:val="clear"/>
           </w:tcPr>
@@ -10376,6 +10554,7 @@
             <w:pPr>
               <w:pStyle w:val="Normal"/>
               <w:widowControl/>
+              <w:suppressAutoHyphens w:val="true"/>
               <w:spacing w:lineRule="auto" w:line="240" w:before="0" w:after="0"/>
               <w:jc w:val="center"/>
               <w:rPr>
@@ -10409,6 +10588,7 @@
             <w:pPr>
               <w:pStyle w:val="Normal"/>
               <w:widowControl/>
+              <w:suppressAutoHyphens w:val="true"/>
               <w:spacing w:lineRule="auto" w:line="240" w:before="0" w:after="0"/>
               <w:jc w:val="center"/>
               <w:rPr>
@@ -10442,6 +10622,7 @@
             <w:pPr>
               <w:pStyle w:val="Normal"/>
               <w:widowControl/>
+              <w:suppressAutoHyphens w:val="true"/>
               <w:spacing w:lineRule="auto" w:line="240" w:before="0" w:after="0"/>
               <w:jc w:val="center"/>
               <w:rPr>
@@ -10467,7 +10648,7 @@
         </w:tc>
         <w:tc>
           <w:tcPr>
-            <w:tcW w:w="555" w:type="dxa"/>
+            <w:tcW w:w="554" w:type="dxa"/>
             <w:tcBorders/>
             <w:shd w:color="auto" w:fill="70AD47" w:val="clear"/>
           </w:tcPr>
@@ -10475,6 +10656,7 @@
             <w:pPr>
               <w:pStyle w:val="Normal"/>
               <w:widowControl/>
+              <w:suppressAutoHyphens w:val="true"/>
               <w:spacing w:lineRule="auto" w:line="240" w:before="0" w:after="0"/>
               <w:jc w:val="center"/>
               <w:rPr>
@@ -10500,7 +10682,7 @@
         </w:tc>
         <w:tc>
           <w:tcPr>
-            <w:tcW w:w="557" w:type="dxa"/>
+            <w:tcW w:w="558" w:type="dxa"/>
             <w:tcBorders/>
             <w:shd w:color="auto" w:fill="70AD47" w:val="clear"/>
           </w:tcPr>
@@ -10508,6 +10690,7 @@
             <w:pPr>
               <w:pStyle w:val="Normal"/>
               <w:widowControl/>
+              <w:suppressAutoHyphens w:val="true"/>
               <w:spacing w:lineRule="auto" w:line="240" w:before="0" w:after="0"/>
               <w:jc w:val="center"/>
               <w:rPr>
@@ -10541,6 +10724,7 @@
             <w:pPr>
               <w:pStyle w:val="Normal"/>
               <w:widowControl/>
+              <w:suppressAutoHyphens w:val="true"/>
               <w:spacing w:lineRule="auto" w:line="240" w:before="0" w:after="0"/>
               <w:jc w:val="center"/>
               <w:rPr>
@@ -10574,6 +10758,7 @@
             <w:pPr>
               <w:pStyle w:val="Normal"/>
               <w:widowControl/>
+              <w:suppressAutoHyphens w:val="true"/>
               <w:spacing w:lineRule="auto" w:line="240" w:before="0" w:after="0"/>
               <w:jc w:val="center"/>
               <w:rPr>
@@ -10684,72 +10869,9 @@
           <w:b/>
           <w:sz w:val="24"/>
         </w:rPr>
-        <w:t>Control Administrativo</w:t>
+        <w:t>Conceptos disciplinares</w:t>
       </w:r>
       <w:bookmarkEnd w:id="37"/>
-    </w:p>
-    <w:p>
-      <w:pPr>
-        <w:pStyle w:val="Normal"/>
-        <w:spacing w:lineRule="auto" w:line="360" w:before="0" w:after="0"/>
-        <w:ind w:firstLine="709"/>
-        <w:jc w:val="both"/>
-        <w:rPr/>
-      </w:pPr>
-      <w:r>
-        <w:rPr>
-          <w:i w:val="false"/>
-          <w:sz w:val="24"/>
-        </w:rPr>
-        <w:t>El control administrativo constituye una de las funciones fundamentales del proceso administrativo y se define como el mecanismo mediante el cual la organización verifica que las actividades ejecutadas se correspondan con lo planificado, detectando desviaciones y aplicando las medidas correctivas necesarias. Robbins y Coulter (2010) señalan que el control eficaz no solo identifica fallas, sino que proporciona información oportuna para la toma de decisiones gerenciales, convirtiéndose en un instrumento de mejora continua y no únicamente de fiscalización.</w:t>
-      </w:r>
-    </w:p>
-    <w:p>
-      <w:pPr>
-        <w:pStyle w:val="Normal"/>
-        <w:spacing w:lineRule="auto" w:line="360" w:before="0" w:after="0"/>
-        <w:ind w:firstLine="709"/>
-        <w:jc w:val="both"/>
-        <w:rPr/>
-      </w:pPr>
-      <w:r>
-        <w:rPr>
-          <w:i w:val="false"/>
-          <w:sz w:val="24"/>
-        </w:rPr>
-        <w:t>En el contexto del Departamento de Administración de Ingeniería de Telecomunicaciones, C.A., el control administrativo se aplica sobre el ciclo de gestión de solicitudes de servicio, abarcando desde la recepción de la solicitud del suscriptor hasta el cierre definitivo del caso. La ausencia de mecanismos formales de control en este ciclo genera inconsistencias entre los departamentos involucrados y dificulta la evaluación del desempeño del proceso de atención.</w:t>
-      </w:r>
-    </w:p>
-    <w:p>
-      <w:pPr>
-        <w:pStyle w:val="Normal"/>
-        <w:spacing w:lineRule="auto" w:line="240" w:before="720" w:after="240"/>
-        <w:ind w:start="709" w:end="709"/>
-        <w:jc w:val="both"/>
-        <w:rPr/>
-      </w:pPr>
-      <w:r>
-        <w:rPr>
-          <w:sz w:val="24"/>
-        </w:rPr>
-        <w:t>El control es el proceso de monitorear las actividades para asegurarse de que se lleven a cabo según lo planeado y para corregir cualquier desviación significativa. Los gerentes no pueden saber realmente si sus unidades están desempeñándose adecuadamente hasta que evalúan qué actividades se han llevado a cabo y comparan el desempeño real con el estándar deseado. (Robbins y Coulter, 2010, p. 398)</w:t>
-      </w:r>
-    </w:p>
-    <w:p>
-      <w:pPr>
-        <w:pStyle w:val="Normal"/>
-        <w:spacing w:lineRule="auto" w:line="360" w:before="0" w:after="0"/>
-        <w:ind w:firstLine="709"/>
-        <w:jc w:val="both"/>
-        <w:rPr/>
-      </w:pPr>
-      <w:r>
-        <w:rPr>
-          <w:i w:val="false"/>
-          <w:sz w:val="24"/>
-        </w:rPr>
-        <w:t>Desde la perspectiva de quien desarrolla este informe, el control administrativo en IDETEL debe convertirse en una herramienta de seguimiento continuo y no limitarse a la revisión posterior de los casos.</w:t>
-      </w:r>
     </w:p>
     <w:p>
       <w:pPr>
@@ -10765,7 +10887,7 @@
           <w:b/>
           <w:sz w:val="24"/>
         </w:rPr>
-        <w:t>Gestión de Solicitudes de Servicio</w:t>
+        <w:t>Control Administrativo</w:t>
       </w:r>
     </w:p>
     <w:p>
@@ -10781,7 +10903,7 @@
           <w:i w:val="false"/>
           <w:sz w:val="24"/>
         </w:rPr>
-        <w:t>La gestión de solicitudes de servicio comprende el conjunto de procedimientos administrativos orientados a recepcionar, registrar, procesar y dar seguimiento a los requerimientos presentados por los clientes o suscriptores de una organización. Zeithaml, Parasuraman y Berry (1993) establecen que la calidad del servicio percibida por el cliente está directamente vinculada a la capacidad de la organización para gestionar sus solicitudes de forma ágil, transparente y con comunicación fluida en cada etapa del proceso.</w:t>
+        <w:t>El control administrativo constituye una de las funciones fundamentales del proceso administrativo y se define como el mecanismo mediante el cual la organización verifica que las actividades ejecutadas se correspondan con lo planificado, detectando desviaciones y aplicando las medidas correctivas necesarias. Robbins y Coulter (2010) señalan que el control eficaz no solo identifica fallas, sino que proporciona información oportuna para la toma de decisiones gerenciales, convirtiéndose en un instrumento de mejora continua y no únicamente de fiscalización.</w:t>
       </w:r>
     </w:p>
     <w:p>
@@ -10797,7 +10919,22 @@
           <w:i w:val="false"/>
           <w:sz w:val="24"/>
         </w:rPr>
-        <w:t>En empresas de telecomunicaciones como IDETEL, la gestión de solicitudes abarca dos categorías principales: las solicitudes de afiliación de nuevos suscriptores, que implican la coordinación entre las áreas comercial, técnica y administrativa; y las incidencias reportadas por suscriptores activos, que requieren diagnóstico, despacho de cuadrillas y cierre verificado del caso. La ausencia de un sistema unificado de seguimiento para ambas categorías genera retrasos y reprocesos que impactan directamente en la satisfacción del cliente.</w:t>
+        <w:t>En el contexto del Departamento de Administración de Ingeniería de Telecomunicaciones, C.A., el control administrativo se aplica sobre el ciclo de gestión de solicitudes de servicio, abarcando desde la recepción de la solicitud del suscriptor hasta el cierre definitivo del caso. La ausencia de mecanismos formales de control en este ciclo genera inconsistencias entre los departamentos involucrados y dificulta la evaluación del desempeño del proceso de atención.</w:t>
+      </w:r>
+    </w:p>
+    <w:p>
+      <w:pPr>
+        <w:pStyle w:val="Normal"/>
+        <w:spacing w:lineRule="auto" w:line="240" w:before="720" w:after="240"/>
+        <w:ind w:start="709" w:end="709"/>
+        <w:jc w:val="both"/>
+        <w:rPr/>
+      </w:pPr>
+      <w:r>
+        <w:rPr>
+          <w:sz w:val="24"/>
+        </w:rPr>
+        <w:t>El control es el proceso de monitorear las actividades para asegurarse de que se lleven a cabo según lo planeado y para corregir cualquier desviación significativa. Los gerentes no pueden saber realmente si sus unidades están desempeñándose adecuadamente hasta que evalúan qué actividades se han llevado a cabo y comparan el desempeño real con el estándar deseado. (Robbins y Coulter, 2010, p. 398)</w:t>
       </w:r>
     </w:p>
     <w:p>
@@ -10813,7 +10950,7 @@
           <w:i w:val="false"/>
           <w:sz w:val="24"/>
         </w:rPr>
-        <w:t>En el contexto de IDETEL, la gestión de solicitudes requiere un flujo único que permita conocer el responsable, el estado y el tiempo de atención de cada caso.</w:t>
+        <w:t>Desde la perspectiva de quien desarrolla este informe, el control administrativo en IDETEL debe convertirse en una herramienta de seguimiento continuo y no limitarse a la revisión posterior de los casos.</w:t>
       </w:r>
     </w:p>
     <w:p>
@@ -10830,7 +10967,7 @@
           <w:b/>
           <w:sz w:val="24"/>
         </w:rPr>
-        <w:t>Procesos Administrativos y Estandarización de Procedimientos</w:t>
+        <w:t>Gestión de Solicitudes de Servicio</w:t>
       </w:r>
     </w:p>
     <w:p>
@@ -10846,7 +10983,7 @@
           <w:i w:val="false"/>
           <w:sz w:val="24"/>
         </w:rPr>
-        <w:t>El proceso administrativo constituye el marco conceptual que rige el funcionamiento de las organizaciones modernas. Chiavenato (2006) lo describe como el conjunto secuencial e interrelacionado de funciones de planificación, organización, dirección y control, orientadas al logro eficiente de los objetivos organizacionales. La estandarización de los procedimientos dentro de este marco garantiza que las actividades se ejecuten de manera uniforme, reduciendo la variabilidad y los errores derivados de la discrecionalidad individual.</w:t>
+        <w:t>La gestión de solicitudes de servicio comprende el conjunto de procedimientos administrativos orientados a recepcionar, registrar, procesar y dar seguimiento a los requerimientos presentados por los clientes o suscriptores de una organización. Zeithaml, Parasuraman y Berry (1993) establecen que la calidad del servicio percibida por el cliente está directamente vinculada a la capacidad de la organización para gestionar sus solicitudes de forma ágil, transparente y con comunicación fluida en cada etapa del proceso.</w:t>
       </w:r>
     </w:p>
     <w:p>
@@ -10862,7 +10999,7 @@
           <w:i w:val="false"/>
           <w:sz w:val="24"/>
         </w:rPr>
-        <w:t>La formalización de los procedimientos mediante manuales, flujogramas y formatos estandarizados constituye una herramienta esencial para el control administrativo. Según Harrington (1993), un proceso estandarizado es medible, controlable y mejorable, condiciones que permiten a la organización identificar con precisión los puntos de falla y aplicar acciones correctivas focalizadas. En el caso de IDETEL, la ausencia de procedimientos escritos para la gestión de solicitudes es una de las causas raíz de las deficiencias identificadas.</w:t>
+        <w:t>En empresas de telecomunicaciones como IDETEL, la gestión de solicitudes abarca dos categorías principales: las solicitudes de afiliación de nuevos suscriptores, que implican la coordinación entre las áreas comercial, técnica y administrativa; y las incidencias reportadas por suscriptores activos, que requieren diagnóstico, despacho de cuadrillas y cierre verificado del caso. La ausencia de un sistema unificado de seguimiento para ambas categorías genera retrasos y reprocesos que impactan directamente en la satisfacción del cliente.</w:t>
       </w:r>
     </w:p>
     <w:p>
@@ -10878,7 +11015,7 @@
           <w:i w:val="false"/>
           <w:sz w:val="24"/>
         </w:rPr>
-        <w:t>A juicio de quien suscribe, la estandarización propuesta no busca aumentar la carga administrativa, sino eliminar ambigüedades y hacer verificable cada etapa del proceso.</w:t>
+        <w:t>En el contexto de IDETEL, la gestión de solicitudes requiere un flujo único que permita conocer el responsable, el estado y el tiempo de atención de cada caso.</w:t>
       </w:r>
     </w:p>
     <w:p>
@@ -10895,7 +11032,7 @@
           <w:b/>
           <w:sz w:val="24"/>
         </w:rPr>
-        <w:t>Calidad del Servicio en Empresas de Telecomunicaciones</w:t>
+        <w:t>Procesos Administrativos y Estandarización de Procedimientos</w:t>
       </w:r>
     </w:p>
     <w:p>
@@ -10911,7 +11048,7 @@
           <w:i w:val="false"/>
           <w:sz w:val="24"/>
         </w:rPr>
-        <w:t>La calidad del servicio se define como el grado en que las características del servicio prestado satisfacen o superan las expectativas del cliente. Parasuraman, Zeithaml y Berry (1988) desarrollaron el modelo SERVQUAL, que identifica cinco dimensiones de la calidad del servicio: fiabilidad, capacidad de respuesta, seguridad, empatía y elementos tangibles. En el sector de telecomunicaciones, la fiabilidad y la capacidad de respuesta son las dimensiones con mayor peso en la percepción del cliente.</w:t>
+        <w:t>El proceso administrativo constituye el marco conceptual que rige el funcionamiento de las organizaciones modernas. Chiavenato (2006) lo describe como el conjunto secuencial e interrelacionado de funciones de planificación, organización, dirección y control, orientadas al logro eficiente de los objetivos organizacionales. La estandarización de los procedimientos dentro de este marco garantiza que las actividades se ejecuten de manera uniforme, reduciendo la variabilidad y los errores derivados de la discrecionalidad individual.</w:t>
       </w:r>
     </w:p>
     <w:p>
@@ -10927,7 +11064,7 @@
           <w:i w:val="false"/>
           <w:sz w:val="24"/>
         </w:rPr>
-        <w:t>Las deficiencias en el control administrativo del proceso de solicitudes de servicio impactan directamente sobre la fiabilidad y la capacidad de respuesta de IDETEL. Cuando una solicitud no es gestionada dentro de los tiempos establecidos o su estatus no puede ser verificado en tiempo real, el cliente percibe una falla en la calidad del servicio que deteriora su confianza en la organización y puede derivar en la cancelación del contrato o en la difusión de experiencias negativas.</w:t>
+        <w:t>La formalización de los procedimientos mediante manuales, flujogramas y formatos estandarizados constituye una herramienta esencial para el control administrativo. Según Harrington (1993), un proceso estandarizado es medible, controlable y mejorable, condiciones que permiten a la organización identificar con precisión los puntos de falla y aplicar acciones correctivas focalizadas. En el caso de IDETEL, la ausencia de procedimientos escritos para la gestión de solicitudes es una de las causas raíz de las deficiencias identificadas.</w:t>
       </w:r>
     </w:p>
     <w:p>
@@ -10943,7 +11080,7 @@
           <w:i w:val="false"/>
           <w:sz w:val="24"/>
         </w:rPr>
-        <w:t>En el contexto de estas pasantías, la calidad del servicio se relaciona directamente con la capacidad administrativa de IDETEL para responder y dar seguimiento oportuno a las solicitudes del suscriptor.</w:t>
+        <w:t>A juicio de quien suscribe, la estandarización propuesta no busca aumentar la carga administrativa, sino eliminar ambigüedades y hacer verificable cada etapa del proceso.</w:t>
       </w:r>
     </w:p>
     <w:p>
@@ -10960,7 +11097,7 @@
           <w:b/>
           <w:sz w:val="24"/>
         </w:rPr>
-        <w:t>Sistemas de Información para el Control Administrativo</w:t>
+        <w:t>Calidad del Servicio en Empresas de Telecomunicaciones</w:t>
       </w:r>
     </w:p>
     <w:p>
@@ -10976,7 +11113,7 @@
           <w:i w:val="false"/>
           <w:sz w:val="24"/>
         </w:rPr>
-        <w:t>Un sistema de información constituye un conjunto organizado de recursos tecnológicos y procedimentales orientados a la captura, almacenamiento, procesamiento y distribución de datos con el propósito de apoyar la toma de decisiones. Laudon y Laudon (2016) distinguen los sistemas de procesamiento de transacciones como la categoría que registra y gestiona las operaciones rutinarias de la organización, siendo esta la tipología más pertinente para el control de solicitudes de servicio en una empresa de telecomunicaciones.</w:t>
+        <w:t>La calidad del servicio se define como el grado en que las características del servicio prestado satisfacen o superan las expectativas del cliente. Parasuraman, Zeithaml y Berry (1988) desarrollaron el modelo SERVQUAL, que identifica cinco dimensiones de la calidad del servicio: fiabilidad, capacidad de respuesta, seguridad, empatía y elementos tangibles. En el sector de telecomunicaciones, la fiabilidad y la capacidad de respuesta son las dimensiones con mayor peso en la percepción del cliente.</w:t>
       </w:r>
     </w:p>
     <w:p>
@@ -10992,7 +11129,7 @@
           <w:i w:val="false"/>
           <w:sz w:val="24"/>
         </w:rPr>
-        <w:t>La implementación de un sistema de tickets o plataforma de seguimiento de solicitudes en IDETEL permitiría centralizar el registro de cada caso, asignar responsables, definir tiempos de atención y generar alertas ante incumplimientos. Esta herramienta transformaría el control administrativo de reactivo a proactivo, dotando a la supervisión de información en tiempo real para la toma de decisiones y la evaluación continua del desempeño del proceso.</w:t>
+        <w:t>Las deficiencias en el control administrativo del proceso de solicitudes de servicio impactan directamente sobre la fiabilidad y la capacidad de respuesta de IDETEL. Cuando una solicitud no es gestionada dentro de los tiempos establecidos o su estatus no puede ser verificado en tiempo real, el cliente percibe una falla en la calidad del servicio que deteriora su confianza en la organización y puede derivar en la cancelación del contrato o en la difusión de experiencias negativas.</w:t>
       </w:r>
     </w:p>
     <w:p>
@@ -11008,7 +11145,7 @@
           <w:i w:val="false"/>
           <w:sz w:val="24"/>
         </w:rPr>
-        <w:t>Desde la posición del autor, una herramienta de seguimiento centralizada es viable para IDETEL porque permite mejorar la trazabilidad sin modificar la naturaleza de los servicios que presta la empresa.</w:t>
+        <w:t>En el contexto de estas pasantías, la calidad del servicio se relaciona directamente con la capacidad administrativa de IDETEL para responder y dar seguimiento oportuno a las solicitudes del suscriptor.</w:t>
       </w:r>
     </w:p>
     <w:p>
@@ -11016,7 +11153,7 @@
         <w:pStyle w:val="IUTECPTtulo2"/>
         <w:keepNext w:val="true"/>
         <w:keepLines/>
-        <w:spacing w:lineRule="auto" w:line="360" w:before="240" w:after="240"/>
+        <w:spacing w:lineRule="auto" w:line="360" w:before="480" w:after="480"/>
         <w:jc w:val="start"/>
         <w:rPr/>
       </w:pPr>
@@ -11025,7 +11162,7 @@
           <w:b/>
           <w:sz w:val="24"/>
         </w:rPr>
-        <w:t>Base Legal: Constitución de la República Bolivariana de Venezuela — Artículo 112</w:t>
+        <w:t>Sistemas de Información para el Control Administrativo</w:t>
       </w:r>
     </w:p>
     <w:p>
@@ -11041,7 +11178,339 @@
           <w:i w:val="false"/>
           <w:sz w:val="24"/>
         </w:rPr>
-        <w:t>Como marco general de la actividad económica privada, la Constitución reconoce la iniciativa empresarial dentro de los límites establecidos por el ordenamiento jurídico.</w:t>
+        <w:t>Un sistema de información constituye un conjunto organizado de recursos tecnológicos y procedimentales orientados a la captura, almacenamiento, procesamiento y distribución de datos con el propósito de apoyar la toma de decisiones. Laudon y Laudon (2016) distinguen los sistemas de procesamiento de transacciones como la categoría que registra y gestiona las operaciones rutinarias de la organización, siendo esta la tipología más pertinente para el control de solicitudes de servicio en una empresa de telecomunicaciones.</w:t>
+      </w:r>
+    </w:p>
+    <w:p>
+      <w:pPr>
+        <w:pStyle w:val="Normal"/>
+        <w:spacing w:lineRule="auto" w:line="360" w:before="0" w:after="0"/>
+        <w:ind w:firstLine="709"/>
+        <w:jc w:val="both"/>
+        <w:rPr/>
+      </w:pPr>
+      <w:r>
+        <w:rPr>
+          <w:i w:val="false"/>
+          <w:sz w:val="24"/>
+        </w:rPr>
+        <w:t>La implementación de un sistema de tickets o plataforma de seguimiento de solicitudes en IDETEL permitiría centralizar el registro de cada caso, asignar responsables, definir tiempos de atención y generar alertas ante incumplimientos. Esta herramienta transformaría el control administrativo de reactivo a proactivo, dotando a la supervisión de información en tiempo real para la toma de decisiones y la evaluación continua del desempeño del proceso.</w:t>
+      </w:r>
+    </w:p>
+    <w:p>
+      <w:pPr>
+        <w:pStyle w:val="Normal"/>
+        <w:spacing w:lineRule="auto" w:line="360" w:before="0" w:after="0"/>
+        <w:ind w:firstLine="709"/>
+        <w:jc w:val="both"/>
+        <w:rPr/>
+      </w:pPr>
+      <w:r>
+        <w:rPr>
+          <w:i w:val="false"/>
+          <w:sz w:val="24"/>
+        </w:rPr>
+        <w:t>Desde la posición del autor, una herramienta de seguimiento centralizada es viable para IDETEL porque permite mejorar la trazabilidad sin modificar la naturaleza de los servicios que presta la empresa.</w:t>
+      </w:r>
+    </w:p>
+    <w:p>
+      <w:pPr>
+        <w:pStyle w:val="IUTECPTtulo2"/>
+        <w:keepNext w:val="true"/>
+        <w:keepLines/>
+        <w:spacing w:lineRule="auto" w:line="360" w:before="480" w:after="480"/>
+        <w:jc w:val="start"/>
+        <w:rPr/>
+      </w:pPr>
+      <w:r>
+        <w:rPr>
+          <w:b/>
+          <w:sz w:val="24"/>
+        </w:rPr>
+        <w:t>Trazabilidad Administrativa de Solicitudes</w:t>
+      </w:r>
+    </w:p>
+    <w:p>
+      <w:pPr>
+        <w:pStyle w:val="Normal"/>
+        <w:spacing w:lineRule="auto" w:line="360" w:before="0" w:after="0"/>
+        <w:ind w:firstLine="709"/>
+        <w:jc w:val="both"/>
+        <w:rPr/>
+      </w:pPr>
+      <w:r>
+        <w:rPr>
+          <w:i w:val="false"/>
+          <w:sz w:val="24"/>
+        </w:rPr>
+        <w:t>La trazabilidad administrativa es la capacidad de reconstruir el recorrido de una solicitud mediante registros que permitan identificar su origen, las áreas que intervinieron, los cambios de estatus y el resultado alcanzado. Laudon y Laudon (2016) explican que la información organizada y disponible oportunamente permite controlar operaciones rutinarias y respaldar la toma de decisiones.</w:t>
+      </w:r>
+    </w:p>
+    <w:p>
+      <w:pPr>
+        <w:pStyle w:val="Normal"/>
+        <w:spacing w:lineRule="auto" w:line="360" w:before="0" w:after="0"/>
+        <w:ind w:firstLine="709"/>
+        <w:jc w:val="both"/>
+        <w:rPr/>
+      </w:pPr>
+      <w:r>
+        <w:rPr>
+          <w:i w:val="false"/>
+          <w:sz w:val="24"/>
+        </w:rPr>
+        <w:t>En la gestión de servicios, la trazabilidad requiere que cada afiliación o incidencia conserve una identificación uniforme durante su tránsito por Atención al Cliente, Administración y las áreas técnicas. Cuando cada unidad utiliza registros distintos o actualiza la información sin criterios comunes, se pierde continuidad y aumenta el tiempo necesario para determinar el estado real del caso.</w:t>
+      </w:r>
+    </w:p>
+    <w:p>
+      <w:pPr>
+        <w:pStyle w:val="Normal"/>
+        <w:spacing w:lineRule="auto" w:line="360" w:before="0" w:after="0"/>
+        <w:ind w:firstLine="709"/>
+        <w:jc w:val="both"/>
+        <w:rPr/>
+      </w:pPr>
+      <w:r>
+        <w:rPr>
+          <w:i w:val="false"/>
+          <w:sz w:val="24"/>
+        </w:rPr>
+        <w:t>La propuesta formulada en este informe fortalece la trazabilidad mediante formatos comunes, responsables por etapa y estados definidos. Estos elementos permiten verificar el avance de las solicitudes sin depender exclusivamente de consultas informales entre departamentos.</w:t>
+      </w:r>
+    </w:p>
+    <w:p>
+      <w:pPr>
+        <w:pStyle w:val="Normal"/>
+        <w:spacing w:lineRule="auto" w:line="360" w:before="0" w:after="0"/>
+        <w:ind w:firstLine="709"/>
+        <w:jc w:val="both"/>
+        <w:rPr/>
+      </w:pPr>
+      <w:r>
+        <w:rPr>
+          <w:i w:val="false"/>
+          <w:sz w:val="24"/>
+        </w:rPr>
+        <w:t>En IDETEL, la trazabilidad administrativa representa una condición necesaria para conocer la continuidad de cada solicitud y sustentar las decisiones relacionadas con su atención.</w:t>
+      </w:r>
+    </w:p>
+    <w:p>
+      <w:pPr>
+        <w:pStyle w:val="IUTECPTtulo2"/>
+        <w:keepNext w:val="true"/>
+        <w:keepLines/>
+        <w:spacing w:lineRule="auto" w:line="360" w:before="480" w:after="480"/>
+        <w:jc w:val="start"/>
+        <w:rPr/>
+      </w:pPr>
+      <w:r>
+        <w:rPr>
+          <w:b/>
+          <w:sz w:val="24"/>
+        </w:rPr>
+        <w:t>Comunicación Interdepartamental</w:t>
+      </w:r>
+    </w:p>
+    <w:p>
+      <w:pPr>
+        <w:pStyle w:val="Normal"/>
+        <w:spacing w:lineRule="auto" w:line="360" w:before="0" w:after="0"/>
+        <w:ind w:firstLine="709"/>
+        <w:jc w:val="both"/>
+        <w:rPr/>
+      </w:pPr>
+      <w:r>
+        <w:rPr>
+          <w:i w:val="false"/>
+          <w:sz w:val="24"/>
+        </w:rPr>
+        <w:t>La comunicación interdepartamental comprende el intercambio de información entre unidades que participan en un mismo proceso. En una empresa de telecomunicaciones, la atención de una solicitud puede requerir datos administrativos, comerciales y técnicos, por lo que la coordinación entre las áreas condiciona la oportunidad de la respuesta ofrecida al suscriptor.</w:t>
+      </w:r>
+    </w:p>
+    <w:p>
+      <w:pPr>
+        <w:pStyle w:val="Normal"/>
+        <w:spacing w:lineRule="auto" w:line="360" w:before="0" w:after="0"/>
+        <w:ind w:firstLine="709"/>
+        <w:jc w:val="both"/>
+        <w:rPr/>
+      </w:pPr>
+      <w:r>
+        <w:rPr>
+          <w:i w:val="false"/>
+          <w:sz w:val="24"/>
+        </w:rPr>
+        <w:t>Zeithaml, Parasuraman y Berry (1993) relacionan la calidad del servicio con la capacidad organizacional para responder de forma consistente y mantener comunicación con el usuario. Esta capacidad también depende de que las áreas internas reciban información completa, conozcan sus responsabilidades y comuniquen oportunamente el resultado de cada actividad.</w:t>
+      </w:r>
+    </w:p>
+    <w:p>
+      <w:pPr>
+        <w:pStyle w:val="Normal"/>
+        <w:spacing w:lineRule="auto" w:line="360" w:before="0" w:after="0"/>
+        <w:ind w:firstLine="709"/>
+        <w:jc w:val="both"/>
+        <w:rPr/>
+      </w:pPr>
+      <w:r>
+        <w:rPr>
+          <w:i w:val="false"/>
+          <w:sz w:val="24"/>
+        </w:rPr>
+        <w:t>El flujo propuesto para IDETEL define puntos de transferencia y responsables, con la finalidad de reducir mensajes dispersos y evitar que una solicitud permanezca sin seguimiento al pasar de una unidad a otra.</w:t>
+      </w:r>
+    </w:p>
+    <w:p>
+      <w:pPr>
+        <w:pStyle w:val="Normal"/>
+        <w:spacing w:lineRule="auto" w:line="360" w:before="0" w:after="0"/>
+        <w:ind w:firstLine="709"/>
+        <w:jc w:val="both"/>
+        <w:rPr/>
+      </w:pPr>
+      <w:r>
+        <w:rPr>
+          <w:i w:val="false"/>
+          <w:sz w:val="24"/>
+        </w:rPr>
+        <w:t>La comunicación interdepartamental debe funcionar como parte del procedimiento y dejar evidencia suficiente para que la continuidad de una solicitud no dependa de la memoria del personal.</w:t>
+      </w:r>
+    </w:p>
+    <w:p>
+      <w:pPr>
+        <w:pStyle w:val="IUTECPTtulo2"/>
+        <w:keepNext w:val="true"/>
+        <w:keepLines/>
+        <w:spacing w:lineRule="auto" w:line="360" w:before="480" w:after="480"/>
+        <w:jc w:val="start"/>
+        <w:rPr/>
+      </w:pPr>
+      <w:r>
+        <w:rPr>
+          <w:b/>
+          <w:sz w:val="24"/>
+        </w:rPr>
+        <w:t>Indicadores de Gestión y Tiempos de Respuesta</w:t>
+      </w:r>
+    </w:p>
+    <w:p>
+      <w:pPr>
+        <w:pStyle w:val="Normal"/>
+        <w:spacing w:lineRule="auto" w:line="360" w:before="0" w:after="0"/>
+        <w:ind w:firstLine="709"/>
+        <w:jc w:val="both"/>
+        <w:rPr/>
+      </w:pPr>
+      <w:r>
+        <w:rPr>
+          <w:i w:val="false"/>
+          <w:sz w:val="24"/>
+        </w:rPr>
+        <w:t>Los indicadores de gestión permiten comparar el desempeño real de un proceso con criterios previamente establecidos. Robbins y Coulter (2010) señalan que el control requiere medir las actividades, contrastar los resultados con lo planificado e intervenir cuando se presentan desviaciones significativas.</w:t>
+      </w:r>
+    </w:p>
+    <w:p>
+      <w:pPr>
+        <w:pStyle w:val="Normal"/>
+        <w:spacing w:lineRule="auto" w:line="360" w:before="0" w:after="0"/>
+        <w:ind w:firstLine="709"/>
+        <w:jc w:val="both"/>
+        <w:rPr/>
+      </w:pPr>
+      <w:r>
+        <w:rPr>
+          <w:i w:val="false"/>
+          <w:sz w:val="24"/>
+        </w:rPr>
+        <w:t>En la gestión de solicitudes pueden utilizarse medidas como tiempo promedio de atención, cantidad de casos pendientes, porcentaje de solicitudes cerradas dentro del plazo y número de devoluciones por información incompleta. Estos datos deben construirse a partir de registros uniformes para que sus resultados sean comparables y útiles.</w:t>
+      </w:r>
+    </w:p>
+    <w:p>
+      <w:pPr>
+        <w:pStyle w:val="Normal"/>
+        <w:spacing w:lineRule="auto" w:line="360" w:before="0" w:after="0"/>
+        <w:ind w:firstLine="709"/>
+        <w:jc w:val="both"/>
+        <w:rPr/>
+      </w:pPr>
+      <w:r>
+        <w:rPr>
+          <w:i w:val="false"/>
+          <w:sz w:val="24"/>
+        </w:rPr>
+        <w:t>La definición de tiempos de referencia e indicadores básicos permite que IDETEL evalúe periódicamente el funcionamiento del flujo estandarizado. De esta forma, la propuesta no se limita a documentar actividades, sino que incorpora criterios para detectar retrasos y orientar acciones correctivas.</w:t>
+      </w:r>
+    </w:p>
+    <w:p>
+      <w:pPr>
+        <w:pStyle w:val="Normal"/>
+        <w:spacing w:lineRule="auto" w:line="360" w:before="0" w:after="0"/>
+        <w:ind w:firstLine="709"/>
+        <w:jc w:val="both"/>
+        <w:rPr/>
+      </w:pPr>
+      <w:r>
+        <w:rPr>
+          <w:i w:val="false"/>
+          <w:sz w:val="24"/>
+        </w:rPr>
+        <w:t>Para este informe, los indicadores constituyen un apoyo práctico para comprobar si las mejoras propuestas reducen demoras y facilitan el cierre oportuno de las solicitudes.</w:t>
+      </w:r>
+    </w:p>
+    <w:p>
+      <w:pPr>
+        <w:pStyle w:val="IUTECPTtulo2"/>
+        <w:keepNext w:val="true"/>
+        <w:keepLines/>
+        <w:spacing w:lineRule="auto" w:line="360" w:before="480" w:after="480"/>
+        <w:jc w:val="start"/>
+        <w:rPr/>
+      </w:pPr>
+      <w:bookmarkStart w:id="38" w:name="bm_cap3_legales"/>
+      <w:r>
+        <w:rPr>
+          <w:b/>
+          <w:sz w:val="24"/>
+        </w:rPr>
+        <w:t>Bases legales</w:t>
+      </w:r>
+      <w:bookmarkEnd w:id="38"/>
+    </w:p>
+    <w:p>
+      <w:pPr>
+        <w:pStyle w:val="IUTECPTtulo3"/>
+        <w:keepNext w:val="true"/>
+        <w:keepLines/>
+        <w:spacing w:lineRule="auto" w:line="360" w:before="240" w:after="240"/>
+        <w:ind w:firstLine="709"/>
+        <w:jc w:val="start"/>
+        <w:rPr/>
+      </w:pPr>
+      <w:r>
+        <w:rPr>
+          <w:b/>
+          <w:i/>
+          <w:sz w:val="24"/>
+        </w:rPr>
+        <w:t>Constitución de la República Bolivariana de Venezuela</w:t>
+      </w:r>
+    </w:p>
+    <w:p>
+      <w:pPr>
+        <w:pStyle w:val="IUTECPTtulo3"/>
+        <w:keepNext w:val="true"/>
+        <w:keepLines/>
+        <w:spacing w:lineRule="auto" w:line="360" w:before="240" w:after="240"/>
+        <w:ind w:firstLine="709"/>
+        <w:jc w:val="start"/>
+        <w:rPr/>
+      </w:pPr>
+      <w:r>
+        <w:rPr>
+          <w:b/>
+          <w:i/>
+          <w:sz w:val="24"/>
+        </w:rPr>
+        <w:t>Artículo 112</w:t>
       </w:r>
     </w:p>
     <w:p>
@@ -11056,56 +11525,89 @@
         <w:rPr>
           <w:sz w:val="24"/>
         </w:rPr>
-        <w:t>Todas las personas pueden dedicarse libremente a la actividad económica de su preferencia, sin más limitaciones que las previstas en esta Constitución y las que establezcan las leyes, por razones de desarrollo humano, seguridad, sanidad, protección del ambiente u otras de interés social. El Estado promoverá la iniciativa privada, garantizando la creación y justa distribución de la riqueza, así como la producción de bienes y servicios que satisfagan las necesidades de la población, la libertad de trabajo, empresa, comercio, industria, sin perjuicio de su facultad para dictar medidas para planificar, racionalizar y regular la economía e impulsar el desarrollo integral del país. (Constitución de la República Bolivariana de Venezuela, 1999, art. 112)</w:t>
-      </w:r>
-    </w:p>
-    <w:p>
-      <w:pPr>
-        <w:pStyle w:val="Normal"/>
-        <w:spacing w:lineRule="auto" w:line="360" w:before="0" w:after="0"/>
-        <w:ind w:firstLine="709"/>
-        <w:jc w:val="both"/>
-        <w:rPr/>
-      </w:pPr>
-      <w:r>
-        <w:rPr>
-          <w:i w:val="false"/>
-          <w:sz w:val="24"/>
-        </w:rPr>
-        <w:t>El aporte de este artículo al informe es de carácter general, porque reconoce el ejercicio de la actividad empresarial y permite ubicar la prestación de servicios de IDETEL dentro de una actividad económica sujeta al ordenamiento jurídico. Su relación con el informe se limita a este fundamento general y no establece por sí mismo el procedimiento administrativo de seguimiento de solicitudes.</w:t>
-      </w:r>
-    </w:p>
-    <w:p>
-      <w:pPr>
-        <w:pStyle w:val="IUTECPTtulo2"/>
+        <w:t xml:space="preserve">Todas las personas pueden dedicarse libremente a la actividad económica de su preferencia, sin más limitaciones que las previstas en esta Constitución y las que establezcan las leyes, por razones de desarrollo humano, seguridad, sanidad, protección del ambiente u otras de interés social. El Estado promoverá la iniciativa privada, garantizando la creación y justa distribución de la riqueza, así como la producción de bienes y servicios que satisfagan las necesidades de la población, la libertad de trabajo, empresa, comercio, industria, sin perjuicio de su facultad para dictar medidas para planificar, racionalizar y regular la economía e impulsar el desarrollo integral del país. </w:t>
+      </w:r>
+    </w:p>
+    <w:p>
+      <w:pPr>
+        <w:pStyle w:val="Normal"/>
+        <w:spacing w:lineRule="auto" w:line="360" w:before="240" w:after="240"/>
+        <w:ind w:hanging="0" w:start="720"/>
+        <w:jc w:val="start"/>
+        <w:rPr/>
+      </w:pPr>
+      <w:r>
+        <w:rPr>
+          <w:b/>
+          <w:sz w:val="24"/>
+        </w:rPr>
+        <w:t xml:space="preserve">Análisis. </w:t>
+      </w:r>
+      <w:r>
+        <w:rPr>
+          <w:sz w:val="24"/>
+        </w:rPr>
+        <w:t>El artículo reconoce el derecho a desarrollar actividades económicas dentro de los límites establecidos por el ordenamiento jurídico y asigna al Estado funciones de promoción, planificación y regulación. En consecuencia, la actividad empresarial debe combinar la iniciativa privada con una gestión organizada que favorezca la producción de servicios y el cumplimiento de las disposiciones aplicables.</w:t>
+      </w:r>
+    </w:p>
+    <w:p>
+      <w:pPr>
+        <w:pStyle w:val="Normal"/>
+        <w:spacing w:lineRule="auto" w:line="360" w:before="240" w:after="240"/>
+        <w:ind w:hanging="0" w:start="720"/>
+        <w:jc w:val="start"/>
+        <w:rPr/>
+      </w:pPr>
+      <w:r>
+        <w:rPr>
+          <w:b/>
+          <w:sz w:val="24"/>
+        </w:rPr>
+        <w:t xml:space="preserve">Aporte legal al informe. </w:t>
+      </w:r>
+      <w:r>
+        <w:rPr>
+          <w:sz w:val="24"/>
+        </w:rPr>
+        <w:t>El aporte al informe es de carácter constitucional general, porque permite ubicar la prestación de servicios de Ingeniería de Telecomunicaciones, C.A. dentro del ejercicio legítimo de una actividad económica. La evaluación del control administrativo contribuye a ordenar la gestión interna de esa actividad y a fortalecer la capacidad de la empresa para atender solicitudes, aunque el artículo no regula específicamente el procedimiento estudiado.</w:t>
+      </w:r>
+    </w:p>
+    <w:p>
+      <w:pPr>
+        <w:pStyle w:val="IUTECPTtulo3"/>
         <w:keepNext w:val="true"/>
         <w:keepLines/>
         <w:spacing w:lineRule="auto" w:line="360" w:before="240" w:after="240"/>
+        <w:ind w:firstLine="709"/>
         <w:jc w:val="start"/>
         <w:rPr/>
       </w:pPr>
       <w:r>
         <w:rPr>
           <w:b/>
-          <w:sz w:val="24"/>
-        </w:rPr>
-        <w:t>Base Legal: Código de Comercio — Artículo 32</w:t>
-      </w:r>
-    </w:p>
-    <w:p>
-      <w:pPr>
-        <w:pStyle w:val="Normal"/>
-        <w:spacing w:lineRule="auto" w:line="360" w:before="0" w:after="0"/>
+          <w:i/>
+          <w:sz w:val="24"/>
+        </w:rPr>
+        <w:t>Código de Comercio</w:t>
+      </w:r>
+    </w:p>
+    <w:p>
+      <w:pPr>
+        <w:pStyle w:val="IUTECPTtulo3"/>
+        <w:keepNext w:val="true"/>
+        <w:keepLines/>
+        <w:spacing w:lineRule="auto" w:line="360" w:before="240" w:after="240"/>
         <w:ind w:firstLine="709"/>
-        <w:jc w:val="both"/>
-        <w:rPr/>
-      </w:pPr>
-      <w:r>
-        <w:rPr>
-          <w:i w:val="false"/>
-          <w:sz w:val="24"/>
-        </w:rPr>
-        <w:t>El Código de Comercio establece obligaciones vinculadas con el orden y claridad de los registros de los comerciantes, aspecto relacionado con la necesidad de conservar información organizada y verificable en los procesos administrativos.</w:t>
+        <w:jc w:val="start"/>
+        <w:rPr/>
+      </w:pPr>
+      <w:r>
+        <w:rPr>
+          <w:b/>
+          <w:i/>
+          <w:sz w:val="24"/>
+        </w:rPr>
+        <w:t>Artículo 32</w:t>
       </w:r>
     </w:p>
     <w:p>
@@ -11120,15 +11622,37 @@
         <w:rPr>
           <w:sz w:val="24"/>
         </w:rPr>
-        <w:t>Todo comerciante debe llevar en idioma castellano su contabilidad, la cual comprenderá, obligatoriamente, el libro Diario, el libro Mayor y el de Inventarios. Podrá llevar, además, todos los libros auxiliares que estimara conveniente para el mayor orden y claridad de sus operaciones. (Código de Comercio, 1955, art. 32)</w:t>
-      </w:r>
-    </w:p>
-    <w:p>
-      <w:pPr>
-        <w:pStyle w:val="Normal"/>
-        <w:spacing w:lineRule="auto" w:line="360" w:before="0" w:after="0"/>
-        <w:ind w:firstLine="709"/>
-        <w:jc w:val="both"/>
+        <w:t xml:space="preserve">Todo comerciante debe llevar en idioma castellano su contabilidad, la cual comprenderá, obligatoriamente, el libro Diario, el libro Mayor y el de Inventarios. Podrá llevar, además, todos los libros auxiliares que estimara conveniente para el mayor orden y claridad de sus operaciones. </w:t>
+      </w:r>
+    </w:p>
+    <w:p>
+      <w:pPr>
+        <w:pStyle w:val="Normal"/>
+        <w:spacing w:lineRule="auto" w:line="360" w:before="240" w:after="240"/>
+        <w:ind w:hanging="0" w:start="720"/>
+        <w:jc w:val="start"/>
+        <w:rPr/>
+      </w:pPr>
+      <w:r>
+        <w:rPr>
+          <w:b/>
+          <w:sz w:val="24"/>
+        </w:rPr>
+        <w:t xml:space="preserve">Análisis. </w:t>
+      </w:r>
+      <w:r>
+        <w:rPr>
+          <w:sz w:val="24"/>
+        </w:rPr>
+        <w:t>El artículo establece la obligación de conservar registros contables y permite incorporar libros auxiliares para mejorar el orden y la claridad de las operaciones mercantiles. Aunque su alcance directo corresponde a la contabilidad, la disposición demuestra la importancia jurídica de mantener información organizada, comprensible y verificable.</w:t>
+      </w:r>
+    </w:p>
+    <w:p>
+      <w:pPr>
+        <w:pStyle w:val="Normal"/>
+        <w:spacing w:lineRule="auto" w:line="360" w:before="240" w:after="0"/>
+        <w:ind w:hanging="0" w:start="720"/>
+        <w:jc w:val="start"/>
         <w:rPr/>
         <w:sectPr>
           <w:footerReference w:type="even" r:id="rId52"/>
@@ -11146,10 +11670,16 @@
       </w:pPr>
       <w:r>
         <w:rPr>
-          <w:i w:val="false"/>
-          <w:sz w:val="24"/>
-        </w:rPr>
-        <w:t>La relación con el informe se encuentra en el principio de orden y claridad de las operaciones mercantiles. Los formatos y mecanismos de seguimiento propuestos no sustituyen los libros contables exigidos por la ley, pero complementan el control administrativo al organizar información asociada con solicitudes, pagos, facturación y seguimiento de casos.</w:t>
+          <w:b/>
+          <w:sz w:val="24"/>
+        </w:rPr>
+        <w:t xml:space="preserve">Aporte legal al informe. </w:t>
+      </w:r>
+      <w:r>
+        <w:rPr>
+          <w:sz w:val="24"/>
+        </w:rPr>
+        <w:t>Su aporte al informe se vincula con el principio de orden documental aplicado a pagos, facturación y solicitudes de servicio. Los formatos y mecanismos de seguimiento propuestos no sustituyen los libros contables exigidos por la norma, pero complementan el control administrativo al organizar la información que acompaña las operaciones y facilita su consulta.</w:t>
       </w:r>
     </w:p>
     <w:p>
@@ -11176,7 +11706,7 @@
         <w:jc w:val="center"/>
         <w:rPr/>
       </w:pPr>
-      <w:bookmarkStart w:id="38" w:name="bm_cap4"/>
+      <w:bookmarkStart w:id="39" w:name="bm_cap4"/>
       <w:r>
         <w:rPr>
           <w:b/>
@@ -11184,7 +11714,7 @@
         </w:rPr>
         <w:t>ACTIVIDADES REALIZADAS</w:t>
       </w:r>
-      <w:bookmarkEnd w:id="38"/>
+      <w:bookmarkEnd w:id="39"/>
     </w:p>
     <w:p>
       <w:pPr>
@@ -11195,7 +11725,7 @@
         <w:jc w:val="start"/>
         <w:rPr/>
       </w:pPr>
-      <w:bookmarkStart w:id="39" w:name="bm_cap4_desc"/>
+      <w:bookmarkStart w:id="40" w:name="bm_cap4_desc"/>
       <w:r>
         <w:rPr>
           <w:b/>
@@ -11203,7 +11733,7 @@
         </w:rPr>
         <w:t>Descripción de Actividades Ejecutadas por Semana</w:t>
       </w:r>
-      <w:bookmarkEnd w:id="39"/>
+      <w:bookmarkEnd w:id="40"/>
     </w:p>
     <w:p>
       <w:pPr>
@@ -11988,7 +12518,7 @@
         <w:jc w:val="center"/>
         <w:rPr/>
       </w:pPr>
-      <w:bookmarkStart w:id="40" w:name="bm_cap5"/>
+      <w:bookmarkStart w:id="41" w:name="bm_cap5"/>
       <w:r>
         <w:rPr>
           <w:b/>
@@ -11996,7 +12526,7 @@
         </w:rPr>
         <w:t>CONCLUSIONES Y RECOMENDACIONES</w:t>
       </w:r>
-      <w:bookmarkEnd w:id="40"/>
+      <w:bookmarkEnd w:id="41"/>
     </w:p>
     <w:p>
       <w:pPr>
@@ -12007,7 +12537,7 @@
         <w:jc w:val="start"/>
         <w:rPr/>
       </w:pPr>
-      <w:bookmarkStart w:id="41" w:name="bm_cap5_concl"/>
+      <w:bookmarkStart w:id="42" w:name="bm_cap5_concl"/>
       <w:r>
         <w:rPr>
           <w:b/>
@@ -12015,7 +12545,7 @@
         </w:rPr>
         <w:t>Conclusiones</w:t>
       </w:r>
-      <w:bookmarkEnd w:id="41"/>
+      <w:bookmarkEnd w:id="42"/>
     </w:p>
     <w:p>
       <w:pPr>
@@ -12086,7 +12616,7 @@
         <w:jc w:val="start"/>
         <w:rPr/>
       </w:pPr>
-      <w:bookmarkStart w:id="42" w:name="bm_cap5_recom"/>
+      <w:bookmarkStart w:id="43" w:name="bm_cap5_recom"/>
       <w:r>
         <w:rPr>
           <w:b/>
@@ -12094,7 +12624,7 @@
         </w:rPr>
         <w:t>Recomendaciones</w:t>
       </w:r>
-      <w:bookmarkEnd w:id="42"/>
+      <w:bookmarkEnd w:id="43"/>
     </w:p>
     <w:p>
       <w:pPr>
@@ -12114,61 +12644,65 @@
     <w:p>
       <w:pPr>
         <w:pStyle w:val="Normal"/>
-        <w:spacing w:lineRule="auto" w:line="360"/>
+        <w:spacing w:lineRule="auto" w:line="360" w:before="0" w:after="0"/>
         <w:ind w:firstLine="709"/>
         <w:jc w:val="both"/>
         <w:rPr/>
       </w:pPr>
       <w:r>
         <w:rPr>
-          <w:sz w:val="24"/>
-        </w:rPr>
-        <w:t>1. Implementar progresivamente el flujo estandarizado propuesto y verificar su funcionamiento con un grupo controlado de solicitudes antes de aplicarlo a todos los casos.</w:t>
-      </w:r>
-    </w:p>
-    <w:p>
-      <w:pPr>
-        <w:pStyle w:val="Normal"/>
-        <w:spacing w:lineRule="auto" w:line="360"/>
+          <w:i w:val="false"/>
+          <w:sz w:val="24"/>
+        </w:rPr>
+        <w:t>Implementar progresivamente el flujo estandarizado propuesto y verificar su funcionamiento con un grupo controlado de solicitudes antes de aplicarlo a todos los casos.</w:t>
+      </w:r>
+    </w:p>
+    <w:p>
+      <w:pPr>
+        <w:pStyle w:val="Normal"/>
+        <w:spacing w:lineRule="auto" w:line="360" w:before="0" w:after="0"/>
         <w:ind w:firstLine="709"/>
         <w:jc w:val="both"/>
         <w:rPr/>
       </w:pPr>
       <w:r>
         <w:rPr>
-          <w:sz w:val="24"/>
-        </w:rPr>
-        <w:t>2. Utilizar de manera uniforme los formatos de registro de afiliaciones e incidencias y definir claramente el responsable de actualizar el estatus en cada etapa.</w:t>
-      </w:r>
-    </w:p>
-    <w:p>
-      <w:pPr>
-        <w:pStyle w:val="Normal"/>
-        <w:spacing w:lineRule="auto" w:line="360"/>
+          <w:i w:val="false"/>
+          <w:sz w:val="24"/>
+        </w:rPr>
+        <w:t>Utilizar de manera uniforme los formatos de registro de afiliaciones e incidencias y definir claramente el responsable de actualizar el estatus en cada etapa.</w:t>
+      </w:r>
+    </w:p>
+    <w:p>
+      <w:pPr>
+        <w:pStyle w:val="Normal"/>
+        <w:spacing w:lineRule="auto" w:line="360" w:before="0" w:after="0"/>
         <w:ind w:firstLine="709"/>
         <w:jc w:val="both"/>
         <w:rPr/>
       </w:pPr>
       <w:r>
         <w:rPr>
-          <w:sz w:val="24"/>
-        </w:rPr>
-        <w:t>3. Registrar y revisar periódicamente tiempos de respuesta, solicitudes pendientes y casos cerrados para identificar retrasos recurrentes y aplicar acciones correctivas.</w:t>
-      </w:r>
-    </w:p>
-    <w:p>
-      <w:pPr>
-        <w:pStyle w:val="Normal"/>
-        <w:spacing w:lineRule="auto" w:line="360"/>
+          <w:i w:val="false"/>
+          <w:sz w:val="24"/>
+        </w:rPr>
+        <w:t>Registrar y revisar periódicamente tiempos de respuesta, solicitudes pendientes y casos cerrados para identificar retrasos recurrentes y aplicar acciones correctivas.</w:t>
+      </w:r>
+    </w:p>
+    <w:p>
+      <w:pPr>
+        <w:pStyle w:val="Normal"/>
+        <w:spacing w:lineRule="auto" w:line="360" w:before="0" w:after="0"/>
         <w:ind w:firstLine="709"/>
         <w:jc w:val="both"/>
         <w:rPr/>
       </w:pPr>
       <w:r>
         <w:rPr>
-          <w:sz w:val="24"/>
-        </w:rPr>
-        <w:t>4. Evaluar posteriormente una herramienta digital centralizada de seguimiento cuando el procedimiento administrativo ya se encuentre formalizado y validado por las áreas involucradas.</w:t>
+          <w:i w:val="false"/>
+          <w:sz w:val="24"/>
+        </w:rPr>
+        <w:t>Evaluar posteriormente una herramienta digital centralizada de seguimiento cuando el procedimiento administrativo ya se encuentre formalizado y validado por las áreas involucradas.</w:t>
       </w:r>
     </w:p>
     <w:p>
@@ -12189,16 +12723,17 @@
     <w:p>
       <w:pPr>
         <w:pStyle w:val="Normal"/>
-        <w:spacing w:lineRule="auto" w:line="360"/>
+        <w:spacing w:lineRule="auto" w:line="360" w:before="0" w:after="0"/>
         <w:ind w:firstLine="709"/>
         <w:jc w:val="both"/>
         <w:rPr/>
       </w:pPr>
       <w:r>
         <w:rPr>
-          <w:sz w:val="24"/>
-        </w:rPr>
-        <w:t>1. Continuar fortaleciendo el acompañamiento académico durante las pasantías y la articulación entre los conocimientos adquiridos en la carrera y las situaciones administrativas observadas en las empresas.</w:t>
+          <w:i w:val="false"/>
+          <w:sz w:val="24"/>
+        </w:rPr>
+        <w:t>Continuar fortaleciendo el acompañamiento académico durante las pasantías y la articulación entre los conocimientos adquiridos en la carrera y las situaciones administrativas observadas en las empresas.</w:t>
       </w:r>
     </w:p>
     <w:p>
@@ -12239,9 +12774,10 @@
       </w:pPr>
       <w:r>
         <w:rPr>
-          <w:sz w:val="24"/>
-        </w:rPr>
-        <w:t>1. Llevar un registro sistemático de las actividades desde las primeras semanas, observar los procesos administrativos, conservar las evidencias pertinentes y relacionar las tareas realizadas con los objetivos establecidos en el informe.</w:t>
+          <w:i w:val="false"/>
+          <w:sz w:val="24"/>
+        </w:rPr>
+        <w:t>Llevar un registro sistemático de las actividades desde las primeras semanas, observar los procesos administrativos, conservar las evidencias pertinentes y relacionar las tareas realizadas con los objetivos establecidos en el informe.</w:t>
       </w:r>
     </w:p>
     <w:p>
@@ -12253,7 +12789,7 @@
         <w:jc w:val="center"/>
         <w:rPr/>
       </w:pPr>
-      <w:bookmarkStart w:id="43" w:name="bm_referencias"/>
+      <w:bookmarkStart w:id="44" w:name="bm_referencias"/>
       <w:r>
         <w:rPr>
           <w:b/>
@@ -12261,7 +12797,7 @@
         </w:rPr>
         <w:t>REFERENCIAS</w:t>
       </w:r>
-      <w:bookmarkEnd w:id="43"/>
+      <w:bookmarkEnd w:id="44"/>
     </w:p>
     <w:p>
       <w:pPr>
@@ -12545,7 +13081,7 @@
           <w:docGrid w:type="default" w:linePitch="360" w:charSpace="0"/>
         </w:sectPr>
       </w:pPr>
-      <w:bookmarkStart w:id="44" w:name="bm_anexos"/>
+      <w:bookmarkStart w:id="45" w:name="bm_anexos"/>
       <w:r>
         <w:rPr>
           <w:b/>
@@ -12553,7 +13089,7 @@
         </w:rPr>
         <w:t>ANEXOS</w:t>
       </w:r>
-      <w:bookmarkEnd w:id="44"/>
+      <w:bookmarkEnd w:id="45"/>
     </w:p>
     <w:p>
       <w:pPr>
@@ -12564,8 +13100,8 @@
         <w:jc w:val="center"/>
         <w:rPr/>
       </w:pPr>
-      <w:bookmarkStart w:id="45" w:name="bm_anexoA"/>
-      <w:bookmarkEnd w:id="45"/>
+      <w:bookmarkStart w:id="46" w:name="bm_anexoA"/>
+      <w:bookmarkEnd w:id="46"/>
       <w:r>
         <w:rPr>
           <w:b/>
@@ -12684,8 +13220,8 @@
         <w:jc w:val="center"/>
         <w:rPr/>
       </w:pPr>
-      <w:bookmarkStart w:id="46" w:name="bm_anexoB"/>
-      <w:bookmarkEnd w:id="46"/>
+      <w:bookmarkStart w:id="47" w:name="bm_anexoB"/>
+      <w:bookmarkEnd w:id="47"/>
       <w:r>
         <w:rPr>
           <w:b/>
@@ -12804,8 +13340,8 @@
         <w:jc w:val="center"/>
         <w:rPr/>
       </w:pPr>
-      <w:bookmarkStart w:id="47" w:name="bm_anexoC"/>
-      <w:bookmarkEnd w:id="47"/>
+      <w:bookmarkStart w:id="48" w:name="bm_anexoC"/>
+      <w:bookmarkEnd w:id="48"/>
       <w:r>
         <w:rPr>
           <w:b/>
@@ -12924,8 +13460,8 @@
         <w:jc w:val="center"/>
         <w:rPr/>
       </w:pPr>
-      <w:bookmarkStart w:id="48" w:name="bm_anexoD"/>
-      <w:bookmarkEnd w:id="48"/>
+      <w:bookmarkStart w:id="49" w:name="bm_anexoD"/>
+      <w:bookmarkEnd w:id="49"/>
       <w:r>
         <w:rPr>
           <w:b/>
@@ -13044,8 +13580,8 @@
         <w:jc w:val="center"/>
         <w:rPr/>
       </w:pPr>
-      <w:bookmarkStart w:id="49" w:name="bm_anexoE"/>
-      <w:bookmarkEnd w:id="49"/>
+      <w:bookmarkStart w:id="50" w:name="bm_anexoE"/>
+      <w:bookmarkEnd w:id="50"/>
       <w:r>
         <w:rPr>
           <w:b/>
@@ -13164,8 +13700,8 @@
         <w:jc w:val="center"/>
         <w:rPr/>
       </w:pPr>
-      <w:bookmarkStart w:id="50" w:name="bm_anexoF"/>
-      <w:bookmarkEnd w:id="50"/>
+      <w:bookmarkStart w:id="51" w:name="bm_anexoF"/>
+      <w:bookmarkEnd w:id="51"/>
       <w:r>
         <w:rPr>
           <w:b/>
@@ -13284,8 +13820,8 @@
         <w:jc w:val="center"/>
         <w:rPr/>
       </w:pPr>
-      <w:bookmarkStart w:id="51" w:name="bm_anexoG"/>
-      <w:bookmarkEnd w:id="51"/>
+      <w:bookmarkStart w:id="52" w:name="bm_anexoG"/>
+      <w:bookmarkEnd w:id="52"/>
       <w:r>
         <w:rPr>
           <w:b/>
@@ -13384,6 +13920,7 @@
         <w:pStyle w:val="Normal"/>
         <w:keepNext w:val="true"/>
         <w:keepLines/>
+        <w:spacing w:before="0" w:after="0"/>
         <w:jc w:val="center"/>
         <w:rPr/>
       </w:pPr>
@@ -13452,6 +13989,7 @@
         <w:pStyle w:val="Normal"/>
         <w:keepNext w:val="true"/>
         <w:keepLines/>
+        <w:spacing w:before="0" w:after="0"/>
         <w:jc w:val="center"/>
         <w:rPr/>
       </w:pPr>
@@ -13520,6 +14058,7 @@
         <w:pStyle w:val="Normal"/>
         <w:keepNext w:val="true"/>
         <w:keepLines/>
+        <w:spacing w:before="0" w:after="0"/>
         <w:jc w:val="center"/>
         <w:rPr/>
       </w:pPr>
@@ -13588,6 +14127,7 @@
         <w:pStyle w:val="Normal"/>
         <w:keepNext w:val="true"/>
         <w:keepLines/>
+        <w:spacing w:before="0" w:after="0"/>
         <w:jc w:val="center"/>
         <w:rPr/>
       </w:pPr>
@@ -13656,6 +14196,7 @@
         <w:pStyle w:val="Normal"/>
         <w:keepNext w:val="true"/>
         <w:keepLines/>
+        <w:spacing w:before="0" w:after="0"/>
         <w:jc w:val="center"/>
         <w:rPr/>
       </w:pPr>
@@ -13724,6 +14265,7 @@
         <w:pStyle w:val="Normal"/>
         <w:keepNext w:val="true"/>
         <w:keepLines/>
+        <w:spacing w:before="0" w:after="0"/>
         <w:jc w:val="center"/>
         <w:rPr/>
       </w:pPr>
@@ -13792,6 +14334,7 @@
         <w:pStyle w:val="Normal"/>
         <w:keepNext w:val="true"/>
         <w:keepLines/>
+        <w:spacing w:before="0" w:after="0"/>
         <w:jc w:val="center"/>
         <w:rPr/>
       </w:pPr>
@@ -13884,7 +14427,6 @@
         <w:ind w:hanging="0"/>
         <w:jc w:val="center"/>
         <w:rPr>
-          <w:rFonts w:ascii="Times New Roman" w:hAnsi="Times New Roman"/>
           <w:sz w:val="20"/>
         </w:rPr>
       </w:pPr>
@@ -28754,7 +29296,7 @@
     </w:r>
     <w:r>
       <w:rPr/>
-      <w:t>19</w:t>
+      <w:t>22</w:t>
     </w:r>
     <w:r>
       <w:rPr/>
@@ -28814,7 +29356,7 @@
     </w:r>
     <w:r>
       <w:rPr/>
-      <w:t>23</w:t>
+      <w:t>26</w:t>
     </w:r>
     <w:r>
       <w:rPr/>
@@ -28906,7 +29448,7 @@
     </w:r>
     <w:r>
       <w:rPr/>
-      <w:t>25</w:t>
+      <w:t>28</w:t>
     </w:r>
     <w:r>
       <w:rPr/>
@@ -29026,7 +29568,7 @@
     </w:r>
     <w:r>
       <w:rPr/>
-      <w:t>27</w:t>
+      <w:t>30</w:t>
     </w:r>
     <w:r>
       <w:rPr/>
@@ -29058,7 +29600,7 @@
     </w:r>
     <w:r>
       <w:rPr/>
-      <w:t>27</w:t>
+      <w:t>30</w:t>
     </w:r>
     <w:r>
       <w:rPr/>
@@ -29104,7 +29646,7 @@
     </w:r>
     <w:r>
       <w:rPr/>
-      <w:t>28</w:t>
+      <w:t>31</w:t>
     </w:r>
     <w:r>
       <w:rPr/>
@@ -29168,7 +29710,7 @@
     </w:r>
     <w:r>
       <w:rPr/>
-      <w:t>28</w:t>
+      <w:t>31</w:t>
     </w:r>
     <w:r>
       <w:rPr/>
@@ -29214,7 +29756,7 @@
     </w:r>
     <w:r>
       <w:rPr/>
-      <w:t>29</w:t>
+      <w:t>32</w:t>
     </w:r>
     <w:r>
       <w:rPr/>
@@ -29246,7 +29788,7 @@
     </w:r>
     <w:r>
       <w:rPr/>
-      <w:t>29</w:t>
+      <w:t>32</w:t>
     </w:r>
     <w:r>
       <w:rPr/>
@@ -29292,7 +29834,7 @@
     </w:r>
     <w:r>
       <w:rPr/>
-      <w:t>30</w:t>
+      <w:t>33</w:t>
     </w:r>
     <w:r>
       <w:rPr/>
@@ -29324,7 +29866,7 @@
     </w:r>
     <w:r>
       <w:rPr/>
-      <w:t>30</w:t>
+      <w:t>33</w:t>
     </w:r>
     <w:r>
       <w:rPr/>
@@ -29370,7 +29912,7 @@
     </w:r>
     <w:r>
       <w:rPr/>
-      <w:t>31</w:t>
+      <w:t>34</w:t>
     </w:r>
     <w:r>
       <w:rPr/>
@@ -29402,7 +29944,7 @@
     </w:r>
     <w:r>
       <w:rPr/>
-      <w:t>31</w:t>
+      <w:t>34</w:t>
     </w:r>
     <w:r>
       <w:rPr/>
@@ -29462,7 +30004,7 @@
     </w:r>
     <w:r>
       <w:rPr/>
-      <w:t>32</w:t>
+      <w:t>35</w:t>
     </w:r>
     <w:r>
       <w:rPr/>
@@ -29494,7 +30036,7 @@
     </w:r>
     <w:r>
       <w:rPr/>
-      <w:t>32</w:t>
+      <w:t>35</w:t>
     </w:r>
     <w:r>
       <w:rPr/>
@@ -29540,7 +30082,7 @@
     </w:r>
     <w:r>
       <w:rPr/>
-      <w:t>33</w:t>
+      <w:t>36</w:t>
     </w:r>
     <w:r>
       <w:rPr/>
@@ -29572,7 +30114,7 @@
     </w:r>
     <w:r>
       <w:rPr/>
-      <w:t>33</w:t>
+      <w:t>36</w:t>
     </w:r>
     <w:r>
       <w:rPr/>
@@ -29626,7 +30168,7 @@
       <w:rPr>
         <w:sz w:val="20"/>
       </w:rPr>
-      <w:t>61</w:t>
+      <w:t>64</w:t>
     </w:r>
     <w:r>
       <w:rPr>
@@ -29668,7 +30210,7 @@
       <w:rPr>
         <w:sz w:val="20"/>
       </w:rPr>
-      <w:t>61</w:t>
+      <w:t>64</w:t>
     </w:r>
     <w:r>
       <w:rPr>
@@ -29773,6 +30315,7 @@
         </w:tabs>
         <w:ind w:start="1080" w:hanging="360"/>
       </w:pPr>
+      <w:rPr/>
     </w:lvl>
     <w:lvl w:ilvl="2">
       <w:start w:val="1"/>
@@ -29785,6 +30328,7 @@
         </w:tabs>
         <w:ind w:start="1440" w:hanging="360"/>
       </w:pPr>
+      <w:rPr/>
     </w:lvl>
     <w:lvl w:ilvl="3">
       <w:start w:val="1"/>
@@ -29797,6 +30341,7 @@
         </w:tabs>
         <w:ind w:start="1800" w:hanging="360"/>
       </w:pPr>
+      <w:rPr/>
     </w:lvl>
     <w:lvl w:ilvl="4">
       <w:start w:val="1"/>
@@ -29809,6 +30354,7 @@
         </w:tabs>
         <w:ind w:start="2160" w:hanging="360"/>
       </w:pPr>
+      <w:rPr/>
     </w:lvl>
     <w:lvl w:ilvl="5">
       <w:start w:val="1"/>
@@ -29821,6 +30367,7 @@
         </w:tabs>
         <w:ind w:start="2520" w:hanging="360"/>
       </w:pPr>
+      <w:rPr/>
     </w:lvl>
     <w:lvl w:ilvl="6">
       <w:start w:val="1"/>
@@ -29833,6 +30380,7 @@
         </w:tabs>
         <w:ind w:start="2880" w:hanging="360"/>
       </w:pPr>
+      <w:rPr/>
     </w:lvl>
     <w:lvl w:ilvl="7">
       <w:start w:val="1"/>
@@ -29845,6 +30393,7 @@
         </w:tabs>
         <w:ind w:start="3240" w:hanging="360"/>
       </w:pPr>
+      <w:rPr/>
     </w:lvl>
     <w:lvl w:ilvl="8">
       <w:start w:val="1"/>
@@ -29857,6 +30406,7 @@
         </w:tabs>
         <w:ind w:start="3600" w:hanging="360"/>
       </w:pPr>
+      <w:rPr/>
     </w:lvl>
   </w:abstractNum>
   <w:abstractNum w:abstractNumId="2">
@@ -29886,6 +30436,7 @@
         </w:tabs>
         <w:ind w:start="1080" w:hanging="360"/>
       </w:pPr>
+      <w:rPr/>
     </w:lvl>
     <w:lvl w:ilvl="2">
       <w:start w:val="1"/>
@@ -29898,6 +30449,7 @@
         </w:tabs>
         <w:ind w:start="1440" w:hanging="360"/>
       </w:pPr>
+      <w:rPr/>
     </w:lvl>
     <w:lvl w:ilvl="3">
       <w:start w:val="1"/>
@@ -29910,6 +30462,7 @@
         </w:tabs>
         <w:ind w:start="1800" w:hanging="360"/>
       </w:pPr>
+      <w:rPr/>
     </w:lvl>
     <w:lvl w:ilvl="4">
       <w:start w:val="1"/>
@@ -29922,6 +30475,7 @@
         </w:tabs>
         <w:ind w:start="2160" w:hanging="360"/>
       </w:pPr>
+      <w:rPr/>
     </w:lvl>
     <w:lvl w:ilvl="5">
       <w:start w:val="1"/>
@@ -29934,6 +30488,7 @@
         </w:tabs>
         <w:ind w:start="2520" w:hanging="360"/>
       </w:pPr>
+      <w:rPr/>
     </w:lvl>
     <w:lvl w:ilvl="6">
       <w:start w:val="1"/>
@@ -29946,6 +30501,7 @@
         </w:tabs>
         <w:ind w:start="2880" w:hanging="360"/>
       </w:pPr>
+      <w:rPr/>
     </w:lvl>
     <w:lvl w:ilvl="7">
       <w:start w:val="1"/>
@@ -29958,6 +30514,7 @@
         </w:tabs>
         <w:ind w:start="3240" w:hanging="360"/>
       </w:pPr>
+      <w:rPr/>
     </w:lvl>
     <w:lvl w:ilvl="8">
       <w:start w:val="1"/>
@@ -29970,6 +30527,7 @@
         </w:tabs>
         <w:ind w:start="3600" w:hanging="360"/>
       </w:pPr>
+      <w:rPr/>
     </w:lvl>
   </w:abstractNum>
   <w:abstractNum w:abstractNumId="3">
@@ -29999,6 +30557,7 @@
         </w:tabs>
         <w:ind w:start="1080" w:hanging="360"/>
       </w:pPr>
+      <w:rPr/>
     </w:lvl>
     <w:lvl w:ilvl="2">
       <w:start w:val="1"/>
@@ -30011,6 +30570,7 @@
         </w:tabs>
         <w:ind w:start="1440" w:hanging="360"/>
       </w:pPr>
+      <w:rPr/>
     </w:lvl>
     <w:lvl w:ilvl="3">
       <w:start w:val="1"/>
@@ -30023,6 +30583,7 @@
         </w:tabs>
         <w:ind w:start="1800" w:hanging="360"/>
       </w:pPr>
+      <w:rPr/>
     </w:lvl>
     <w:lvl w:ilvl="4">
       <w:start w:val="1"/>
@@ -30035,6 +30596,7 @@
         </w:tabs>
         <w:ind w:start="2160" w:hanging="360"/>
       </w:pPr>
+      <w:rPr/>
     </w:lvl>
     <w:lvl w:ilvl="5">
       <w:start w:val="1"/>
@@ -30047,6 +30609,7 @@
         </w:tabs>
         <w:ind w:start="2520" w:hanging="360"/>
       </w:pPr>
+      <w:rPr/>
     </w:lvl>
     <w:lvl w:ilvl="6">
       <w:start w:val="1"/>
@@ -30059,6 +30622,7 @@
         </w:tabs>
         <w:ind w:start="2880" w:hanging="360"/>
       </w:pPr>
+      <w:rPr/>
     </w:lvl>
     <w:lvl w:ilvl="7">
       <w:start w:val="1"/>
@@ -30071,6 +30635,7 @@
         </w:tabs>
         <w:ind w:start="3240" w:hanging="360"/>
       </w:pPr>
+      <w:rPr/>
     </w:lvl>
     <w:lvl w:ilvl="8">
       <w:start w:val="1"/>
@@ -30083,6 +30648,7 @@
         </w:tabs>
         <w:ind w:start="3600" w:hanging="360"/>
       </w:pPr>
+      <w:rPr/>
     </w:lvl>
   </w:abstractNum>
   <w:abstractNum w:abstractNumId="4">
@@ -30093,9 +30659,9 @@
       <w:lvlJc w:val="start"/>
       <w:pPr>
         <w:tabs>
-          <w:tab w:val="num" w:pos="360"/>
+          <w:tab w:val="num" w:pos="720"/>
         </w:tabs>
-        <w:ind w:start="360" w:hanging="360"/>
+        <w:ind w:start="720" w:hanging="360"/>
       </w:pPr>
       <w:rPr/>
     </w:lvl>
@@ -30110,6 +30676,7 @@
         </w:tabs>
         <w:ind w:start="1080" w:hanging="360"/>
       </w:pPr>
+      <w:rPr/>
     </w:lvl>
     <w:lvl w:ilvl="2">
       <w:start w:val="1"/>
@@ -30122,6 +30689,7 @@
         </w:tabs>
         <w:ind w:start="1440" w:hanging="360"/>
       </w:pPr>
+      <w:rPr/>
     </w:lvl>
     <w:lvl w:ilvl="3">
       <w:start w:val="1"/>
@@ -30134,6 +30702,7 @@
         </w:tabs>
         <w:ind w:start="1800" w:hanging="360"/>
       </w:pPr>
+      <w:rPr/>
     </w:lvl>
     <w:lvl w:ilvl="4">
       <w:start w:val="1"/>
@@ -30146,6 +30715,7 @@
         </w:tabs>
         <w:ind w:start="2160" w:hanging="360"/>
       </w:pPr>
+      <w:rPr/>
     </w:lvl>
     <w:lvl w:ilvl="5">
       <w:start w:val="1"/>
@@ -30158,6 +30728,7 @@
         </w:tabs>
         <w:ind w:start="2520" w:hanging="360"/>
       </w:pPr>
+      <w:rPr/>
     </w:lvl>
     <w:lvl w:ilvl="6">
       <w:start w:val="1"/>
@@ -30170,6 +30741,7 @@
         </w:tabs>
         <w:ind w:start="2880" w:hanging="360"/>
       </w:pPr>
+      <w:rPr/>
     </w:lvl>
     <w:lvl w:ilvl="7">
       <w:start w:val="1"/>
@@ -30182,6 +30754,7 @@
         </w:tabs>
         <w:ind w:start="3240" w:hanging="360"/>
       </w:pPr>
+      <w:rPr/>
     </w:lvl>
     <w:lvl w:ilvl="8">
       <w:start w:val="1"/>
@@ -30194,6 +30767,7 @@
         </w:tabs>
         <w:ind w:start="3600" w:hanging="360"/>
       </w:pPr>
+      <w:rPr/>
     </w:lvl>
   </w:abstractNum>
   <w:abstractNum w:abstractNumId="5">
@@ -30204,9 +30778,9 @@
       <w:lvlJc w:val="start"/>
       <w:pPr>
         <w:tabs>
-          <w:tab w:val="num" w:pos="720"/>
+          <w:tab w:val="num" w:pos="1080"/>
         </w:tabs>
-        <w:ind w:start="720" w:hanging="360"/>
+        <w:ind w:start="1080" w:hanging="360"/>
       </w:pPr>
       <w:rPr/>
     </w:lvl>
@@ -30221,6 +30795,7 @@
         </w:tabs>
         <w:ind w:start="1080" w:hanging="360"/>
       </w:pPr>
+      <w:rPr/>
     </w:lvl>
     <w:lvl w:ilvl="2">
       <w:start w:val="1"/>
@@ -30233,6 +30808,7 @@
         </w:tabs>
         <w:ind w:start="1440" w:hanging="360"/>
       </w:pPr>
+      <w:rPr/>
     </w:lvl>
     <w:lvl w:ilvl="3">
       <w:start w:val="1"/>
@@ -30245,6 +30821,7 @@
         </w:tabs>
         <w:ind w:start="1800" w:hanging="360"/>
       </w:pPr>
+      <w:rPr/>
     </w:lvl>
     <w:lvl w:ilvl="4">
       <w:start w:val="1"/>
@@ -30257,6 +30834,7 @@
         </w:tabs>
         <w:ind w:start="2160" w:hanging="360"/>
       </w:pPr>
+      <w:rPr/>
     </w:lvl>
     <w:lvl w:ilvl="5">
       <w:start w:val="1"/>
@@ -30269,6 +30847,7 @@
         </w:tabs>
         <w:ind w:start="2520" w:hanging="360"/>
       </w:pPr>
+      <w:rPr/>
     </w:lvl>
     <w:lvl w:ilvl="6">
       <w:start w:val="1"/>
@@ -30281,6 +30860,7 @@
         </w:tabs>
         <w:ind w:start="2880" w:hanging="360"/>
       </w:pPr>
+      <w:rPr/>
     </w:lvl>
     <w:lvl w:ilvl="7">
       <w:start w:val="1"/>
@@ -30293,6 +30873,7 @@
         </w:tabs>
         <w:ind w:start="3240" w:hanging="360"/>
       </w:pPr>
+      <w:rPr/>
     </w:lvl>
     <w:lvl w:ilvl="8">
       <w:start w:val="1"/>
@@ -30305,117 +30886,135 @@
         </w:tabs>
         <w:ind w:start="3600" w:hanging="360"/>
       </w:pPr>
+      <w:rPr/>
     </w:lvl>
   </w:abstractNum>
   <w:abstractNum w:abstractNumId="6">
     <w:lvl w:ilvl="0">
       <w:start w:val="1"/>
-      <w:numFmt w:val="decimal"/>
-      <w:lvlText w:val="%1."/>
+      <w:numFmt w:val="none"/>
+      <w:suff w:val="nothing"/>
+      <w:lvlText w:val=""/>
       <w:lvlJc w:val="start"/>
       <w:pPr>
         <w:tabs>
-          <w:tab w:val="num" w:pos="1080"/>
+          <w:tab w:val="num" w:pos="0"/>
         </w:tabs>
-        <w:ind w:start="1080" w:hanging="360"/>
+        <w:ind w:start="0" w:hanging="0"/>
       </w:pPr>
       <w:rPr/>
     </w:lvl>
     <w:lvl w:ilvl="1">
       <w:start w:val="1"/>
-      <w:numFmt w:val="decimal"/>
-      <w:lvlText w:val="%2."/>
+      <w:numFmt w:val="none"/>
+      <w:suff w:val="nothing"/>
+      <w:lvlText w:val=""/>
       <w:lvlJc w:val="start"/>
       <w:pPr>
         <w:tabs>
-          <w:tab w:val="num" w:pos="1080"/>
+          <w:tab w:val="num" w:pos="0"/>
         </w:tabs>
-        <w:ind w:start="1080" w:hanging="360"/>
-      </w:pPr>
+        <w:ind w:start="0" w:hanging="0"/>
+      </w:pPr>
+      <w:rPr/>
     </w:lvl>
     <w:lvl w:ilvl="2">
       <w:start w:val="1"/>
-      <w:numFmt w:val="decimal"/>
-      <w:lvlText w:val="%3."/>
+      <w:numFmt w:val="none"/>
+      <w:suff w:val="nothing"/>
+      <w:lvlText w:val=""/>
       <w:lvlJc w:val="start"/>
       <w:pPr>
         <w:tabs>
-          <w:tab w:val="num" w:pos="1440"/>
+          <w:tab w:val="num" w:pos="0"/>
         </w:tabs>
-        <w:ind w:start="1440" w:hanging="360"/>
-      </w:pPr>
+        <w:ind w:start="0" w:hanging="0"/>
+      </w:pPr>
+      <w:rPr/>
     </w:lvl>
     <w:lvl w:ilvl="3">
       <w:start w:val="1"/>
-      <w:numFmt w:val="decimal"/>
-      <w:lvlText w:val="%4."/>
+      <w:numFmt w:val="none"/>
+      <w:suff w:val="nothing"/>
+      <w:lvlText w:val=""/>
       <w:lvlJc w:val="start"/>
       <w:pPr>
         <w:tabs>
-          <w:tab w:val="num" w:pos="1800"/>
+          <w:tab w:val="num" w:pos="0"/>
         </w:tabs>
-        <w:ind w:start="1800" w:hanging="360"/>
-      </w:pPr>
+        <w:ind w:start="0" w:hanging="0"/>
+      </w:pPr>
+      <w:rPr/>
     </w:lvl>
     <w:lvl w:ilvl="4">
       <w:start w:val="1"/>
-      <w:numFmt w:val="decimal"/>
-      <w:lvlText w:val="%5."/>
+      <w:numFmt w:val="none"/>
+      <w:suff w:val="nothing"/>
+      <w:lvlText w:val=""/>
       <w:lvlJc w:val="start"/>
       <w:pPr>
         <w:tabs>
-          <w:tab w:val="num" w:pos="2160"/>
+          <w:tab w:val="num" w:pos="0"/>
         </w:tabs>
-        <w:ind w:start="2160" w:hanging="360"/>
-      </w:pPr>
+        <w:ind w:start="0" w:hanging="0"/>
+      </w:pPr>
+      <w:rPr/>
     </w:lvl>
     <w:lvl w:ilvl="5">
       <w:start w:val="1"/>
-      <w:numFmt w:val="decimal"/>
-      <w:lvlText w:val="%6."/>
+      <w:numFmt w:val="none"/>
+      <w:suff w:val="nothing"/>
+      <w:lvlText w:val=""/>
       <w:lvlJc w:val="start"/>
       <w:pPr>
         <w:tabs>
-          <w:tab w:val="num" w:pos="2520"/>
+          <w:tab w:val="num" w:pos="0"/>
         </w:tabs>
-        <w:ind w:start="2520" w:hanging="360"/>
-      </w:pPr>
+        <w:ind w:start="0" w:hanging="0"/>
+      </w:pPr>
+      <w:rPr/>
     </w:lvl>
     <w:lvl w:ilvl="6">
       <w:start w:val="1"/>
-      <w:numFmt w:val="decimal"/>
-      <w:lvlText w:val="%7."/>
+      <w:numFmt w:val="none"/>
+      <w:suff w:val="nothing"/>
+      <w:lvlText w:val=""/>
       <w:lvlJc w:val="start"/>
       <w:pPr>
         <w:tabs>
-          <w:tab w:val="num" w:pos="2880"/>
+          <w:tab w:val="num" w:pos="0"/>
         </w:tabs>
-        <w:ind w:start="2880" w:hanging="360"/>
-      </w:pPr>
+        <w:ind w:start="0" w:hanging="0"/>
+      </w:pPr>
+      <w:rPr/>
     </w:lvl>
     <w:lvl w:ilvl="7">
       <w:start w:val="1"/>
-      <w:numFmt w:val="decimal"/>
-      <w:lvlText w:val="%8."/>
+      <w:numFmt w:val="none"/>
+      <w:suff w:val="nothing"/>
+      <w:lvlText w:val=""/>
       <w:lvlJc w:val="start"/>
       <w:pPr>
         <w:tabs>
-          <w:tab w:val="num" w:pos="3240"/>
+          <w:tab w:val="num" w:pos="0"/>
         </w:tabs>
-        <w:ind w:start="3240" w:hanging="360"/>
-      </w:pPr>
+        <w:ind w:start="0" w:hanging="0"/>
+      </w:pPr>
+      <w:rPr/>
     </w:lvl>
     <w:lvl w:ilvl="8">
       <w:start w:val="1"/>
-      <w:numFmt w:val="decimal"/>
-      <w:lvlText w:val="%9."/>
+      <w:numFmt w:val="none"/>
+      <w:suff w:val="nothing"/>
+      <w:lvlText w:val=""/>
       <w:lvlJc w:val="start"/>
       <w:pPr>
         <w:tabs>
-          <w:tab w:val="num" w:pos="3600"/>
+          <w:tab w:val="num" w:pos="0"/>
         </w:tabs>
-        <w:ind w:start="3600" w:hanging="360"/>
-      </w:pPr>
+        <w:ind w:start="0" w:hanging="0"/>
+      </w:pPr>
+      <w:rPr/>
     </w:lvl>
   </w:abstractNum>
   <w:abstractNum w:abstractNumId="7">
@@ -30566,7 +31165,7 @@
   <w:docDefaults>
     <w:rPrDefault>
       <w:rPr>
-        <w:rFonts w:ascii="Calibri" w:hAnsi="Calibri" w:eastAsia="ＭＳ 明朝" w:cs="" w:cstheme="minorBidi" w:eastAsiaTheme="minorEastAsia"/>
+        <w:rFonts w:ascii="Calibri" w:hAnsi="Calibri" w:eastAsia="" w:cs="" w:cstheme="minorBidi" w:eastAsiaTheme="minorEastAsia"/>
         <w:sz w:val="22"/>
         <w:szCs w:val="22"/>
         <w:lang w:val="en-US" w:eastAsia="en-US" w:bidi="ar-SA"/>
@@ -30723,12 +31322,13 @@
     <w:rsid w:val="00fc693f"/>
     <w:pPr>
       <w:widowControl/>
+      <w:suppressAutoHyphens w:val="true"/>
       <w:bidi w:val="0"/>
       <w:spacing w:lineRule="auto" w:line="360" w:before="0" w:after="0"/>
       <w:jc w:val="start"/>
     </w:pPr>
     <w:rPr>
-      <w:rFonts w:ascii="Times New Roman" w:hAnsi="Times New Roman" w:eastAsia="ＭＳ 明朝" w:cs="" w:cstheme="minorBidi" w:eastAsiaTheme="minorEastAsia"/>
+      <w:rFonts w:ascii="Times New Roman" w:hAnsi="Times New Roman" w:eastAsia="" w:cs="" w:cstheme="minorBidi" w:eastAsiaTheme="minorEastAsia"/>
       <w:color w:val="auto"/>
       <w:kern w:val="0"/>
       <w:sz w:val="24"/>
@@ -30751,7 +31351,7 @@
       <w:outlineLvl w:val="0"/>
     </w:pPr>
     <w:rPr>
-      <w:rFonts w:ascii="Calibri" w:hAnsi="Calibri" w:eastAsia="ＭＳ ゴシック" w:cs="" w:asciiTheme="majorHAnsi" w:cstheme="majorBidi" w:eastAsiaTheme="majorEastAsia" w:hAnsiTheme="majorHAnsi"/>
+      <w:rFonts w:ascii="Calibri" w:hAnsi="Calibri" w:eastAsia="" w:cs="" w:asciiTheme="majorHAnsi" w:cstheme="majorBidi" w:eastAsiaTheme="majorEastAsia" w:hAnsiTheme="majorHAnsi"/>
       <w:b/>
       <w:bCs/>
       <w:color w:themeColor="accent1" w:themeShade="bf" w:val="365F91"/>
@@ -30775,7 +31375,7 @@
       <w:outlineLvl w:val="1"/>
     </w:pPr>
     <w:rPr>
-      <w:rFonts w:ascii="Calibri" w:hAnsi="Calibri" w:eastAsia="ＭＳ ゴシック" w:cs="" w:asciiTheme="majorHAnsi" w:cstheme="majorBidi" w:eastAsiaTheme="majorEastAsia" w:hAnsiTheme="majorHAnsi"/>
+      <w:rFonts w:ascii="Calibri" w:hAnsi="Calibri" w:eastAsia="" w:cs="" w:asciiTheme="majorHAnsi" w:cstheme="majorBidi" w:eastAsiaTheme="majorEastAsia" w:hAnsiTheme="majorHAnsi"/>
       <w:b/>
       <w:bCs/>
       <w:color w:themeColor="accent1" w:val="4F81BD"/>
@@ -30799,7 +31399,7 @@
       <w:outlineLvl w:val="2"/>
     </w:pPr>
     <w:rPr>
-      <w:rFonts w:ascii="Calibri" w:hAnsi="Calibri" w:eastAsia="ＭＳ ゴシック" w:cs="" w:asciiTheme="majorHAnsi" w:cstheme="majorBidi" w:eastAsiaTheme="majorEastAsia" w:hAnsiTheme="majorHAnsi"/>
+      <w:rFonts w:ascii="Calibri" w:hAnsi="Calibri" w:eastAsia="" w:cs="" w:asciiTheme="majorHAnsi" w:cstheme="majorBidi" w:eastAsiaTheme="majorEastAsia" w:hAnsiTheme="majorHAnsi"/>
       <w:b/>
       <w:bCs/>
       <w:color w:themeColor="accent1" w:val="4F81BD"/>
@@ -30822,7 +31422,7 @@
       <w:outlineLvl w:val="3"/>
     </w:pPr>
     <w:rPr>
-      <w:rFonts w:ascii="Calibri" w:hAnsi="Calibri" w:eastAsia="ＭＳ ゴシック" w:cs="" w:asciiTheme="majorHAnsi" w:cstheme="majorBidi" w:eastAsiaTheme="majorEastAsia" w:hAnsiTheme="majorHAnsi"/>
+      <w:rFonts w:ascii="Calibri" w:hAnsi="Calibri" w:eastAsia="" w:cs="" w:asciiTheme="majorHAnsi" w:cstheme="majorBidi" w:eastAsiaTheme="majorEastAsia" w:hAnsiTheme="majorHAnsi"/>
       <w:b/>
       <w:bCs/>
       <w:i/>
@@ -30847,7 +31447,7 @@
       <w:outlineLvl w:val="4"/>
     </w:pPr>
     <w:rPr>
-      <w:rFonts w:ascii="Calibri" w:hAnsi="Calibri" w:eastAsia="ＭＳ ゴシック" w:cs="" w:asciiTheme="majorHAnsi" w:cstheme="majorBidi" w:eastAsiaTheme="majorEastAsia" w:hAnsiTheme="majorHAnsi"/>
+      <w:rFonts w:ascii="Calibri" w:hAnsi="Calibri" w:eastAsia="" w:cs="" w:asciiTheme="majorHAnsi" w:cstheme="majorBidi" w:eastAsiaTheme="majorEastAsia" w:hAnsiTheme="majorHAnsi"/>
       <w:color w:themeColor="accent1" w:themeShade="7f" w:val="243F60"/>
     </w:rPr>
   </w:style>
@@ -30868,7 +31468,7 @@
       <w:outlineLvl w:val="5"/>
     </w:pPr>
     <w:rPr>
-      <w:rFonts w:ascii="Calibri" w:hAnsi="Calibri" w:eastAsia="ＭＳ ゴシック" w:cs="" w:asciiTheme="majorHAnsi" w:cstheme="majorBidi" w:eastAsiaTheme="majorEastAsia" w:hAnsiTheme="majorHAnsi"/>
+      <w:rFonts w:ascii="Calibri" w:hAnsi="Calibri" w:eastAsia="" w:cs="" w:asciiTheme="majorHAnsi" w:cstheme="majorBidi" w:eastAsiaTheme="majorEastAsia" w:hAnsiTheme="majorHAnsi"/>
       <w:i/>
       <w:iCs/>
       <w:color w:themeColor="accent1" w:themeShade="7f" w:val="243F60"/>
@@ -30891,7 +31491,7 @@
       <w:outlineLvl w:val="6"/>
     </w:pPr>
     <w:rPr>
-      <w:rFonts w:ascii="Calibri" w:hAnsi="Calibri" w:eastAsia="ＭＳ ゴシック" w:cs="" w:asciiTheme="majorHAnsi" w:cstheme="majorBidi" w:eastAsiaTheme="majorEastAsia" w:hAnsiTheme="majorHAnsi"/>
+      <w:rFonts w:ascii="Calibri" w:hAnsi="Calibri" w:eastAsia="" w:cs="" w:asciiTheme="majorHAnsi" w:cstheme="majorBidi" w:eastAsiaTheme="majorEastAsia" w:hAnsiTheme="majorHAnsi"/>
       <w:i/>
       <w:iCs/>
       <w:color w:themeColor="text1" w:themeTint="bf" w:val="404040"/>
@@ -30914,7 +31514,7 @@
       <w:outlineLvl w:val="7"/>
     </w:pPr>
     <w:rPr>
-      <w:rFonts w:ascii="Calibri" w:hAnsi="Calibri" w:eastAsia="ＭＳ ゴシック" w:cs="" w:asciiTheme="majorHAnsi" w:cstheme="majorBidi" w:eastAsiaTheme="majorEastAsia" w:hAnsiTheme="majorHAnsi"/>
+      <w:rFonts w:ascii="Calibri" w:hAnsi="Calibri" w:eastAsia="" w:cs="" w:asciiTheme="majorHAnsi" w:cstheme="majorBidi" w:eastAsiaTheme="majorEastAsia" w:hAnsiTheme="majorHAnsi"/>
       <w:color w:themeColor="accent1" w:val="4F81BD"/>
       <w:sz w:val="20"/>
       <w:szCs w:val="20"/>
@@ -30937,7 +31537,7 @@
       <w:outlineLvl w:val="8"/>
     </w:pPr>
     <w:rPr>
-      <w:rFonts w:ascii="Calibri" w:hAnsi="Calibri" w:eastAsia="ＭＳ ゴシック" w:cs="" w:asciiTheme="majorHAnsi" w:cstheme="majorBidi" w:eastAsiaTheme="majorEastAsia" w:hAnsiTheme="majorHAnsi"/>
+      <w:rFonts w:ascii="Calibri" w:hAnsi="Calibri" w:eastAsia="" w:cs="" w:asciiTheme="majorHAnsi" w:cstheme="majorBidi" w:eastAsiaTheme="majorEastAsia" w:hAnsiTheme="majorHAnsi"/>
       <w:i/>
       <w:iCs/>
       <w:color w:themeColor="text1" w:themeTint="bf" w:val="404040"/>
@@ -30979,7 +31579,7 @@
     <w:qFormat/>
     <w:rsid w:val="00fc693f"/>
     <w:rPr>
-      <w:rFonts w:ascii="Calibri" w:hAnsi="Calibri" w:eastAsia="ＭＳ ゴシック" w:cs="" w:asciiTheme="majorHAnsi" w:cstheme="majorBidi" w:eastAsiaTheme="majorEastAsia" w:hAnsiTheme="majorHAnsi"/>
+      <w:rFonts w:ascii="Calibri" w:hAnsi="Calibri" w:eastAsia="" w:cs="" w:asciiTheme="majorHAnsi" w:cstheme="majorBidi" w:eastAsiaTheme="majorEastAsia" w:hAnsiTheme="majorHAnsi"/>
       <w:b/>
       <w:bCs/>
       <w:color w:themeColor="accent1" w:themeShade="bf" w:val="365F91"/>
@@ -30995,7 +31595,7 @@
     <w:qFormat/>
     <w:rsid w:val="00fc693f"/>
     <w:rPr>
-      <w:rFonts w:ascii="Calibri" w:hAnsi="Calibri" w:eastAsia="ＭＳ ゴシック" w:cs="" w:asciiTheme="majorHAnsi" w:cstheme="majorBidi" w:eastAsiaTheme="majorEastAsia" w:hAnsiTheme="majorHAnsi"/>
+      <w:rFonts w:ascii="Calibri" w:hAnsi="Calibri" w:eastAsia="" w:cs="" w:asciiTheme="majorHAnsi" w:cstheme="majorBidi" w:eastAsiaTheme="majorEastAsia" w:hAnsiTheme="majorHAnsi"/>
       <w:b/>
       <w:bCs/>
       <w:color w:themeColor="accent1" w:val="4F81BD"/>
@@ -31011,7 +31611,7 @@
     <w:qFormat/>
     <w:rsid w:val="00fc693f"/>
     <w:rPr>
-      <w:rFonts w:ascii="Calibri" w:hAnsi="Calibri" w:eastAsia="ＭＳ ゴシック" w:cs="" w:asciiTheme="majorHAnsi" w:cstheme="majorBidi" w:eastAsiaTheme="majorEastAsia" w:hAnsiTheme="majorHAnsi"/>
+      <w:rFonts w:ascii="Calibri" w:hAnsi="Calibri" w:eastAsia="" w:cs="" w:asciiTheme="majorHAnsi" w:cstheme="majorBidi" w:eastAsiaTheme="majorEastAsia" w:hAnsiTheme="majorHAnsi"/>
       <w:b/>
       <w:bCs/>
       <w:color w:themeColor="accent1" w:val="4F81BD"/>
@@ -31025,7 +31625,7 @@
     <w:qFormat/>
     <w:rsid w:val="00fc693f"/>
     <w:rPr>
-      <w:rFonts w:ascii="Calibri" w:hAnsi="Calibri" w:eastAsia="ＭＳ ゴシック" w:cs="" w:asciiTheme="majorHAnsi" w:cstheme="majorBidi" w:eastAsiaTheme="majorEastAsia" w:hAnsiTheme="majorHAnsi"/>
+      <w:rFonts w:ascii="Calibri" w:hAnsi="Calibri" w:eastAsia="" w:cs="" w:asciiTheme="majorHAnsi" w:cstheme="majorBidi" w:eastAsiaTheme="majorEastAsia" w:hAnsiTheme="majorHAnsi"/>
       <w:color w:themeColor="text2" w:themeShade="bf" w:val="17365D"/>
       <w:spacing w:val="5"/>
       <w:kern w:val="2"/>
@@ -31041,7 +31641,7 @@
     <w:qFormat/>
     <w:rsid w:val="00fc693f"/>
     <w:rPr>
-      <w:rFonts w:ascii="Calibri" w:hAnsi="Calibri" w:eastAsia="ＭＳ ゴシック" w:cs="" w:asciiTheme="majorHAnsi" w:cstheme="majorBidi" w:eastAsiaTheme="majorEastAsia" w:hAnsiTheme="majorHAnsi"/>
+      <w:rFonts w:ascii="Calibri" w:hAnsi="Calibri" w:eastAsia="" w:cs="" w:asciiTheme="majorHAnsi" w:cstheme="majorBidi" w:eastAsiaTheme="majorEastAsia" w:hAnsiTheme="majorHAnsi"/>
       <w:i/>
       <w:iCs/>
       <w:color w:themeColor="accent1" w:val="4F81BD"/>
@@ -31114,7 +31714,7 @@
     <w:qFormat/>
     <w:rsid w:val="00fc693f"/>
     <w:rPr>
-      <w:rFonts w:ascii="Calibri" w:hAnsi="Calibri" w:eastAsia="ＭＳ ゴシック" w:cs="" w:asciiTheme="majorHAnsi" w:cstheme="majorBidi" w:eastAsiaTheme="majorEastAsia" w:hAnsiTheme="majorHAnsi"/>
+      <w:rFonts w:ascii="Calibri" w:hAnsi="Calibri" w:eastAsia="" w:cs="" w:asciiTheme="majorHAnsi" w:cstheme="majorBidi" w:eastAsiaTheme="majorEastAsia" w:hAnsiTheme="majorHAnsi"/>
       <w:b/>
       <w:bCs/>
       <w:i/>
@@ -31131,7 +31731,7 @@
     <w:qFormat/>
     <w:rsid w:val="00fc693f"/>
     <w:rPr>
-      <w:rFonts w:ascii="Calibri" w:hAnsi="Calibri" w:eastAsia="ＭＳ ゴシック" w:cs="" w:asciiTheme="majorHAnsi" w:cstheme="majorBidi" w:eastAsiaTheme="majorEastAsia" w:hAnsiTheme="majorHAnsi"/>
+      <w:rFonts w:ascii="Calibri" w:hAnsi="Calibri" w:eastAsia="" w:cs="" w:asciiTheme="majorHAnsi" w:cstheme="majorBidi" w:eastAsiaTheme="majorEastAsia" w:hAnsiTheme="majorHAnsi"/>
       <w:color w:themeColor="accent1" w:themeShade="7f" w:val="243F60"/>
     </w:rPr>
   </w:style>
@@ -31144,7 +31744,7 @@
     <w:qFormat/>
     <w:rsid w:val="00fc693f"/>
     <w:rPr>
-      <w:rFonts w:ascii="Calibri" w:hAnsi="Calibri" w:eastAsia="ＭＳ ゴシック" w:cs="" w:asciiTheme="majorHAnsi" w:cstheme="majorBidi" w:eastAsiaTheme="majorEastAsia" w:hAnsiTheme="majorHAnsi"/>
+      <w:rFonts w:ascii="Calibri" w:hAnsi="Calibri" w:eastAsia="" w:cs="" w:asciiTheme="majorHAnsi" w:cstheme="majorBidi" w:eastAsiaTheme="majorEastAsia" w:hAnsiTheme="majorHAnsi"/>
       <w:i/>
       <w:iCs/>
       <w:color w:themeColor="accent1" w:themeShade="7f" w:val="243F60"/>
@@ -31159,7 +31759,7 @@
     <w:qFormat/>
     <w:rsid w:val="00fc693f"/>
     <w:rPr>
-      <w:rFonts w:ascii="Calibri" w:hAnsi="Calibri" w:eastAsia="ＭＳ ゴシック" w:cs="" w:asciiTheme="majorHAnsi" w:cstheme="majorBidi" w:eastAsiaTheme="majorEastAsia" w:hAnsiTheme="majorHAnsi"/>
+      <w:rFonts w:ascii="Calibri" w:hAnsi="Calibri" w:eastAsia="" w:cs="" w:asciiTheme="majorHAnsi" w:cstheme="majorBidi" w:eastAsiaTheme="majorEastAsia" w:hAnsiTheme="majorHAnsi"/>
       <w:i/>
       <w:iCs/>
       <w:color w:themeColor="text1" w:themeTint="bf" w:val="404040"/>
@@ -31174,7 +31774,7 @@
     <w:qFormat/>
     <w:rsid w:val="00fc693f"/>
     <w:rPr>
-      <w:rFonts w:ascii="Calibri" w:hAnsi="Calibri" w:eastAsia="ＭＳ ゴシック" w:cs="" w:asciiTheme="majorHAnsi" w:cstheme="majorBidi" w:eastAsiaTheme="majorEastAsia" w:hAnsiTheme="majorHAnsi"/>
+      <w:rFonts w:ascii="Calibri" w:hAnsi="Calibri" w:eastAsia="" w:cs="" w:asciiTheme="majorHAnsi" w:cstheme="majorBidi" w:eastAsiaTheme="majorEastAsia" w:hAnsiTheme="majorHAnsi"/>
       <w:color w:themeColor="accent1" w:val="4F81BD"/>
       <w:sz w:val="20"/>
       <w:szCs w:val="20"/>
@@ -31189,7 +31789,7 @@
     <w:qFormat/>
     <w:rsid w:val="00fc693f"/>
     <w:rPr>
-      <w:rFonts w:ascii="Calibri" w:hAnsi="Calibri" w:eastAsia="ＭＳ ゴシック" w:cs="" w:asciiTheme="majorHAnsi" w:cstheme="majorBidi" w:eastAsiaTheme="majorEastAsia" w:hAnsiTheme="majorHAnsi"/>
+      <w:rFonts w:ascii="Calibri" w:hAnsi="Calibri" w:eastAsia="" w:cs="" w:asciiTheme="majorHAnsi" w:cstheme="majorBidi" w:eastAsiaTheme="majorEastAsia" w:hAnsiTheme="majorHAnsi"/>
       <w:i/>
       <w:iCs/>
       <w:color w:themeColor="text1" w:themeTint="bf" w:val="404040"/>
@@ -31419,12 +32019,13 @@
     <w:rsid w:val="00fc693f"/>
     <w:pPr>
       <w:widowControl/>
+      <w:suppressAutoHyphens w:val="true"/>
       <w:bidi w:val="0"/>
       <w:spacing w:lineRule="auto" w:line="240" w:before="0" w:after="0"/>
       <w:jc w:val="start"/>
     </w:pPr>
     <w:rPr>
-      <w:rFonts w:ascii="Calibri" w:hAnsi="Calibri" w:eastAsia="ＭＳ 明朝" w:cs="" w:cstheme="minorBidi" w:eastAsiaTheme="minorEastAsia"/>
+      <w:rFonts w:ascii="Cambria" w:hAnsi="Cambria" w:eastAsia="" w:cs="" w:asciiTheme="minorHAnsi" w:cstheme="minorBidi" w:eastAsiaTheme="minorEastAsia" w:hAnsiTheme="minorHAnsi"/>
       <w:color w:val="auto"/>
       <w:kern w:val="0"/>
       <w:sz w:val="22"/>
@@ -31448,7 +32049,7 @@
       <w:contextualSpacing/>
     </w:pPr>
     <w:rPr>
-      <w:rFonts w:ascii="Calibri" w:hAnsi="Calibri" w:eastAsia="ＭＳ ゴシック" w:cs="" w:asciiTheme="majorHAnsi" w:cstheme="majorBidi" w:eastAsiaTheme="majorEastAsia" w:hAnsiTheme="majorHAnsi"/>
+      <w:rFonts w:ascii="Calibri" w:hAnsi="Calibri" w:eastAsia="" w:cs="" w:asciiTheme="majorHAnsi" w:cstheme="majorBidi" w:eastAsiaTheme="majorEastAsia" w:hAnsiTheme="majorHAnsi"/>
       <w:color w:themeColor="text2" w:themeShade="bf" w:val="17365D"/>
       <w:spacing w:val="5"/>
       <w:kern w:val="2"/>
@@ -31466,7 +32067,7 @@
     <w:rsid w:val="00fc693f"/>
     <w:pPr/>
     <w:rPr>
-      <w:rFonts w:ascii="Calibri" w:hAnsi="Calibri" w:eastAsia="ＭＳ ゴシック" w:cs="" w:asciiTheme="majorHAnsi" w:cstheme="majorBidi" w:eastAsiaTheme="majorEastAsia" w:hAnsiTheme="majorHAnsi"/>
+      <w:rFonts w:ascii="Calibri" w:hAnsi="Calibri" w:eastAsia="" w:cs="" w:asciiTheme="majorHAnsi" w:cstheme="majorBidi" w:eastAsiaTheme="majorEastAsia" w:hAnsiTheme="majorHAnsi"/>
       <w:i/>
       <w:iCs/>
       <w:color w:themeColor="accent1" w:val="4F81BD"/>
@@ -31699,12 +32300,13 @@
         <w:tab w:val="left" w:pos="3456" w:leader="none"/>
         <w:tab w:val="left" w:pos="4032" w:leader="none"/>
       </w:tabs>
+      <w:suppressAutoHyphens w:val="true"/>
       <w:bidi w:val="0"/>
       <w:spacing w:lineRule="auto" w:line="276" w:before="0" w:after="200"/>
       <w:jc w:val="start"/>
     </w:pPr>
     <w:rPr>
-      <w:rFonts w:ascii="Courier" w:hAnsi="Courier" w:eastAsia="ＭＳ 明朝" w:cs="" w:cstheme="minorBidi" w:eastAsiaTheme="minorEastAsia"/>
+      <w:rFonts w:ascii="Courier" w:hAnsi="Courier" w:eastAsia="" w:cs="" w:cstheme="minorBidi" w:eastAsiaTheme="minorEastAsia"/>
       <w:color w:val="auto"/>
       <w:kern w:val="0"/>
       <w:sz w:val="20"/>

</xml_diff>